<commit_message>
Applying real pulse and rf params to simulation
</commit_message>
<xml_diff>
--- a/Thesis Overview.docx
+++ b/Thesis Overview.docx
@@ -89,7 +89,21 @@
         <w:rPr>
           <w:lang w:val="en-US"/>
         </w:rPr>
-        <w:t xml:space="preserve"> at o/p (side lobes in freq), back into Rx, </w:t>
+        <w:t xml:space="preserve"> at o/p (side lobes in </w:t>
+      </w:r>
+      <w:proofErr w:type="spellStart"/>
+      <w:r>
+        <w:rPr>
+          <w:lang w:val="en-US"/>
+        </w:rPr>
+        <w:t>freq</w:t>
+      </w:r>
+      <w:proofErr w:type="spellEnd"/>
+      <w:r>
+        <w:rPr>
+          <w:lang w:val="en-US"/>
+        </w:rPr>
+        <w:t xml:space="preserve">), back into Rx, </w:t>
       </w:r>
       <w:r>
         <w:rPr>
@@ -355,7 +369,21 @@
         <w:rPr>
           <w:lang w:val="en-US"/>
         </w:rPr>
-        <w:t>Open loop – i/p changes depending on what we measure at o/p</w:t>
+        <w:t xml:space="preserve">Open loop – </w:t>
+      </w:r>
+      <w:proofErr w:type="spellStart"/>
+      <w:r>
+        <w:rPr>
+          <w:lang w:val="en-US"/>
+        </w:rPr>
+        <w:t>i</w:t>
+      </w:r>
+      <w:proofErr w:type="spellEnd"/>
+      <w:r>
+        <w:rPr>
+          <w:lang w:val="en-US"/>
+        </w:rPr>
+        <w:t>/p changes depending on what we measure at o/p</w:t>
       </w:r>
     </w:p>
     <w:p>
@@ -461,8 +489,16 @@
         <w:rPr>
           <w:lang w:val="en-US"/>
         </w:rPr>
-        <w:t>Settings.xml parametres</w:t>
-      </w:r>
+        <w:t xml:space="preserve">Settings.xml </w:t>
+      </w:r>
+      <w:proofErr w:type="spellStart"/>
+      <w:r>
+        <w:rPr>
+          <w:lang w:val="en-US"/>
+        </w:rPr>
+        <w:t>parametres</w:t>
+      </w:r>
+      <w:proofErr w:type="spellEnd"/>
       <w:r>
         <w:rPr>
           <w:lang w:val="en-US"/>
@@ -489,7 +525,21 @@
         <w:rPr>
           <w:lang w:val="en-US"/>
         </w:rPr>
-        <w:t>Available models for predistortion. Simple ones first – AM,AM conversion</w:t>
+        <w:t xml:space="preserve">Available models for predistortion. Simple ones first – </w:t>
+      </w:r>
+      <w:proofErr w:type="gramStart"/>
+      <w:r>
+        <w:rPr>
+          <w:lang w:val="en-US"/>
+        </w:rPr>
+        <w:t>AM,AM</w:t>
+      </w:r>
+      <w:proofErr w:type="gramEnd"/>
+      <w:r>
+        <w:rPr>
+          <w:lang w:val="en-US"/>
+        </w:rPr>
+        <w:t xml:space="preserve"> conversion</w:t>
       </w:r>
     </w:p>
     <w:p>
@@ -672,35 +722,49 @@
         <w:rPr>
           <w:lang w:val="en-US"/>
         </w:rPr>
-        <w:t>Plotting in dBW or dBm, dB for comparisons</w:t>
-      </w:r>
-    </w:p>
-    <w:p>
-      <w:pPr>
-        <w:pStyle w:val="ListParagraph"/>
-        <w:rPr>
-          <w:lang w:val="en-US"/>
-        </w:rPr>
-      </w:pPr>
-      <w:r>
-        <w:rPr>
-          <w:lang w:val="en-US"/>
-        </w:rPr>
-        <w:t>Compare settings.xml for S and X Band – parse as yaml file</w:t>
-      </w:r>
-    </w:p>
-    <w:p>
-      <w:pPr>
-        <w:pStyle w:val="ListParagraph"/>
-        <w:rPr>
-          <w:lang w:val="en-US"/>
-        </w:rPr>
-      </w:pPr>
-      <w:r>
-        <w:rPr>
-          <w:lang w:val="en-US"/>
-        </w:rPr>
-        <w:t>6 pulses – S1, RACON, M1, M2, L1, L2 (M, L are pulse compressed – cannot occupy too much bandwidth) – 3 LOS for each (S,M,L)</w:t>
+        <w:t xml:space="preserve">Compare settings.xml for S and X Band – parse as </w:t>
+      </w:r>
+      <w:proofErr w:type="spellStart"/>
+      <w:r>
+        <w:rPr>
+          <w:lang w:val="en-US"/>
+        </w:rPr>
+        <w:t>yaml</w:t>
+      </w:r>
+      <w:proofErr w:type="spellEnd"/>
+      <w:r>
+        <w:rPr>
+          <w:lang w:val="en-US"/>
+        </w:rPr>
+        <w:t xml:space="preserve"> file</w:t>
+      </w:r>
+    </w:p>
+    <w:p>
+      <w:pPr>
+        <w:pStyle w:val="ListParagraph"/>
+        <w:rPr>
+          <w:lang w:val="en-US"/>
+        </w:rPr>
+      </w:pPr>
+      <w:r>
+        <w:rPr>
+          <w:lang w:val="en-US"/>
+        </w:rPr>
+        <w:t>6 pulses – S1, RACON, M1, M2, L1, L2 (M, L are pulse compressed – cannot occupy too much bandwidth) – 3 LOS for each (</w:t>
+      </w:r>
+      <w:proofErr w:type="gramStart"/>
+      <w:r>
+        <w:rPr>
+          <w:lang w:val="en-US"/>
+        </w:rPr>
+        <w:t>S,M</w:t>
+      </w:r>
+      <w:proofErr w:type="gramEnd"/>
+      <w:r>
+        <w:rPr>
+          <w:lang w:val="en-US"/>
+        </w:rPr>
+        <w:t>,L)</w:t>
       </w:r>
     </w:p>
     <w:p>
@@ -756,7 +820,21 @@
         <w:rPr>
           <w:lang w:val="en-US"/>
         </w:rPr>
-        <w:t>Look at other filters (and components) in FEC Commissioning Doc and see if you need to incorporate them too (e.g. harmonic filter, IF complex filter etc)</w:t>
+        <w:t xml:space="preserve">Look at other filters (and components) in FEC Commissioning Doc and see if you need to incorporate them too (e.g. harmonic filter, IF complex filter </w:t>
+      </w:r>
+      <w:proofErr w:type="spellStart"/>
+      <w:r>
+        <w:rPr>
+          <w:lang w:val="en-US"/>
+        </w:rPr>
+        <w:t>etc</w:t>
+      </w:r>
+      <w:proofErr w:type="spellEnd"/>
+      <w:r>
+        <w:rPr>
+          <w:lang w:val="en-US"/>
+        </w:rPr>
+        <w:t>)</w:t>
       </w:r>
     </w:p>
     <w:p>

</xml_diff>

<commit_message>
Removed start time setting of pulses as irrelevant
</commit_message>
<xml_diff>
--- a/Thesis Overview.docx
+++ b/Thesis Overview.docx
@@ -836,6 +836,240 @@
         </w:rPr>
         <w:t>)</w:t>
       </w:r>
+    </w:p>
+    <w:p>
+      <w:pPr>
+        <w:pStyle w:val="ListParagraph"/>
+        <w:rPr>
+          <w:lang w:val="en-US"/>
+        </w:rPr>
+      </w:pPr>
+    </w:p>
+    <w:p>
+      <w:pPr>
+        <w:pStyle w:val="ListParagraph"/>
+        <w:rPr>
+          <w:u w:val="single"/>
+          <w:lang w:val="en-US"/>
+        </w:rPr>
+      </w:pPr>
+      <w:r>
+        <w:rPr>
+          <w:u w:val="single"/>
+          <w:lang w:val="en-US"/>
+        </w:rPr>
+        <w:t>22 April 2026</w:t>
+      </w:r>
+    </w:p>
+    <w:p>
+      <w:pPr>
+        <w:pStyle w:val="ListParagraph"/>
+        <w:rPr>
+          <w:lang w:val="en-US"/>
+        </w:rPr>
+      </w:pPr>
+      <w:r>
+        <w:rPr>
+          <w:lang w:val="en-US"/>
+        </w:rPr>
+        <w:t>Stick to standard operating mode – choose a range where we have a short medium and long pulse. Can stick to one RF channel (e.g. CH0)</w:t>
+      </w:r>
+    </w:p>
+    <w:p>
+      <w:pPr>
+        <w:pStyle w:val="ListParagraph"/>
+        <w:rPr>
+          <w:lang w:val="en-US"/>
+        </w:rPr>
+      </w:pPr>
+    </w:p>
+    <w:p>
+      <w:pPr>
+        <w:pStyle w:val="ListParagraph"/>
+        <w:rPr>
+          <w:lang w:val="en-US"/>
+        </w:rPr>
+      </w:pPr>
+      <w:r>
+        <w:rPr>
+          <w:lang w:val="en-US"/>
+        </w:rPr>
+        <w:t xml:space="preserve">Sampling frequency Rx – 77.76MHz, Tx – 2x Rx, though in the Rx chain, the sampling </w:t>
+      </w:r>
+      <w:proofErr w:type="spellStart"/>
+      <w:r>
+        <w:rPr>
+          <w:lang w:val="en-US"/>
+        </w:rPr>
+        <w:t>freq</w:t>
+      </w:r>
+      <w:proofErr w:type="spellEnd"/>
+      <w:r>
+        <w:rPr>
+          <w:lang w:val="en-US"/>
+        </w:rPr>
+        <w:t xml:space="preserve"> gets lowered at different points as downmixing yields a lower </w:t>
+      </w:r>
+      <w:proofErr w:type="spellStart"/>
+      <w:r>
+        <w:rPr>
+          <w:lang w:val="en-US"/>
+        </w:rPr>
+        <w:t>freq</w:t>
+      </w:r>
+      <w:proofErr w:type="spellEnd"/>
+      <w:r>
+        <w:rPr>
+          <w:lang w:val="en-US"/>
+        </w:rPr>
+        <w:t xml:space="preserve"> bandwidth. Also issue on how to label the RF </w:t>
+      </w:r>
+      <w:proofErr w:type="spellStart"/>
+      <w:r>
+        <w:rPr>
+          <w:lang w:val="en-US"/>
+        </w:rPr>
+        <w:t>freq</w:t>
+      </w:r>
+      <w:proofErr w:type="spellEnd"/>
+      <w:r>
+        <w:rPr>
+          <w:lang w:val="en-US"/>
+        </w:rPr>
+        <w:t xml:space="preserve"> axis if sampling </w:t>
+      </w:r>
+      <w:proofErr w:type="spellStart"/>
+      <w:r>
+        <w:rPr>
+          <w:lang w:val="en-US"/>
+        </w:rPr>
+        <w:t>freq</w:t>
+      </w:r>
+      <w:proofErr w:type="spellEnd"/>
+      <w:r>
+        <w:rPr>
+          <w:lang w:val="en-US"/>
+        </w:rPr>
+        <w:t xml:space="preserve"> is too low. (Thomas will think about it)</w:t>
+      </w:r>
+    </w:p>
+    <w:p>
+      <w:pPr>
+        <w:pStyle w:val="ListParagraph"/>
+        <w:rPr>
+          <w:lang w:val="en-US"/>
+        </w:rPr>
+      </w:pPr>
+    </w:p>
+    <w:p>
+      <w:pPr>
+        <w:pStyle w:val="ListParagraph"/>
+        <w:rPr>
+          <w:lang w:val="en-US"/>
+        </w:rPr>
+      </w:pPr>
+      <w:r>
+        <w:rPr>
+          <w:lang w:val="en-US"/>
+        </w:rPr>
+        <w:t>S1 looks weird after IF mixing because not enough points. Need zero padding.</w:t>
+      </w:r>
+    </w:p>
+    <w:p>
+      <w:pPr>
+        <w:pStyle w:val="ListParagraph"/>
+        <w:rPr>
+          <w:lang w:val="en-US"/>
+        </w:rPr>
+      </w:pPr>
+    </w:p>
+    <w:p>
+      <w:pPr>
+        <w:pStyle w:val="ListParagraph"/>
+        <w:rPr>
+          <w:lang w:val="en-US"/>
+        </w:rPr>
+      </w:pPr>
+      <w:r>
+        <w:rPr>
+          <w:lang w:val="en-US"/>
+        </w:rPr>
+        <w:t xml:space="preserve">Our Tx power is 100W – square root of that gives “wave amplitude” (of your sinusoids). 20*log_10(wave amplitude) = power in </w:t>
+      </w:r>
+      <w:proofErr w:type="spellStart"/>
+      <w:r>
+        <w:rPr>
+          <w:lang w:val="en-US"/>
+        </w:rPr>
+        <w:t>dBW</w:t>
+      </w:r>
+      <w:proofErr w:type="spellEnd"/>
+      <w:r>
+        <w:rPr>
+          <w:lang w:val="en-US"/>
+        </w:rPr>
+        <w:t>. +30 to get dBm. Use dBm in plots (the standard).</w:t>
+      </w:r>
+    </w:p>
+    <w:p>
+      <w:pPr>
+        <w:pStyle w:val="ListParagraph"/>
+        <w:rPr>
+          <w:lang w:val="en-US"/>
+        </w:rPr>
+      </w:pPr>
+    </w:p>
+    <w:p>
+      <w:pPr>
+        <w:pStyle w:val="ListParagraph"/>
+        <w:rPr>
+          <w:lang w:val="en-US"/>
+        </w:rPr>
+      </w:pPr>
+      <w:r>
+        <w:rPr>
+          <w:lang w:val="en-US"/>
+        </w:rPr>
+        <w:t xml:space="preserve">Check literature to see what the waves should look like (side lobe height factors expected </w:t>
+      </w:r>
+      <w:proofErr w:type="spellStart"/>
+      <w:r>
+        <w:rPr>
+          <w:lang w:val="en-US"/>
+        </w:rPr>
+        <w:t>etc</w:t>
+      </w:r>
+      <w:proofErr w:type="spellEnd"/>
+      <w:r>
+        <w:rPr>
+          <w:lang w:val="en-US"/>
+        </w:rPr>
+        <w:t>)</w:t>
+      </w:r>
+    </w:p>
+    <w:p>
+      <w:pPr>
+        <w:pStyle w:val="ListParagraph"/>
+        <w:rPr>
+          <w:lang w:val="en-US"/>
+        </w:rPr>
+      </w:pPr>
+    </w:p>
+    <w:p>
+      <w:pPr>
+        <w:pStyle w:val="ListParagraph"/>
+        <w:rPr>
+          <w:lang w:val="en-US"/>
+        </w:rPr>
+      </w:pPr>
+    </w:p>
+    <w:p>
+      <w:pPr>
+        <w:pStyle w:val="ListParagraph"/>
+        <w:rPr>
+          <w:lang w:val="en-US"/>
+        </w:rPr>
+      </w:pPr>
     </w:p>
     <w:p>
       <w:pPr>

</xml_diff>

<commit_message>
updated thesis overview doc
</commit_message>
<xml_diff>
--- a/Thesis Overview.docx
+++ b/Thesis Overview.docx
@@ -4,7 +4,7 @@
   <w:body>
     <w:p>
       <w:pPr>
-        <w:pStyle w:val="Listenabsatz"/>
+        <w:pStyle w:val="ListParagraph"/>
         <w:numPr>
           <w:ilvl w:val="0"/>
           <w:numId w:val="2"/>
@@ -22,7 +22,7 @@
     </w:p>
     <w:p>
       <w:pPr>
-        <w:pStyle w:val="Listenabsatz"/>
+        <w:pStyle w:val="ListParagraph"/>
         <w:rPr>
           <w:lang w:val="en-US"/>
         </w:rPr>
@@ -36,15 +36,15 @@
     </w:p>
     <w:p>
       <w:pPr>
-        <w:pStyle w:val="Listenabsatz"/>
-        <w:rPr>
-          <w:lang w:val="en-US"/>
-        </w:rPr>
-      </w:pPr>
-    </w:p>
-    <w:p>
-      <w:pPr>
-        <w:pStyle w:val="Listenabsatz"/>
+        <w:pStyle w:val="ListParagraph"/>
+        <w:rPr>
+          <w:lang w:val="en-US"/>
+        </w:rPr>
+      </w:pPr>
+    </w:p>
+    <w:p>
+      <w:pPr>
+        <w:pStyle w:val="ListParagraph"/>
         <w:rPr>
           <w:lang w:val="en-US"/>
         </w:rPr>
@@ -89,7 +89,21 @@
         <w:rPr>
           <w:lang w:val="en-US"/>
         </w:rPr>
-        <w:t xml:space="preserve"> at o/p (side lobes in freq), back into Rx, </w:t>
+        <w:t xml:space="preserve"> at o/p (side lobes in </w:t>
+      </w:r>
+      <w:proofErr w:type="spellStart"/>
+      <w:r>
+        <w:rPr>
+          <w:lang w:val="en-US"/>
+        </w:rPr>
+        <w:t>freq</w:t>
+      </w:r>
+      <w:proofErr w:type="spellEnd"/>
+      <w:r>
+        <w:rPr>
+          <w:lang w:val="en-US"/>
+        </w:rPr>
+        <w:t xml:space="preserve">), back into Rx, </w:t>
       </w:r>
       <w:r>
         <w:rPr>
@@ -106,7 +120,7 @@
     </w:p>
     <w:p>
       <w:pPr>
-        <w:pStyle w:val="Listenabsatz"/>
+        <w:pStyle w:val="ListParagraph"/>
         <w:rPr>
           <w:lang w:val="en-US"/>
         </w:rPr>
@@ -120,15 +134,15 @@
     </w:p>
     <w:p>
       <w:pPr>
-        <w:pStyle w:val="Listenabsatz"/>
-        <w:rPr>
-          <w:lang w:val="en-US"/>
-        </w:rPr>
-      </w:pPr>
-    </w:p>
-    <w:p>
-      <w:pPr>
-        <w:pStyle w:val="Listenabsatz"/>
+        <w:pStyle w:val="ListParagraph"/>
+        <w:rPr>
+          <w:lang w:val="en-US"/>
+        </w:rPr>
+      </w:pPr>
+    </w:p>
+    <w:p>
+      <w:pPr>
+        <w:pStyle w:val="ListParagraph"/>
         <w:rPr>
           <w:lang w:val="en-US"/>
         </w:rPr>
@@ -154,7 +168,7 @@
     </w:p>
     <w:p>
       <w:pPr>
-        <w:pStyle w:val="Listenabsatz"/>
+        <w:pStyle w:val="ListParagraph"/>
         <w:rPr>
           <w:lang w:val="en-US"/>
         </w:rPr>
@@ -187,15 +201,15 @@
     </w:p>
     <w:p>
       <w:pPr>
-        <w:pStyle w:val="Listenabsatz"/>
-        <w:rPr>
-          <w:lang w:val="en-US"/>
-        </w:rPr>
-      </w:pPr>
-    </w:p>
-    <w:p>
-      <w:pPr>
-        <w:pStyle w:val="Listenabsatz"/>
+        <w:pStyle w:val="ListParagraph"/>
+        <w:rPr>
+          <w:lang w:val="en-US"/>
+        </w:rPr>
+      </w:pPr>
+    </w:p>
+    <w:p>
+      <w:pPr>
+        <w:pStyle w:val="ListParagraph"/>
         <w:numPr>
           <w:ilvl w:val="0"/>
           <w:numId w:val="2"/>
@@ -213,7 +227,7 @@
     </w:p>
     <w:p>
       <w:pPr>
-        <w:pStyle w:val="Listenabsatz"/>
+        <w:pStyle w:val="ListParagraph"/>
         <w:rPr>
           <w:lang w:val="en-US"/>
         </w:rPr>
@@ -234,7 +248,7 @@
     </w:p>
     <w:p>
       <w:pPr>
-        <w:pStyle w:val="Listenabsatz"/>
+        <w:pStyle w:val="ListParagraph"/>
         <w:numPr>
           <w:ilvl w:val="0"/>
           <w:numId w:val="2"/>
@@ -252,7 +266,7 @@
     </w:p>
     <w:p>
       <w:pPr>
-        <w:pStyle w:val="Listenabsatz"/>
+        <w:pStyle w:val="ListParagraph"/>
         <w:rPr>
           <w:lang w:val="en-US"/>
         </w:rPr>
@@ -278,7 +292,7 @@
     </w:p>
     <w:p>
       <w:pPr>
-        <w:pStyle w:val="Listenabsatz"/>
+        <w:pStyle w:val="ListParagraph"/>
         <w:rPr>
           <w:lang w:val="en-US"/>
         </w:rPr>
@@ -292,7 +306,7 @@
     </w:p>
     <w:p>
       <w:pPr>
-        <w:pStyle w:val="Listenabsatz"/>
+        <w:pStyle w:val="ListParagraph"/>
         <w:rPr>
           <w:lang w:val="en-US"/>
         </w:rPr>
@@ -306,15 +320,15 @@
     </w:p>
     <w:p>
       <w:pPr>
-        <w:pStyle w:val="Listenabsatz"/>
-        <w:rPr>
-          <w:lang w:val="en-US"/>
-        </w:rPr>
-      </w:pPr>
-    </w:p>
-    <w:p>
-      <w:pPr>
-        <w:pStyle w:val="Listenabsatz"/>
+        <w:pStyle w:val="ListParagraph"/>
+        <w:rPr>
+          <w:lang w:val="en-US"/>
+        </w:rPr>
+      </w:pPr>
+    </w:p>
+    <w:p>
+      <w:pPr>
+        <w:pStyle w:val="ListParagraph"/>
         <w:numPr>
           <w:ilvl w:val="0"/>
           <w:numId w:val="2"/>
@@ -332,7 +346,7 @@
     </w:p>
     <w:p>
       <w:pPr>
-        <w:pStyle w:val="Listenabsatz"/>
+        <w:pStyle w:val="ListParagraph"/>
         <w:rPr>
           <w:lang w:val="en-US"/>
         </w:rPr>
@@ -346,21 +360,35 @@
     </w:p>
     <w:p>
       <w:pPr>
-        <w:pStyle w:val="Listenabsatz"/>
-        <w:rPr>
-          <w:lang w:val="en-US"/>
-        </w:rPr>
-      </w:pPr>
-      <w:r>
-        <w:rPr>
-          <w:lang w:val="en-US"/>
-        </w:rPr>
-        <w:t>Open loop – i/p changes depending on what we measure at o/p</w:t>
-      </w:r>
-    </w:p>
-    <w:p>
-      <w:pPr>
-        <w:pStyle w:val="Listenabsatz"/>
+        <w:pStyle w:val="ListParagraph"/>
+        <w:rPr>
+          <w:lang w:val="en-US"/>
+        </w:rPr>
+      </w:pPr>
+      <w:r>
+        <w:rPr>
+          <w:lang w:val="en-US"/>
+        </w:rPr>
+        <w:t xml:space="preserve">Open loop – </w:t>
+      </w:r>
+      <w:proofErr w:type="spellStart"/>
+      <w:r>
+        <w:rPr>
+          <w:lang w:val="en-US"/>
+        </w:rPr>
+        <w:t>i</w:t>
+      </w:r>
+      <w:proofErr w:type="spellEnd"/>
+      <w:r>
+        <w:rPr>
+          <w:lang w:val="en-US"/>
+        </w:rPr>
+        <w:t>/p changes depending on what we measure at o/p</w:t>
+      </w:r>
+    </w:p>
+    <w:p>
+      <w:pPr>
+        <w:pStyle w:val="ListParagraph"/>
         <w:rPr>
           <w:lang w:val="en-US"/>
         </w:rPr>
@@ -374,7 +402,7 @@
     </w:p>
     <w:p>
       <w:pPr>
-        <w:pStyle w:val="Listenabsatz"/>
+        <w:pStyle w:val="ListParagraph"/>
         <w:rPr>
           <w:lang w:val="en-US"/>
         </w:rPr>
@@ -388,7 +416,7 @@
     </w:p>
     <w:p>
       <w:pPr>
-        <w:pStyle w:val="Listenabsatz"/>
+        <w:pStyle w:val="ListParagraph"/>
         <w:rPr>
           <w:lang w:val="en-US"/>
         </w:rPr>
@@ -402,15 +430,15 @@
     </w:p>
     <w:p>
       <w:pPr>
-        <w:pStyle w:val="Listenabsatz"/>
-        <w:rPr>
-          <w:lang w:val="en-US"/>
-        </w:rPr>
-      </w:pPr>
-    </w:p>
-    <w:p>
-      <w:pPr>
-        <w:pStyle w:val="Listenabsatz"/>
+        <w:pStyle w:val="ListParagraph"/>
+        <w:rPr>
+          <w:lang w:val="en-US"/>
+        </w:rPr>
+      </w:pPr>
+    </w:p>
+    <w:p>
+      <w:pPr>
+        <w:pStyle w:val="ListParagraph"/>
         <w:rPr>
           <w:lang w:val="en-US"/>
         </w:rPr>
@@ -424,7 +452,7 @@
     </w:p>
     <w:p>
       <w:pPr>
-        <w:pStyle w:val="Listenabsatz"/>
+        <w:pStyle w:val="ListParagraph"/>
         <w:rPr>
           <w:lang w:val="en-US"/>
         </w:rPr>
@@ -438,7 +466,7 @@
     </w:p>
     <w:p>
       <w:pPr>
-        <w:pStyle w:val="Listenabsatz"/>
+        <w:pStyle w:val="ListParagraph"/>
         <w:rPr>
           <w:lang w:val="en-US"/>
         </w:rPr>
@@ -452,17 +480,25 @@
     </w:p>
     <w:p>
       <w:pPr>
-        <w:pStyle w:val="Listenabsatz"/>
-        <w:rPr>
-          <w:lang w:val="en-US"/>
-        </w:rPr>
-      </w:pPr>
-      <w:r>
-        <w:rPr>
-          <w:lang w:val="en-US"/>
-        </w:rPr>
-        <w:t>Settings.xml parametres</w:t>
-      </w:r>
+        <w:pStyle w:val="ListParagraph"/>
+        <w:rPr>
+          <w:lang w:val="en-US"/>
+        </w:rPr>
+      </w:pPr>
+      <w:r>
+        <w:rPr>
+          <w:lang w:val="en-US"/>
+        </w:rPr>
+        <w:t xml:space="preserve">Settings.xml </w:t>
+      </w:r>
+      <w:proofErr w:type="spellStart"/>
+      <w:r>
+        <w:rPr>
+          <w:lang w:val="en-US"/>
+        </w:rPr>
+        <w:t>parametres</w:t>
+      </w:r>
+      <w:proofErr w:type="spellEnd"/>
       <w:r>
         <w:rPr>
           <w:lang w:val="en-US"/>
@@ -472,29 +508,43 @@
     </w:p>
     <w:p>
       <w:pPr>
-        <w:pStyle w:val="Listenabsatz"/>
-        <w:rPr>
-          <w:lang w:val="en-US"/>
-        </w:rPr>
-      </w:pPr>
-    </w:p>
-    <w:p>
-      <w:pPr>
-        <w:pStyle w:val="Listenabsatz"/>
-        <w:rPr>
-          <w:lang w:val="en-US"/>
-        </w:rPr>
-      </w:pPr>
-      <w:r>
-        <w:rPr>
-          <w:lang w:val="en-US"/>
-        </w:rPr>
-        <w:t>Available models for predistortion. Simple ones first – AM,AM conversion</w:t>
-      </w:r>
-    </w:p>
-    <w:p>
-      <w:pPr>
-        <w:pStyle w:val="Listenabsatz"/>
+        <w:pStyle w:val="ListParagraph"/>
+        <w:rPr>
+          <w:lang w:val="en-US"/>
+        </w:rPr>
+      </w:pPr>
+    </w:p>
+    <w:p>
+      <w:pPr>
+        <w:pStyle w:val="ListParagraph"/>
+        <w:rPr>
+          <w:lang w:val="en-US"/>
+        </w:rPr>
+      </w:pPr>
+      <w:r>
+        <w:rPr>
+          <w:lang w:val="en-US"/>
+        </w:rPr>
+        <w:t xml:space="preserve">Available models for predistortion. Simple ones first – </w:t>
+      </w:r>
+      <w:proofErr w:type="gramStart"/>
+      <w:r>
+        <w:rPr>
+          <w:lang w:val="en-US"/>
+        </w:rPr>
+        <w:t>AM,AM</w:t>
+      </w:r>
+      <w:proofErr w:type="gramEnd"/>
+      <w:r>
+        <w:rPr>
+          <w:lang w:val="en-US"/>
+        </w:rPr>
+        <w:t xml:space="preserve"> conversion</w:t>
+      </w:r>
+    </w:p>
+    <w:p>
+      <w:pPr>
+        <w:pStyle w:val="ListParagraph"/>
         <w:rPr>
           <w:lang w:val="en-US"/>
         </w:rPr>
@@ -508,7 +558,7 @@
     </w:p>
     <w:p>
       <w:pPr>
-        <w:pStyle w:val="Listenabsatz"/>
+        <w:pStyle w:val="ListParagraph"/>
         <w:rPr>
           <w:lang w:val="en-US"/>
         </w:rPr>
@@ -522,15 +572,15 @@
     </w:p>
     <w:p>
       <w:pPr>
-        <w:pStyle w:val="Listenabsatz"/>
-        <w:rPr>
-          <w:lang w:val="en-US"/>
-        </w:rPr>
-      </w:pPr>
-    </w:p>
-    <w:p>
-      <w:pPr>
-        <w:pStyle w:val="Listenabsatz"/>
+        <w:pStyle w:val="ListParagraph"/>
+        <w:rPr>
+          <w:lang w:val="en-US"/>
+        </w:rPr>
+      </w:pPr>
+    </w:p>
+    <w:p>
+      <w:pPr>
+        <w:pStyle w:val="ListParagraph"/>
         <w:rPr>
           <w:lang w:val="en-US"/>
         </w:rPr>
@@ -568,7 +618,7 @@
     </w:p>
     <w:p>
       <w:pPr>
-        <w:pStyle w:val="Listenabsatz"/>
+        <w:pStyle w:val="ListParagraph"/>
         <w:rPr>
           <w:lang w:val="en-US"/>
         </w:rPr>
@@ -588,15 +638,15 @@
     </w:p>
     <w:p>
       <w:pPr>
-        <w:pStyle w:val="Listenabsatz"/>
-        <w:rPr>
-          <w:lang w:val="en-US"/>
-        </w:rPr>
-      </w:pPr>
-    </w:p>
-    <w:p>
-      <w:pPr>
-        <w:pStyle w:val="Listenabsatz"/>
+        <w:pStyle w:val="ListParagraph"/>
+        <w:rPr>
+          <w:lang w:val="en-US"/>
+        </w:rPr>
+      </w:pPr>
+    </w:p>
+    <w:p>
+      <w:pPr>
+        <w:pStyle w:val="ListParagraph"/>
         <w:rPr>
           <w:lang w:val="en-US"/>
         </w:rPr>
@@ -610,7 +660,7 @@
     </w:p>
     <w:p>
       <w:pPr>
-        <w:pStyle w:val="Listenabsatz"/>
+        <w:pStyle w:val="ListParagraph"/>
         <w:rPr>
           <w:lang w:val="en-US"/>
         </w:rPr>
@@ -625,15 +675,15 @@
     </w:p>
     <w:p>
       <w:pPr>
-        <w:pStyle w:val="Listenabsatz"/>
-        <w:rPr>
-          <w:lang w:val="en-US"/>
-        </w:rPr>
-      </w:pPr>
-    </w:p>
-    <w:p>
-      <w:pPr>
-        <w:pStyle w:val="Listenabsatz"/>
+        <w:pStyle w:val="ListParagraph"/>
+        <w:rPr>
+          <w:lang w:val="en-US"/>
+        </w:rPr>
+      </w:pPr>
+    </w:p>
+    <w:p>
+      <w:pPr>
+        <w:pStyle w:val="ListParagraph"/>
         <w:rPr>
           <w:u w:val="single"/>
           <w:lang w:val="en-US"/>
@@ -649,7 +699,7 @@
     </w:p>
     <w:p>
       <w:pPr>
-        <w:pStyle w:val="Listenabsatz"/>
+        <w:pStyle w:val="ListParagraph"/>
         <w:rPr>
           <w:lang w:val="en-US"/>
         </w:rPr>
@@ -663,7 +713,7 @@
     </w:p>
     <w:p>
       <w:pPr>
-        <w:pStyle w:val="Listenabsatz"/>
+        <w:pStyle w:val="ListParagraph"/>
         <w:rPr>
           <w:lang w:val="en-US"/>
         </w:rPr>
@@ -677,29 +727,42 @@
     </w:p>
     <w:p>
       <w:pPr>
-        <w:pStyle w:val="Listenabsatz"/>
-        <w:rPr>
-          <w:lang w:val="en-US"/>
-        </w:rPr>
-      </w:pPr>
-      <w:r>
-        <w:rPr>
-          <w:lang w:val="en-US"/>
-        </w:rPr>
-        <w:t>Look at other filters (and components) in FEC Commissioning Doc and see if you need to incorporate them too (e.g. harmonic filter, IF complex filter etc)</w:t>
-      </w:r>
-    </w:p>
-    <w:p>
-      <w:pPr>
-        <w:pStyle w:val="Listenabsatz"/>
-        <w:rPr>
-          <w:lang w:val="en-US"/>
-        </w:rPr>
-      </w:pPr>
-    </w:p>
-    <w:p>
-      <w:pPr>
-        <w:pStyle w:val="Listenabsatz"/>
+        <w:pStyle w:val="ListParagraph"/>
+        <w:rPr>
+          <w:lang w:val="en-US"/>
+        </w:rPr>
+      </w:pPr>
+      <w:r>
+        <w:rPr>
+          <w:lang w:val="en-US"/>
+        </w:rPr>
+        <w:t xml:space="preserve">Look at other filters (and components) in FEC Commissioning Doc and see if you need to incorporate them too (e.g. harmonic filter, IF complex filter </w:t>
+      </w:r>
+      <w:proofErr w:type="spellStart"/>
+      <w:r>
+        <w:rPr>
+          <w:lang w:val="en-US"/>
+        </w:rPr>
+        <w:t>etc</w:t>
+      </w:r>
+      <w:proofErr w:type="spellEnd"/>
+      <w:r>
+        <w:rPr>
+          <w:lang w:val="en-US"/>
+        </w:rPr>
+        <w:t>)</w:t>
+      </w:r>
+    </w:p>
+    <w:p>
+      <w:pPr>
+        <w:pStyle w:val="ListParagraph"/>
+        <w:rPr>
+          <w:lang w:val="en-US"/>
+        </w:rPr>
+      </w:pPr>
+    </w:p>
+    <w:p>
+      <w:pPr>
         <w:rPr>
           <w:u w:val="single"/>
           <w:lang w:val="en-US"/>
@@ -710,118 +773,196 @@
           <w:u w:val="single"/>
           <w:lang w:val="en-US"/>
         </w:rPr>
-        <w:t>22 April 2026</w:t>
-      </w:r>
-    </w:p>
-    <w:p>
-      <w:pPr>
-        <w:pStyle w:val="Listenabsatz"/>
-        <w:rPr>
-          <w:color w:val="EE0000"/>
-          <w:lang w:val="en-US"/>
-        </w:rPr>
-      </w:pPr>
-      <w:r>
-        <w:rPr>
-          <w:color w:val="EE0000"/>
-          <w:lang w:val="en-US"/>
-        </w:rPr>
-        <w:t>Sampling frequency Rx – 77.76MHz, Tx – 2x Rx, though in the Rx chain, the sampling freq gets lowered at different points as downmixing yields a lower freq. Also issue on how to label the RF freq axis if sampling freq is too low. (Thomas will think about it)</w:t>
-      </w:r>
-    </w:p>
-    <w:p>
-      <w:pPr>
-        <w:pStyle w:val="Listenabsatz"/>
-        <w:rPr>
-          <w:lang w:val="en-US"/>
-        </w:rPr>
-      </w:pPr>
-    </w:p>
-    <w:p>
-      <w:pPr>
-        <w:pStyle w:val="Listenabsatz"/>
-        <w:rPr>
-          <w:lang w:val="en-US"/>
-        </w:rPr>
-      </w:pPr>
-      <w:r>
-        <w:rPr>
-          <w:lang w:val="en-US"/>
-        </w:rPr>
-        <w:t>S1 looks weird after IF mixing because not enough points. Need zero padding.</w:t>
-      </w:r>
-    </w:p>
-    <w:p>
-      <w:pPr>
-        <w:pStyle w:val="Listenabsatz"/>
+        <w:t>8 May</w:t>
+      </w:r>
+      <w:r>
+        <w:rPr>
+          <w:u w:val="single"/>
+          <w:lang w:val="en-US"/>
+        </w:rPr>
+        <w:t xml:space="preserve"> 2026</w:t>
+      </w:r>
+    </w:p>
+    <w:p>
+      <w:pPr>
+        <w:pStyle w:val="ListParagraph"/>
         <w:numPr>
           <w:ilvl w:val="0"/>
-          <w:numId w:val="3"/>
+          <w:numId w:val="4"/>
         </w:numPr>
         <w:rPr>
-          <w:color w:val="EE0000"/>
-          <w:lang w:val="en-US"/>
-        </w:rPr>
-      </w:pPr>
-      <w:r>
-        <w:rPr>
-          <w:color w:val="EE0000"/>
-          <w:lang w:val="en-US"/>
-        </w:rPr>
-        <w:t>But zero padding multiplies signal with rect, i.e. sinc convolution, so not what we want either</w:t>
-      </w:r>
-    </w:p>
-    <w:p>
-      <w:pPr>
-        <w:pStyle w:val="Listenabsatz"/>
-        <w:ind w:left="1080"/>
-        <w:rPr>
-          <w:color w:val="EE0000"/>
-          <w:lang w:val="en-US"/>
-        </w:rPr>
-      </w:pPr>
-    </w:p>
-    <w:p>
-      <w:pPr>
-        <w:pStyle w:val="Listenabsatz"/>
-        <w:rPr>
-          <w:lang w:val="en-US"/>
-        </w:rPr>
-      </w:pPr>
-      <w:r>
-        <w:rPr>
-          <w:lang w:val="en-US"/>
-        </w:rPr>
-        <w:t>Check literature to see what the waves should look like (side lobe height factors expected etc)</w:t>
-      </w:r>
-    </w:p>
-    <w:p>
-      <w:pPr>
-        <w:pStyle w:val="Listenabsatz"/>
-        <w:rPr>
-          <w:lang w:val="en-US"/>
-        </w:rPr>
-      </w:pPr>
-    </w:p>
-    <w:p>
-      <w:pPr>
-        <w:pStyle w:val="Listenabsatz"/>
-        <w:rPr>
-          <w:lang w:val="en-US"/>
-        </w:rPr>
-      </w:pPr>
-    </w:p>
-    <w:p>
-      <w:pPr>
-        <w:pStyle w:val="Listenabsatz"/>
-        <w:rPr>
-          <w:lang w:val="en-US"/>
-        </w:rPr>
-      </w:pPr>
-    </w:p>
-    <w:p>
-      <w:pPr>
-        <w:pStyle w:val="Listenabsatz"/>
+          <w:lang w:val="en-US"/>
+        </w:rPr>
+      </w:pPr>
+      <w:r>
+        <w:rPr>
+          <w:lang w:val="en-US"/>
+        </w:rPr>
+        <w:t>Create full Tx/Rx chain for your understanding (also change up/</w:t>
+      </w:r>
+      <w:proofErr w:type="spellStart"/>
+      <w:r>
+        <w:rPr>
+          <w:lang w:val="en-US"/>
+        </w:rPr>
+        <w:t>downconversion</w:t>
+      </w:r>
+      <w:proofErr w:type="spellEnd"/>
+      <w:r>
+        <w:rPr>
+          <w:lang w:val="en-US"/>
+        </w:rPr>
+        <w:t xml:space="preserve"> functions to use time vector. Downmixing </w:t>
+      </w:r>
+      <w:proofErr w:type="gramStart"/>
+      <w:r>
+        <w:rPr>
+          <w:lang w:val="en-US"/>
+        </w:rPr>
+        <w:t>result</w:t>
+      </w:r>
+      <w:proofErr w:type="gramEnd"/>
+      <w:r>
+        <w:rPr>
+          <w:lang w:val="en-US"/>
+        </w:rPr>
+        <w:t xml:space="preserve"> should not be different for different sampling frequencies. You just have more frequency bins in between)</w:t>
+      </w:r>
+    </w:p>
+    <w:p>
+      <w:pPr>
+        <w:pStyle w:val="ListParagraph"/>
+        <w:numPr>
+          <w:ilvl w:val="0"/>
+          <w:numId w:val="4"/>
+        </w:numPr>
+        <w:rPr>
+          <w:lang w:val="en-US"/>
+        </w:rPr>
+      </w:pPr>
+      <w:r>
+        <w:rPr>
+          <w:lang w:val="en-US"/>
+        </w:rPr>
+        <w:t xml:space="preserve">How to plot RF signals because dependence on </w:t>
+      </w:r>
+      <w:proofErr w:type="spellStart"/>
+      <w:r>
+        <w:rPr>
+          <w:lang w:val="en-US"/>
+        </w:rPr>
+        <w:t>f_s</w:t>
+      </w:r>
+      <w:proofErr w:type="spellEnd"/>
+      <w:r>
+        <w:rPr>
+          <w:lang w:val="en-US"/>
+        </w:rPr>
+        <w:t>? (Monday)</w:t>
+      </w:r>
+      <w:r>
+        <w:rPr>
+          <w:lang w:val="en-US"/>
+        </w:rPr>
+        <w:tab/>
+      </w:r>
+    </w:p>
+    <w:p>
+      <w:pPr>
+        <w:pStyle w:val="ListParagraph"/>
+        <w:numPr>
+          <w:ilvl w:val="0"/>
+          <w:numId w:val="4"/>
+        </w:numPr>
+        <w:rPr>
+          <w:lang w:val="en-US"/>
+        </w:rPr>
+      </w:pPr>
+      <w:r>
+        <w:rPr>
+          <w:lang w:val="en-US"/>
+        </w:rPr>
+        <w:t>Implement filter (Rx IF FEC 10</w:t>
+      </w:r>
+      <w:r>
+        <w:rPr>
+          <w:vertAlign w:val="superscript"/>
+          <w:lang w:val="en-US"/>
+        </w:rPr>
+        <w:t>th</w:t>
+      </w:r>
+      <w:r>
+        <w:rPr>
+          <w:lang w:val="en-US"/>
+        </w:rPr>
+        <w:t xml:space="preserve"> order) – should remove the mirror frequency. Aleksei sent the simulation results.</w:t>
+      </w:r>
+    </w:p>
+    <w:p>
+      <w:pPr>
+        <w:pStyle w:val="ListParagraph"/>
+        <w:numPr>
+          <w:ilvl w:val="0"/>
+          <w:numId w:val="4"/>
+        </w:numPr>
+        <w:rPr>
+          <w:lang w:val="en-US"/>
+        </w:rPr>
+      </w:pPr>
+      <w:r>
+        <w:rPr>
+          <w:lang w:val="en-US"/>
+        </w:rPr>
+        <w:t xml:space="preserve">Check literature to see what the waves should look like (side lobe height factors expected </w:t>
+      </w:r>
+      <w:r>
+        <w:rPr>
+          <w:lang w:val="en-US"/>
+        </w:rPr>
+        <w:t xml:space="preserve">e.g. 15dB </w:t>
+      </w:r>
+      <w:proofErr w:type="spellStart"/>
+      <w:r>
+        <w:rPr>
+          <w:lang w:val="en-US"/>
+        </w:rPr>
+        <w:t>etc</w:t>
+      </w:r>
+      <w:proofErr w:type="spellEnd"/>
+      <w:r>
+        <w:rPr>
+          <w:lang w:val="en-US"/>
+        </w:rPr>
+        <w:t>)</w:t>
+      </w:r>
+    </w:p>
+    <w:p>
+      <w:pPr>
+        <w:pStyle w:val="ListParagraph"/>
+        <w:rPr>
+          <w:lang w:val="en-US"/>
+        </w:rPr>
+      </w:pPr>
+    </w:p>
+    <w:p>
+      <w:pPr>
+        <w:pStyle w:val="ListParagraph"/>
+        <w:rPr>
+          <w:lang w:val="en-US"/>
+        </w:rPr>
+      </w:pPr>
+    </w:p>
+    <w:p>
+      <w:pPr>
+        <w:pStyle w:val="ListParagraph"/>
+        <w:rPr>
+          <w:lang w:val="en-US"/>
+        </w:rPr>
+      </w:pPr>
+    </w:p>
+    <w:p>
+      <w:pPr>
+        <w:pStyle w:val="ListParagraph"/>
         <w:rPr>
           <w:lang w:val="en-US"/>
         </w:rPr>
@@ -1065,6 +1206,119 @@
     </w:lvl>
   </w:abstractNum>
   <w:abstractNum w:abstractNumId="2" w15:restartNumberingAfterBreak="0">
+    <w:nsid w:val="70A12956"/>
+    <w:multiLevelType w:val="hybridMultilevel"/>
+    <w:tmpl w:val="EC7C04F4"/>
+    <w:lvl w:ilvl="0" w:tplc="20000001">
+      <w:start w:val="1"/>
+      <w:numFmt w:val="bullet"/>
+      <w:lvlText w:val=""/>
+      <w:lvlJc w:val="left"/>
+      <w:pPr>
+        <w:ind w:left="720" w:hanging="360"/>
+      </w:pPr>
+      <w:rPr>
+        <w:rFonts w:ascii="Symbol" w:hAnsi="Symbol" w:hint="default"/>
+      </w:rPr>
+    </w:lvl>
+    <w:lvl w:ilvl="1" w:tplc="20000003" w:tentative="1">
+      <w:start w:val="1"/>
+      <w:numFmt w:val="bullet"/>
+      <w:lvlText w:val="o"/>
+      <w:lvlJc w:val="left"/>
+      <w:pPr>
+        <w:ind w:left="1440" w:hanging="360"/>
+      </w:pPr>
+      <w:rPr>
+        <w:rFonts w:ascii="Courier New" w:hAnsi="Courier New" w:cs="Courier New" w:hint="default"/>
+      </w:rPr>
+    </w:lvl>
+    <w:lvl w:ilvl="2" w:tplc="20000005" w:tentative="1">
+      <w:start w:val="1"/>
+      <w:numFmt w:val="bullet"/>
+      <w:lvlText w:val=""/>
+      <w:lvlJc w:val="left"/>
+      <w:pPr>
+        <w:ind w:left="2160" w:hanging="360"/>
+      </w:pPr>
+      <w:rPr>
+        <w:rFonts w:ascii="Wingdings" w:hAnsi="Wingdings" w:hint="default"/>
+      </w:rPr>
+    </w:lvl>
+    <w:lvl w:ilvl="3" w:tplc="20000001" w:tentative="1">
+      <w:start w:val="1"/>
+      <w:numFmt w:val="bullet"/>
+      <w:lvlText w:val=""/>
+      <w:lvlJc w:val="left"/>
+      <w:pPr>
+        <w:ind w:left="2880" w:hanging="360"/>
+      </w:pPr>
+      <w:rPr>
+        <w:rFonts w:ascii="Symbol" w:hAnsi="Symbol" w:hint="default"/>
+      </w:rPr>
+    </w:lvl>
+    <w:lvl w:ilvl="4" w:tplc="20000003" w:tentative="1">
+      <w:start w:val="1"/>
+      <w:numFmt w:val="bullet"/>
+      <w:lvlText w:val="o"/>
+      <w:lvlJc w:val="left"/>
+      <w:pPr>
+        <w:ind w:left="3600" w:hanging="360"/>
+      </w:pPr>
+      <w:rPr>
+        <w:rFonts w:ascii="Courier New" w:hAnsi="Courier New" w:cs="Courier New" w:hint="default"/>
+      </w:rPr>
+    </w:lvl>
+    <w:lvl w:ilvl="5" w:tplc="20000005" w:tentative="1">
+      <w:start w:val="1"/>
+      <w:numFmt w:val="bullet"/>
+      <w:lvlText w:val=""/>
+      <w:lvlJc w:val="left"/>
+      <w:pPr>
+        <w:ind w:left="4320" w:hanging="360"/>
+      </w:pPr>
+      <w:rPr>
+        <w:rFonts w:ascii="Wingdings" w:hAnsi="Wingdings" w:hint="default"/>
+      </w:rPr>
+    </w:lvl>
+    <w:lvl w:ilvl="6" w:tplc="20000001" w:tentative="1">
+      <w:start w:val="1"/>
+      <w:numFmt w:val="bullet"/>
+      <w:lvlText w:val=""/>
+      <w:lvlJc w:val="left"/>
+      <w:pPr>
+        <w:ind w:left="5040" w:hanging="360"/>
+      </w:pPr>
+      <w:rPr>
+        <w:rFonts w:ascii="Symbol" w:hAnsi="Symbol" w:hint="default"/>
+      </w:rPr>
+    </w:lvl>
+    <w:lvl w:ilvl="7" w:tplc="20000003" w:tentative="1">
+      <w:start w:val="1"/>
+      <w:numFmt w:val="bullet"/>
+      <w:lvlText w:val="o"/>
+      <w:lvlJc w:val="left"/>
+      <w:pPr>
+        <w:ind w:left="5760" w:hanging="360"/>
+      </w:pPr>
+      <w:rPr>
+        <w:rFonts w:ascii="Courier New" w:hAnsi="Courier New" w:cs="Courier New" w:hint="default"/>
+      </w:rPr>
+    </w:lvl>
+    <w:lvl w:ilvl="8" w:tplc="20000005" w:tentative="1">
+      <w:start w:val="1"/>
+      <w:numFmt w:val="bullet"/>
+      <w:lvlText w:val=""/>
+      <w:lvlJc w:val="left"/>
+      <w:pPr>
+        <w:ind w:left="6480" w:hanging="360"/>
+      </w:pPr>
+      <w:rPr>
+        <w:rFonts w:ascii="Wingdings" w:hAnsi="Wingdings" w:hint="default"/>
+      </w:rPr>
+    </w:lvl>
+  </w:abstractNum>
+  <w:abstractNum w:abstractNumId="3" w15:restartNumberingAfterBreak="0">
     <w:nsid w:val="752C582A"/>
     <w:multiLevelType w:val="hybridMultilevel"/>
     <w:tmpl w:val="3FECD4DC"/>
@@ -1181,10 +1435,13 @@
     <w:abstractNumId w:val="0"/>
   </w:num>
   <w:num w:numId="2" w16cid:durableId="1061831373">
-    <w:abstractNumId w:val="2"/>
+    <w:abstractNumId w:val="3"/>
   </w:num>
   <w:num w:numId="3" w16cid:durableId="44256664">
     <w:abstractNumId w:val="1"/>
+  </w:num>
+  <w:num w:numId="4" w16cid:durableId="1783768072">
+    <w:abstractNumId w:val="2"/>
   </w:num>
 </w:numbering>
 </file>
@@ -1198,7 +1455,7 @@
         <w:kern w:val="2"/>
         <w:sz w:val="24"/>
         <w:szCs w:val="24"/>
-        <w:lang w:eastAsia="en-US" w:bidi="ar-SA"/>
+        <w:lang w:val="en-DE" w:eastAsia="en-US" w:bidi="ar-SA"/>
         <w14:ligatures w14:val="standardContextual"/>
       </w:rPr>
     </w:rPrDefault>
@@ -1586,15 +1843,15 @@
     <w:lsdException w:name="Unresolved Mention" w:semiHidden="1" w:unhideWhenUsed="1"/>
     <w:lsdException w:name="Smart Link" w:semiHidden="1" w:unhideWhenUsed="1"/>
   </w:latentStyles>
-  <w:style w:type="paragraph" w:default="1" w:styleId="Standard">
+  <w:style w:type="paragraph" w:default="1" w:styleId="Normal">
     <w:name w:val="Normal"/>
     <w:qFormat/>
   </w:style>
-  <w:style w:type="paragraph" w:styleId="berschrift1">
+  <w:style w:type="paragraph" w:styleId="Heading1">
     <w:name w:val="heading 1"/>
-    <w:basedOn w:val="Standard"/>
-    <w:next w:val="Standard"/>
-    <w:link w:val="berschrift1Zchn"/>
+    <w:basedOn w:val="Normal"/>
+    <w:next w:val="Normal"/>
+    <w:link w:val="Heading1Char"/>
     <w:uiPriority w:val="9"/>
     <w:qFormat/>
     <w:rsid w:val="00080235"/>
@@ -1611,11 +1868,11 @@
       <w:szCs w:val="40"/>
     </w:rPr>
   </w:style>
-  <w:style w:type="paragraph" w:styleId="berschrift2">
+  <w:style w:type="paragraph" w:styleId="Heading2">
     <w:name w:val="heading 2"/>
-    <w:basedOn w:val="Standard"/>
-    <w:next w:val="Standard"/>
-    <w:link w:val="berschrift2Zchn"/>
+    <w:basedOn w:val="Normal"/>
+    <w:next w:val="Normal"/>
+    <w:link w:val="Heading2Char"/>
     <w:uiPriority w:val="9"/>
     <w:semiHidden/>
     <w:unhideWhenUsed/>
@@ -1634,11 +1891,11 @@
       <w:szCs w:val="32"/>
     </w:rPr>
   </w:style>
-  <w:style w:type="paragraph" w:styleId="berschrift3">
+  <w:style w:type="paragraph" w:styleId="Heading3">
     <w:name w:val="heading 3"/>
-    <w:basedOn w:val="Standard"/>
-    <w:next w:val="Standard"/>
-    <w:link w:val="berschrift3Zchn"/>
+    <w:basedOn w:val="Normal"/>
+    <w:next w:val="Normal"/>
+    <w:link w:val="Heading3Char"/>
     <w:uiPriority w:val="9"/>
     <w:semiHidden/>
     <w:unhideWhenUsed/>
@@ -1657,11 +1914,11 @@
       <w:szCs w:val="28"/>
     </w:rPr>
   </w:style>
-  <w:style w:type="paragraph" w:styleId="berschrift4">
+  <w:style w:type="paragraph" w:styleId="Heading4">
     <w:name w:val="heading 4"/>
-    <w:basedOn w:val="Standard"/>
-    <w:next w:val="Standard"/>
-    <w:link w:val="berschrift4Zchn"/>
+    <w:basedOn w:val="Normal"/>
+    <w:next w:val="Normal"/>
+    <w:link w:val="Heading4Char"/>
     <w:uiPriority w:val="9"/>
     <w:semiHidden/>
     <w:unhideWhenUsed/>
@@ -1680,11 +1937,11 @@
       <w:color w:val="0F4761" w:themeColor="accent1" w:themeShade="BF"/>
     </w:rPr>
   </w:style>
-  <w:style w:type="paragraph" w:styleId="berschrift5">
+  <w:style w:type="paragraph" w:styleId="Heading5">
     <w:name w:val="heading 5"/>
-    <w:basedOn w:val="Standard"/>
-    <w:next w:val="Standard"/>
-    <w:link w:val="berschrift5Zchn"/>
+    <w:basedOn w:val="Normal"/>
+    <w:next w:val="Normal"/>
+    <w:link w:val="Heading5Char"/>
     <w:uiPriority w:val="9"/>
     <w:semiHidden/>
     <w:unhideWhenUsed/>
@@ -1701,11 +1958,11 @@
       <w:color w:val="0F4761" w:themeColor="accent1" w:themeShade="BF"/>
     </w:rPr>
   </w:style>
-  <w:style w:type="paragraph" w:styleId="berschrift6">
+  <w:style w:type="paragraph" w:styleId="Heading6">
     <w:name w:val="heading 6"/>
-    <w:basedOn w:val="Standard"/>
-    <w:next w:val="Standard"/>
-    <w:link w:val="berschrift6Zchn"/>
+    <w:basedOn w:val="Normal"/>
+    <w:next w:val="Normal"/>
+    <w:link w:val="Heading6Char"/>
     <w:uiPriority w:val="9"/>
     <w:semiHidden/>
     <w:unhideWhenUsed/>
@@ -1724,11 +1981,11 @@
       <w:color w:val="595959" w:themeColor="text1" w:themeTint="A6"/>
     </w:rPr>
   </w:style>
-  <w:style w:type="paragraph" w:styleId="berschrift7">
+  <w:style w:type="paragraph" w:styleId="Heading7">
     <w:name w:val="heading 7"/>
-    <w:basedOn w:val="Standard"/>
-    <w:next w:val="Standard"/>
-    <w:link w:val="berschrift7Zchn"/>
+    <w:basedOn w:val="Normal"/>
+    <w:next w:val="Normal"/>
+    <w:link w:val="Heading7Char"/>
     <w:uiPriority w:val="9"/>
     <w:semiHidden/>
     <w:unhideWhenUsed/>
@@ -1745,11 +2002,11 @@
       <w:color w:val="595959" w:themeColor="text1" w:themeTint="A6"/>
     </w:rPr>
   </w:style>
-  <w:style w:type="paragraph" w:styleId="berschrift8">
+  <w:style w:type="paragraph" w:styleId="Heading8">
     <w:name w:val="heading 8"/>
-    <w:basedOn w:val="Standard"/>
-    <w:next w:val="Standard"/>
-    <w:link w:val="berschrift8Zchn"/>
+    <w:basedOn w:val="Normal"/>
+    <w:next w:val="Normal"/>
+    <w:link w:val="Heading8Char"/>
     <w:uiPriority w:val="9"/>
     <w:semiHidden/>
     <w:unhideWhenUsed/>
@@ -1768,11 +2025,11 @@
       <w:color w:val="272727" w:themeColor="text1" w:themeTint="D8"/>
     </w:rPr>
   </w:style>
-  <w:style w:type="paragraph" w:styleId="berschrift9">
+  <w:style w:type="paragraph" w:styleId="Heading9">
     <w:name w:val="heading 9"/>
-    <w:basedOn w:val="Standard"/>
-    <w:next w:val="Standard"/>
-    <w:link w:val="berschrift9Zchn"/>
+    <w:basedOn w:val="Normal"/>
+    <w:next w:val="Normal"/>
+    <w:link w:val="Heading9Char"/>
     <w:uiPriority w:val="9"/>
     <w:semiHidden/>
     <w:unhideWhenUsed/>
@@ -1789,13 +2046,13 @@
       <w:color w:val="272727" w:themeColor="text1" w:themeTint="D8"/>
     </w:rPr>
   </w:style>
-  <w:style w:type="character" w:default="1" w:styleId="Absatz-Standardschriftart">
+  <w:style w:type="character" w:default="1" w:styleId="DefaultParagraphFont">
     <w:name w:val="Default Paragraph Font"/>
     <w:uiPriority w:val="1"/>
     <w:semiHidden/>
     <w:unhideWhenUsed/>
   </w:style>
-  <w:style w:type="table" w:default="1" w:styleId="NormaleTabelle">
+  <w:style w:type="table" w:default="1" w:styleId="TableNormal">
     <w:name w:val="Normal Table"/>
     <w:uiPriority w:val="99"/>
     <w:semiHidden/>
@@ -1810,16 +2067,16 @@
       </w:tblCellMar>
     </w:tblPr>
   </w:style>
-  <w:style w:type="numbering" w:default="1" w:styleId="KeineListe">
+  <w:style w:type="numbering" w:default="1" w:styleId="NoList">
     <w:name w:val="No List"/>
     <w:uiPriority w:val="99"/>
     <w:semiHidden/>
     <w:unhideWhenUsed/>
   </w:style>
-  <w:style w:type="character" w:customStyle="1" w:styleId="berschrift1Zchn">
-    <w:name w:val="Überschrift 1 Zchn"/>
-    <w:basedOn w:val="Absatz-Standardschriftart"/>
-    <w:link w:val="berschrift1"/>
+  <w:style w:type="character" w:customStyle="1" w:styleId="Heading1Char">
+    <w:name w:val="Heading 1 Char"/>
+    <w:basedOn w:val="DefaultParagraphFont"/>
+    <w:link w:val="Heading1"/>
     <w:uiPriority w:val="9"/>
     <w:rsid w:val="00080235"/>
     <w:rPr>
@@ -1829,10 +2086,10 @@
       <w:szCs w:val="40"/>
     </w:rPr>
   </w:style>
-  <w:style w:type="character" w:customStyle="1" w:styleId="berschrift2Zchn">
-    <w:name w:val="Überschrift 2 Zchn"/>
-    <w:basedOn w:val="Absatz-Standardschriftart"/>
-    <w:link w:val="berschrift2"/>
+  <w:style w:type="character" w:customStyle="1" w:styleId="Heading2Char">
+    <w:name w:val="Heading 2 Char"/>
+    <w:basedOn w:val="DefaultParagraphFont"/>
+    <w:link w:val="Heading2"/>
     <w:uiPriority w:val="9"/>
     <w:semiHidden/>
     <w:rsid w:val="00080235"/>
@@ -1843,10 +2100,10 @@
       <w:szCs w:val="32"/>
     </w:rPr>
   </w:style>
-  <w:style w:type="character" w:customStyle="1" w:styleId="berschrift3Zchn">
-    <w:name w:val="Überschrift 3 Zchn"/>
-    <w:basedOn w:val="Absatz-Standardschriftart"/>
-    <w:link w:val="berschrift3"/>
+  <w:style w:type="character" w:customStyle="1" w:styleId="Heading3Char">
+    <w:name w:val="Heading 3 Char"/>
+    <w:basedOn w:val="DefaultParagraphFont"/>
+    <w:link w:val="Heading3"/>
     <w:uiPriority w:val="9"/>
     <w:semiHidden/>
     <w:rsid w:val="00080235"/>
@@ -1857,10 +2114,10 @@
       <w:szCs w:val="28"/>
     </w:rPr>
   </w:style>
-  <w:style w:type="character" w:customStyle="1" w:styleId="berschrift4Zchn">
-    <w:name w:val="Überschrift 4 Zchn"/>
-    <w:basedOn w:val="Absatz-Standardschriftart"/>
-    <w:link w:val="berschrift4"/>
+  <w:style w:type="character" w:customStyle="1" w:styleId="Heading4Char">
+    <w:name w:val="Heading 4 Char"/>
+    <w:basedOn w:val="DefaultParagraphFont"/>
+    <w:link w:val="Heading4"/>
     <w:uiPriority w:val="9"/>
     <w:semiHidden/>
     <w:rsid w:val="00080235"/>
@@ -1871,10 +2128,10 @@
       <w:color w:val="0F4761" w:themeColor="accent1" w:themeShade="BF"/>
     </w:rPr>
   </w:style>
-  <w:style w:type="character" w:customStyle="1" w:styleId="berschrift5Zchn">
-    <w:name w:val="Überschrift 5 Zchn"/>
-    <w:basedOn w:val="Absatz-Standardschriftart"/>
-    <w:link w:val="berschrift5"/>
+  <w:style w:type="character" w:customStyle="1" w:styleId="Heading5Char">
+    <w:name w:val="Heading 5 Char"/>
+    <w:basedOn w:val="DefaultParagraphFont"/>
+    <w:link w:val="Heading5"/>
     <w:uiPriority w:val="9"/>
     <w:semiHidden/>
     <w:rsid w:val="00080235"/>
@@ -1883,10 +2140,10 @@
       <w:color w:val="0F4761" w:themeColor="accent1" w:themeShade="BF"/>
     </w:rPr>
   </w:style>
-  <w:style w:type="character" w:customStyle="1" w:styleId="berschrift6Zchn">
-    <w:name w:val="Überschrift 6 Zchn"/>
-    <w:basedOn w:val="Absatz-Standardschriftart"/>
-    <w:link w:val="berschrift6"/>
+  <w:style w:type="character" w:customStyle="1" w:styleId="Heading6Char">
+    <w:name w:val="Heading 6 Char"/>
+    <w:basedOn w:val="DefaultParagraphFont"/>
+    <w:link w:val="Heading6"/>
     <w:uiPriority w:val="9"/>
     <w:semiHidden/>
     <w:rsid w:val="00080235"/>
@@ -1897,10 +2154,10 @@
       <w:color w:val="595959" w:themeColor="text1" w:themeTint="A6"/>
     </w:rPr>
   </w:style>
-  <w:style w:type="character" w:customStyle="1" w:styleId="berschrift7Zchn">
-    <w:name w:val="Überschrift 7 Zchn"/>
-    <w:basedOn w:val="Absatz-Standardschriftart"/>
-    <w:link w:val="berschrift7"/>
+  <w:style w:type="character" w:customStyle="1" w:styleId="Heading7Char">
+    <w:name w:val="Heading 7 Char"/>
+    <w:basedOn w:val="DefaultParagraphFont"/>
+    <w:link w:val="Heading7"/>
     <w:uiPriority w:val="9"/>
     <w:semiHidden/>
     <w:rsid w:val="00080235"/>
@@ -1909,10 +2166,10 @@
       <w:color w:val="595959" w:themeColor="text1" w:themeTint="A6"/>
     </w:rPr>
   </w:style>
-  <w:style w:type="character" w:customStyle="1" w:styleId="berschrift8Zchn">
-    <w:name w:val="Überschrift 8 Zchn"/>
-    <w:basedOn w:val="Absatz-Standardschriftart"/>
-    <w:link w:val="berschrift8"/>
+  <w:style w:type="character" w:customStyle="1" w:styleId="Heading8Char">
+    <w:name w:val="Heading 8 Char"/>
+    <w:basedOn w:val="DefaultParagraphFont"/>
+    <w:link w:val="Heading8"/>
     <w:uiPriority w:val="9"/>
     <w:semiHidden/>
     <w:rsid w:val="00080235"/>
@@ -1923,10 +2180,10 @@
       <w:color w:val="272727" w:themeColor="text1" w:themeTint="D8"/>
     </w:rPr>
   </w:style>
-  <w:style w:type="character" w:customStyle="1" w:styleId="berschrift9Zchn">
-    <w:name w:val="Überschrift 9 Zchn"/>
-    <w:basedOn w:val="Absatz-Standardschriftart"/>
-    <w:link w:val="berschrift9"/>
+  <w:style w:type="character" w:customStyle="1" w:styleId="Heading9Char">
+    <w:name w:val="Heading 9 Char"/>
+    <w:basedOn w:val="DefaultParagraphFont"/>
+    <w:link w:val="Heading9"/>
     <w:uiPriority w:val="9"/>
     <w:semiHidden/>
     <w:rsid w:val="00080235"/>
@@ -1935,11 +2192,11 @@
       <w:color w:val="272727" w:themeColor="text1" w:themeTint="D8"/>
     </w:rPr>
   </w:style>
-  <w:style w:type="paragraph" w:styleId="Titel">
+  <w:style w:type="paragraph" w:styleId="Title">
     <w:name w:val="Title"/>
-    <w:basedOn w:val="Standard"/>
-    <w:next w:val="Standard"/>
-    <w:link w:val="TitelZchn"/>
+    <w:basedOn w:val="Normal"/>
+    <w:next w:val="Normal"/>
+    <w:link w:val="TitleChar"/>
     <w:uiPriority w:val="10"/>
     <w:qFormat/>
     <w:rsid w:val="00080235"/>
@@ -1955,10 +2212,10 @@
       <w:szCs w:val="56"/>
     </w:rPr>
   </w:style>
-  <w:style w:type="character" w:customStyle="1" w:styleId="TitelZchn">
-    <w:name w:val="Titel Zchn"/>
-    <w:basedOn w:val="Absatz-Standardschriftart"/>
-    <w:link w:val="Titel"/>
+  <w:style w:type="character" w:customStyle="1" w:styleId="TitleChar">
+    <w:name w:val="Title Char"/>
+    <w:basedOn w:val="DefaultParagraphFont"/>
+    <w:link w:val="Title"/>
     <w:uiPriority w:val="10"/>
     <w:rsid w:val="00080235"/>
     <w:rPr>
@@ -1969,11 +2226,11 @@
       <w:szCs w:val="56"/>
     </w:rPr>
   </w:style>
-  <w:style w:type="paragraph" w:styleId="Untertitel">
+  <w:style w:type="paragraph" w:styleId="Subtitle">
     <w:name w:val="Subtitle"/>
-    <w:basedOn w:val="Standard"/>
-    <w:next w:val="Standard"/>
-    <w:link w:val="UntertitelZchn"/>
+    <w:basedOn w:val="Normal"/>
+    <w:next w:val="Normal"/>
+    <w:link w:val="SubtitleChar"/>
     <w:uiPriority w:val="11"/>
     <w:qFormat/>
     <w:rsid w:val="00080235"/>
@@ -1990,10 +2247,10 @@
       <w:szCs w:val="28"/>
     </w:rPr>
   </w:style>
-  <w:style w:type="character" w:customStyle="1" w:styleId="UntertitelZchn">
-    <w:name w:val="Untertitel Zchn"/>
-    <w:basedOn w:val="Absatz-Standardschriftart"/>
-    <w:link w:val="Untertitel"/>
+  <w:style w:type="character" w:customStyle="1" w:styleId="SubtitleChar">
+    <w:name w:val="Subtitle Char"/>
+    <w:basedOn w:val="DefaultParagraphFont"/>
+    <w:link w:val="Subtitle"/>
     <w:uiPriority w:val="11"/>
     <w:rsid w:val="00080235"/>
     <w:rPr>
@@ -2004,11 +2261,11 @@
       <w:szCs w:val="28"/>
     </w:rPr>
   </w:style>
-  <w:style w:type="paragraph" w:styleId="Zitat">
+  <w:style w:type="paragraph" w:styleId="Quote">
     <w:name w:val="Quote"/>
-    <w:basedOn w:val="Standard"/>
-    <w:next w:val="Standard"/>
-    <w:link w:val="ZitatZchn"/>
+    <w:basedOn w:val="Normal"/>
+    <w:next w:val="Normal"/>
+    <w:link w:val="QuoteChar"/>
     <w:uiPriority w:val="29"/>
     <w:qFormat/>
     <w:rsid w:val="00080235"/>
@@ -2022,10 +2279,10 @@
       <w:color w:val="404040" w:themeColor="text1" w:themeTint="BF"/>
     </w:rPr>
   </w:style>
-  <w:style w:type="character" w:customStyle="1" w:styleId="ZitatZchn">
-    <w:name w:val="Zitat Zchn"/>
-    <w:basedOn w:val="Absatz-Standardschriftart"/>
-    <w:link w:val="Zitat"/>
+  <w:style w:type="character" w:customStyle="1" w:styleId="QuoteChar">
+    <w:name w:val="Quote Char"/>
+    <w:basedOn w:val="DefaultParagraphFont"/>
+    <w:link w:val="Quote"/>
     <w:uiPriority w:val="29"/>
     <w:rsid w:val="00080235"/>
     <w:rPr>
@@ -2034,9 +2291,9 @@
       <w:color w:val="404040" w:themeColor="text1" w:themeTint="BF"/>
     </w:rPr>
   </w:style>
-  <w:style w:type="paragraph" w:styleId="Listenabsatz">
+  <w:style w:type="paragraph" w:styleId="ListParagraph">
     <w:name w:val="List Paragraph"/>
-    <w:basedOn w:val="Standard"/>
+    <w:basedOn w:val="Normal"/>
     <w:uiPriority w:val="34"/>
     <w:qFormat/>
     <w:rsid w:val="00080235"/>
@@ -2045,9 +2302,9 @@
       <w:contextualSpacing/>
     </w:pPr>
   </w:style>
-  <w:style w:type="character" w:styleId="IntensiveHervorhebung">
+  <w:style w:type="character" w:styleId="IntenseEmphasis">
     <w:name w:val="Intense Emphasis"/>
-    <w:basedOn w:val="Absatz-Standardschriftart"/>
+    <w:basedOn w:val="DefaultParagraphFont"/>
     <w:uiPriority w:val="21"/>
     <w:qFormat/>
     <w:rsid w:val="00080235"/>
@@ -2057,11 +2314,11 @@
       <w:color w:val="0F4761" w:themeColor="accent1" w:themeShade="BF"/>
     </w:rPr>
   </w:style>
-  <w:style w:type="paragraph" w:styleId="IntensivesZitat">
+  <w:style w:type="paragraph" w:styleId="IntenseQuote">
     <w:name w:val="Intense Quote"/>
-    <w:basedOn w:val="Standard"/>
-    <w:next w:val="Standard"/>
-    <w:link w:val="IntensivesZitatZchn"/>
+    <w:basedOn w:val="Normal"/>
+    <w:next w:val="Normal"/>
+    <w:link w:val="IntenseQuoteChar"/>
     <w:uiPriority w:val="30"/>
     <w:qFormat/>
     <w:rsid w:val="00080235"/>
@@ -2080,10 +2337,10 @@
       <w:color w:val="0F4761" w:themeColor="accent1" w:themeShade="BF"/>
     </w:rPr>
   </w:style>
-  <w:style w:type="character" w:customStyle="1" w:styleId="IntensivesZitatZchn">
-    <w:name w:val="Intensives Zitat Zchn"/>
-    <w:basedOn w:val="Absatz-Standardschriftart"/>
-    <w:link w:val="IntensivesZitat"/>
+  <w:style w:type="character" w:customStyle="1" w:styleId="IntenseQuoteChar">
+    <w:name w:val="Intense Quote Char"/>
+    <w:basedOn w:val="DefaultParagraphFont"/>
+    <w:link w:val="IntenseQuote"/>
     <w:uiPriority w:val="30"/>
     <w:rsid w:val="00080235"/>
     <w:rPr>
@@ -2092,9 +2349,9 @@
       <w:color w:val="0F4761" w:themeColor="accent1" w:themeShade="BF"/>
     </w:rPr>
   </w:style>
-  <w:style w:type="character" w:styleId="IntensiverVerweis">
+  <w:style w:type="character" w:styleId="IntenseReference">
     <w:name w:val="Intense Reference"/>
-    <w:basedOn w:val="Absatz-Standardschriftart"/>
+    <w:basedOn w:val="DefaultParagraphFont"/>
     <w:uiPriority w:val="32"/>
     <w:qFormat/>
     <w:rsid w:val="00080235"/>

</xml_diff>

<commit_message>
updated thesis overview plan
</commit_message>
<xml_diff>
--- a/Thesis Overview.docx
+++ b/Thesis Overview.docx
@@ -525,21 +525,7 @@
         <w:rPr>
           <w:lang w:val="en-US"/>
         </w:rPr>
-        <w:t xml:space="preserve">Available models for predistortion. Simple ones first – </w:t>
-      </w:r>
-      <w:proofErr w:type="gramStart"/>
-      <w:r>
-        <w:rPr>
-          <w:lang w:val="en-US"/>
-        </w:rPr>
-        <w:t>AM,AM</w:t>
-      </w:r>
-      <w:proofErr w:type="gramEnd"/>
-      <w:r>
-        <w:rPr>
-          <w:lang w:val="en-US"/>
-        </w:rPr>
-        <w:t xml:space="preserve"> conversion</w:t>
+        <w:t>Available models for predistortion. Simple ones first – AM,AM conversion</w:t>
       </w:r>
     </w:p>
     <w:p>
@@ -812,21 +798,7 @@
         <w:rPr>
           <w:lang w:val="en-US"/>
         </w:rPr>
-        <w:t xml:space="preserve"> functions to use time vector. Downmixing </w:t>
-      </w:r>
-      <w:proofErr w:type="gramStart"/>
-      <w:r>
-        <w:rPr>
-          <w:lang w:val="en-US"/>
-        </w:rPr>
-        <w:t>result</w:t>
-      </w:r>
-      <w:proofErr w:type="gramEnd"/>
-      <w:r>
-        <w:rPr>
-          <w:lang w:val="en-US"/>
-        </w:rPr>
-        <w:t xml:space="preserve"> should not be different for different sampling frequencies. You just have more frequency bins in between)</w:t>
+        <w:t xml:space="preserve"> functions to use time vector. Downmixing result should not be different for different sampling frequencies. You just have more frequency bins in between)</w:t>
       </w:r>
     </w:p>
     <w:p>
@@ -865,6 +837,84 @@
           <w:lang w:val="en-US"/>
         </w:rPr>
         <w:tab/>
+      </w:r>
+    </w:p>
+    <w:p>
+      <w:pPr>
+        <w:pStyle w:val="ListParagraph"/>
+        <w:rPr>
+          <w:lang w:val="en-US"/>
+        </w:rPr>
+      </w:pPr>
+      <w:r>
+        <w:rPr>
+          <w:lang w:val="en-US"/>
+        </w:rPr>
+        <w:t>More about modelling in general.</w:t>
+      </w:r>
+    </w:p>
+    <w:p>
+      <w:pPr>
+        <w:pStyle w:val="ListParagraph"/>
+        <w:numPr>
+          <w:ilvl w:val="0"/>
+          <w:numId w:val="5"/>
+        </w:numPr>
+        <w:rPr>
+          <w:lang w:val="en-US"/>
+        </w:rPr>
+      </w:pPr>
+      <w:r>
+        <w:rPr>
+          <w:lang w:val="en-US"/>
+        </w:rPr>
+        <w:t>Just take BB/IF signal envelope, ignore the frequency shift. Apply the base signal to the AM/AM AM/PM formulas.</w:t>
+      </w:r>
+    </w:p>
+    <w:p>
+      <w:pPr>
+        <w:pStyle w:val="ListParagraph"/>
+        <w:numPr>
+          <w:ilvl w:val="0"/>
+          <w:numId w:val="5"/>
+        </w:numPr>
+        <w:rPr>
+          <w:lang w:val="en-US"/>
+        </w:rPr>
+      </w:pPr>
+      <w:r>
+        <w:rPr>
+          <w:lang w:val="en-US"/>
+        </w:rPr>
+        <w:t xml:space="preserve">Create classes for each signal  with functions for modelling (passing fc, fs, </w:t>
+      </w:r>
+      <w:proofErr w:type="spellStart"/>
+      <w:r>
+        <w:rPr>
+          <w:lang w:val="en-US"/>
+        </w:rPr>
+        <w:t>etc</w:t>
+      </w:r>
+      <w:proofErr w:type="spellEnd"/>
+      <w:r>
+        <w:rPr>
+          <w:lang w:val="en-US"/>
+        </w:rPr>
+        <w:t xml:space="preserve"> as params). Label the x axis </w:t>
+      </w:r>
+      <w:proofErr w:type="spellStart"/>
+      <w:r>
+        <w:rPr>
+          <w:lang w:val="en-US"/>
+        </w:rPr>
+        <w:t>centred</w:t>
+      </w:r>
+      <w:proofErr w:type="spellEnd"/>
+      <w:r>
+        <w:rPr>
+          <w:lang w:val="en-US"/>
+        </w:rPr>
+        <w:t xml:space="preserve"> at fc. </w:t>
       </w:r>
     </w:p>
     <w:p>
@@ -1431,6 +1481,118 @@
       </w:rPr>
     </w:lvl>
   </w:abstractNum>
+  <w:abstractNum w:abstractNumId="4" w15:restartNumberingAfterBreak="0">
+    <w:nsid w:val="7F4845B1"/>
+    <w:multiLevelType w:val="hybridMultilevel"/>
+    <w:tmpl w:val="E034EFD4"/>
+    <w:lvl w:ilvl="0" w:tplc="177AE668">
+      <w:numFmt w:val="bullet"/>
+      <w:lvlText w:val="-"/>
+      <w:lvlJc w:val="left"/>
+      <w:pPr>
+        <w:ind w:left="1080" w:hanging="360"/>
+      </w:pPr>
+      <w:rPr>
+        <w:rFonts w:ascii="Aptos" w:eastAsiaTheme="minorHAnsi" w:hAnsi="Aptos" w:cstheme="minorBidi" w:hint="default"/>
+      </w:rPr>
+    </w:lvl>
+    <w:lvl w:ilvl="1" w:tplc="20000003" w:tentative="1">
+      <w:start w:val="1"/>
+      <w:numFmt w:val="bullet"/>
+      <w:lvlText w:val="o"/>
+      <w:lvlJc w:val="left"/>
+      <w:pPr>
+        <w:ind w:left="1800" w:hanging="360"/>
+      </w:pPr>
+      <w:rPr>
+        <w:rFonts w:ascii="Courier New" w:hAnsi="Courier New" w:cs="Courier New" w:hint="default"/>
+      </w:rPr>
+    </w:lvl>
+    <w:lvl w:ilvl="2" w:tplc="20000005" w:tentative="1">
+      <w:start w:val="1"/>
+      <w:numFmt w:val="bullet"/>
+      <w:lvlText w:val=""/>
+      <w:lvlJc w:val="left"/>
+      <w:pPr>
+        <w:ind w:left="2520" w:hanging="360"/>
+      </w:pPr>
+      <w:rPr>
+        <w:rFonts w:ascii="Wingdings" w:hAnsi="Wingdings" w:hint="default"/>
+      </w:rPr>
+    </w:lvl>
+    <w:lvl w:ilvl="3" w:tplc="20000001" w:tentative="1">
+      <w:start w:val="1"/>
+      <w:numFmt w:val="bullet"/>
+      <w:lvlText w:val=""/>
+      <w:lvlJc w:val="left"/>
+      <w:pPr>
+        <w:ind w:left="3240" w:hanging="360"/>
+      </w:pPr>
+      <w:rPr>
+        <w:rFonts w:ascii="Symbol" w:hAnsi="Symbol" w:hint="default"/>
+      </w:rPr>
+    </w:lvl>
+    <w:lvl w:ilvl="4" w:tplc="20000003" w:tentative="1">
+      <w:start w:val="1"/>
+      <w:numFmt w:val="bullet"/>
+      <w:lvlText w:val="o"/>
+      <w:lvlJc w:val="left"/>
+      <w:pPr>
+        <w:ind w:left="3960" w:hanging="360"/>
+      </w:pPr>
+      <w:rPr>
+        <w:rFonts w:ascii="Courier New" w:hAnsi="Courier New" w:cs="Courier New" w:hint="default"/>
+      </w:rPr>
+    </w:lvl>
+    <w:lvl w:ilvl="5" w:tplc="20000005" w:tentative="1">
+      <w:start w:val="1"/>
+      <w:numFmt w:val="bullet"/>
+      <w:lvlText w:val=""/>
+      <w:lvlJc w:val="left"/>
+      <w:pPr>
+        <w:ind w:left="4680" w:hanging="360"/>
+      </w:pPr>
+      <w:rPr>
+        <w:rFonts w:ascii="Wingdings" w:hAnsi="Wingdings" w:hint="default"/>
+      </w:rPr>
+    </w:lvl>
+    <w:lvl w:ilvl="6" w:tplc="20000001" w:tentative="1">
+      <w:start w:val="1"/>
+      <w:numFmt w:val="bullet"/>
+      <w:lvlText w:val=""/>
+      <w:lvlJc w:val="left"/>
+      <w:pPr>
+        <w:ind w:left="5400" w:hanging="360"/>
+      </w:pPr>
+      <w:rPr>
+        <w:rFonts w:ascii="Symbol" w:hAnsi="Symbol" w:hint="default"/>
+      </w:rPr>
+    </w:lvl>
+    <w:lvl w:ilvl="7" w:tplc="20000003" w:tentative="1">
+      <w:start w:val="1"/>
+      <w:numFmt w:val="bullet"/>
+      <w:lvlText w:val="o"/>
+      <w:lvlJc w:val="left"/>
+      <w:pPr>
+        <w:ind w:left="6120" w:hanging="360"/>
+      </w:pPr>
+      <w:rPr>
+        <w:rFonts w:ascii="Courier New" w:hAnsi="Courier New" w:cs="Courier New" w:hint="default"/>
+      </w:rPr>
+    </w:lvl>
+    <w:lvl w:ilvl="8" w:tplc="20000005" w:tentative="1">
+      <w:start w:val="1"/>
+      <w:numFmt w:val="bullet"/>
+      <w:lvlText w:val=""/>
+      <w:lvlJc w:val="left"/>
+      <w:pPr>
+        <w:ind w:left="6840" w:hanging="360"/>
+      </w:pPr>
+      <w:rPr>
+        <w:rFonts w:ascii="Wingdings" w:hAnsi="Wingdings" w:hint="default"/>
+      </w:rPr>
+    </w:lvl>
+  </w:abstractNum>
   <w:num w:numId="1" w16cid:durableId="573854964">
     <w:abstractNumId w:val="0"/>
   </w:num>
@@ -1442,6 +1604,9 @@
   </w:num>
   <w:num w:numId="4" w16cid:durableId="1783768072">
     <w:abstractNumId w:val="2"/>
+  </w:num>
+  <w:num w:numId="5" w16cid:durableId="1402942277">
+    <w:abstractNumId w:val="4"/>
   </w:num>
 </w:numbering>
 </file>

</xml_diff>

<commit_message>
restructured into sub classes and files
</commit_message>
<xml_diff>
--- a/Thesis Overview.docx
+++ b/Thesis Overview.docx
@@ -4,7 +4,7 @@
   <w:body>
     <w:p>
       <w:pPr>
-        <w:pStyle w:val="ListParagraph"/>
+        <w:pStyle w:val="Listenabsatz"/>
         <w:numPr>
           <w:ilvl w:val="0"/>
           <w:numId w:val="2"/>
@@ -22,7 +22,7 @@
     </w:p>
     <w:p>
       <w:pPr>
-        <w:pStyle w:val="ListParagraph"/>
+        <w:pStyle w:val="Listenabsatz"/>
         <w:rPr>
           <w:lang w:val="en-US"/>
         </w:rPr>
@@ -36,15 +36,15 @@
     </w:p>
     <w:p>
       <w:pPr>
-        <w:pStyle w:val="ListParagraph"/>
-        <w:rPr>
-          <w:lang w:val="en-US"/>
-        </w:rPr>
-      </w:pPr>
-    </w:p>
-    <w:p>
-      <w:pPr>
-        <w:pStyle w:val="ListParagraph"/>
+        <w:pStyle w:val="Listenabsatz"/>
+        <w:rPr>
+          <w:lang w:val="en-US"/>
+        </w:rPr>
+      </w:pPr>
+    </w:p>
+    <w:p>
+      <w:pPr>
+        <w:pStyle w:val="Listenabsatz"/>
         <w:rPr>
           <w:lang w:val="en-US"/>
         </w:rPr>
@@ -89,7 +89,21 @@
         <w:rPr>
           <w:lang w:val="en-US"/>
         </w:rPr>
-        <w:t xml:space="preserve"> at o/p (side lobes in freq), back into Rx, </w:t>
+        <w:t xml:space="preserve"> at o/p (side lobes in </w:t>
+      </w:r>
+      <w:proofErr w:type="spellStart"/>
+      <w:r>
+        <w:rPr>
+          <w:lang w:val="en-US"/>
+        </w:rPr>
+        <w:t>freq</w:t>
+      </w:r>
+      <w:proofErr w:type="spellEnd"/>
+      <w:r>
+        <w:rPr>
+          <w:lang w:val="en-US"/>
+        </w:rPr>
+        <w:t xml:space="preserve">), back into Rx, </w:t>
       </w:r>
       <w:r>
         <w:rPr>
@@ -106,7 +120,7 @@
     </w:p>
     <w:p>
       <w:pPr>
-        <w:pStyle w:val="ListParagraph"/>
+        <w:pStyle w:val="Listenabsatz"/>
         <w:rPr>
           <w:lang w:val="en-US"/>
         </w:rPr>
@@ -120,15 +134,15 @@
     </w:p>
     <w:p>
       <w:pPr>
-        <w:pStyle w:val="ListParagraph"/>
-        <w:rPr>
-          <w:lang w:val="en-US"/>
-        </w:rPr>
-      </w:pPr>
-    </w:p>
-    <w:p>
-      <w:pPr>
-        <w:pStyle w:val="ListParagraph"/>
+        <w:pStyle w:val="Listenabsatz"/>
+        <w:rPr>
+          <w:lang w:val="en-US"/>
+        </w:rPr>
+      </w:pPr>
+    </w:p>
+    <w:p>
+      <w:pPr>
+        <w:pStyle w:val="Listenabsatz"/>
         <w:rPr>
           <w:lang w:val="en-US"/>
         </w:rPr>
@@ -154,7 +168,7 @@
     </w:p>
     <w:p>
       <w:pPr>
-        <w:pStyle w:val="ListParagraph"/>
+        <w:pStyle w:val="Listenabsatz"/>
         <w:rPr>
           <w:lang w:val="en-US"/>
         </w:rPr>
@@ -187,15 +201,15 @@
     </w:p>
     <w:p>
       <w:pPr>
-        <w:pStyle w:val="ListParagraph"/>
-        <w:rPr>
-          <w:lang w:val="en-US"/>
-        </w:rPr>
-      </w:pPr>
-    </w:p>
-    <w:p>
-      <w:pPr>
-        <w:pStyle w:val="ListParagraph"/>
+        <w:pStyle w:val="Listenabsatz"/>
+        <w:rPr>
+          <w:lang w:val="en-US"/>
+        </w:rPr>
+      </w:pPr>
+    </w:p>
+    <w:p>
+      <w:pPr>
+        <w:pStyle w:val="Listenabsatz"/>
         <w:numPr>
           <w:ilvl w:val="0"/>
           <w:numId w:val="2"/>
@@ -213,7 +227,7 @@
     </w:p>
     <w:p>
       <w:pPr>
-        <w:pStyle w:val="ListParagraph"/>
+        <w:pStyle w:val="Listenabsatz"/>
         <w:rPr>
           <w:lang w:val="en-US"/>
         </w:rPr>
@@ -234,7 +248,7 @@
     </w:p>
     <w:p>
       <w:pPr>
-        <w:pStyle w:val="ListParagraph"/>
+        <w:pStyle w:val="Listenabsatz"/>
         <w:numPr>
           <w:ilvl w:val="0"/>
           <w:numId w:val="2"/>
@@ -252,7 +266,7 @@
     </w:p>
     <w:p>
       <w:pPr>
-        <w:pStyle w:val="ListParagraph"/>
+        <w:pStyle w:val="Listenabsatz"/>
         <w:rPr>
           <w:lang w:val="en-US"/>
         </w:rPr>
@@ -278,7 +292,7 @@
     </w:p>
     <w:p>
       <w:pPr>
-        <w:pStyle w:val="ListParagraph"/>
+        <w:pStyle w:val="Listenabsatz"/>
         <w:rPr>
           <w:lang w:val="en-US"/>
         </w:rPr>
@@ -292,7 +306,7 @@
     </w:p>
     <w:p>
       <w:pPr>
-        <w:pStyle w:val="ListParagraph"/>
+        <w:pStyle w:val="Listenabsatz"/>
         <w:rPr>
           <w:lang w:val="en-US"/>
         </w:rPr>
@@ -306,15 +320,15 @@
     </w:p>
     <w:p>
       <w:pPr>
-        <w:pStyle w:val="ListParagraph"/>
-        <w:rPr>
-          <w:lang w:val="en-US"/>
-        </w:rPr>
-      </w:pPr>
-    </w:p>
-    <w:p>
-      <w:pPr>
-        <w:pStyle w:val="ListParagraph"/>
+        <w:pStyle w:val="Listenabsatz"/>
+        <w:rPr>
+          <w:lang w:val="en-US"/>
+        </w:rPr>
+      </w:pPr>
+    </w:p>
+    <w:p>
+      <w:pPr>
+        <w:pStyle w:val="Listenabsatz"/>
         <w:numPr>
           <w:ilvl w:val="0"/>
           <w:numId w:val="2"/>
@@ -332,7 +346,7 @@
     </w:p>
     <w:p>
       <w:pPr>
-        <w:pStyle w:val="ListParagraph"/>
+        <w:pStyle w:val="Listenabsatz"/>
         <w:rPr>
           <w:lang w:val="en-US"/>
         </w:rPr>
@@ -346,21 +360,35 @@
     </w:p>
     <w:p>
       <w:pPr>
-        <w:pStyle w:val="ListParagraph"/>
-        <w:rPr>
-          <w:lang w:val="en-US"/>
-        </w:rPr>
-      </w:pPr>
-      <w:r>
-        <w:rPr>
-          <w:lang w:val="en-US"/>
-        </w:rPr>
-        <w:t>Open loop – i/p changes depending on what we measure at o/p</w:t>
-      </w:r>
-    </w:p>
-    <w:p>
-      <w:pPr>
-        <w:pStyle w:val="ListParagraph"/>
+        <w:pStyle w:val="Listenabsatz"/>
+        <w:rPr>
+          <w:lang w:val="en-US"/>
+        </w:rPr>
+      </w:pPr>
+      <w:r>
+        <w:rPr>
+          <w:lang w:val="en-US"/>
+        </w:rPr>
+        <w:t xml:space="preserve">Open loop – </w:t>
+      </w:r>
+      <w:proofErr w:type="spellStart"/>
+      <w:r>
+        <w:rPr>
+          <w:lang w:val="en-US"/>
+        </w:rPr>
+        <w:t>i</w:t>
+      </w:r>
+      <w:proofErr w:type="spellEnd"/>
+      <w:r>
+        <w:rPr>
+          <w:lang w:val="en-US"/>
+        </w:rPr>
+        <w:t>/p changes depending on what we measure at o/p</w:t>
+      </w:r>
+    </w:p>
+    <w:p>
+      <w:pPr>
+        <w:pStyle w:val="Listenabsatz"/>
         <w:rPr>
           <w:lang w:val="en-US"/>
         </w:rPr>
@@ -374,7 +402,7 @@
     </w:p>
     <w:p>
       <w:pPr>
-        <w:pStyle w:val="ListParagraph"/>
+        <w:pStyle w:val="Listenabsatz"/>
         <w:rPr>
           <w:lang w:val="en-US"/>
         </w:rPr>
@@ -388,7 +416,7 @@
     </w:p>
     <w:p>
       <w:pPr>
-        <w:pStyle w:val="ListParagraph"/>
+        <w:pStyle w:val="Listenabsatz"/>
         <w:rPr>
           <w:lang w:val="en-US"/>
         </w:rPr>
@@ -402,15 +430,15 @@
     </w:p>
     <w:p>
       <w:pPr>
-        <w:pStyle w:val="ListParagraph"/>
-        <w:rPr>
-          <w:lang w:val="en-US"/>
-        </w:rPr>
-      </w:pPr>
-    </w:p>
-    <w:p>
-      <w:pPr>
-        <w:pStyle w:val="ListParagraph"/>
+        <w:pStyle w:val="Listenabsatz"/>
+        <w:rPr>
+          <w:lang w:val="en-US"/>
+        </w:rPr>
+      </w:pPr>
+    </w:p>
+    <w:p>
+      <w:pPr>
+        <w:pStyle w:val="Listenabsatz"/>
         <w:rPr>
           <w:lang w:val="en-US"/>
         </w:rPr>
@@ -424,7 +452,7 @@
     </w:p>
     <w:p>
       <w:pPr>
-        <w:pStyle w:val="ListParagraph"/>
+        <w:pStyle w:val="Listenabsatz"/>
         <w:rPr>
           <w:lang w:val="en-US"/>
         </w:rPr>
@@ -438,7 +466,7 @@
     </w:p>
     <w:p>
       <w:pPr>
-        <w:pStyle w:val="ListParagraph"/>
+        <w:pStyle w:val="Listenabsatz"/>
         <w:rPr>
           <w:lang w:val="en-US"/>
         </w:rPr>
@@ -452,17 +480,25 @@
     </w:p>
     <w:p>
       <w:pPr>
-        <w:pStyle w:val="ListParagraph"/>
-        <w:rPr>
-          <w:lang w:val="en-US"/>
-        </w:rPr>
-      </w:pPr>
-      <w:r>
-        <w:rPr>
-          <w:lang w:val="en-US"/>
-        </w:rPr>
-        <w:t>Settings.xml parametres</w:t>
-      </w:r>
+        <w:pStyle w:val="Listenabsatz"/>
+        <w:rPr>
+          <w:lang w:val="en-US"/>
+        </w:rPr>
+      </w:pPr>
+      <w:r>
+        <w:rPr>
+          <w:lang w:val="en-US"/>
+        </w:rPr>
+        <w:t xml:space="preserve">Settings.xml </w:t>
+      </w:r>
+      <w:proofErr w:type="spellStart"/>
+      <w:r>
+        <w:rPr>
+          <w:lang w:val="en-US"/>
+        </w:rPr>
+        <w:t>parametres</w:t>
+      </w:r>
+      <w:proofErr w:type="spellEnd"/>
       <w:r>
         <w:rPr>
           <w:lang w:val="en-US"/>
@@ -472,15 +508,15 @@
     </w:p>
     <w:p>
       <w:pPr>
-        <w:pStyle w:val="ListParagraph"/>
-        <w:rPr>
-          <w:lang w:val="en-US"/>
-        </w:rPr>
-      </w:pPr>
-    </w:p>
-    <w:p>
-      <w:pPr>
-        <w:pStyle w:val="ListParagraph"/>
+        <w:pStyle w:val="Listenabsatz"/>
+        <w:rPr>
+          <w:lang w:val="en-US"/>
+        </w:rPr>
+      </w:pPr>
+    </w:p>
+    <w:p>
+      <w:pPr>
+        <w:pStyle w:val="Listenabsatz"/>
         <w:rPr>
           <w:lang w:val="en-US"/>
         </w:rPr>
@@ -494,7 +530,7 @@
     </w:p>
     <w:p>
       <w:pPr>
-        <w:pStyle w:val="ListParagraph"/>
+        <w:pStyle w:val="Listenabsatz"/>
         <w:rPr>
           <w:lang w:val="en-US"/>
         </w:rPr>
@@ -508,7 +544,7 @@
     </w:p>
     <w:p>
       <w:pPr>
-        <w:pStyle w:val="ListParagraph"/>
+        <w:pStyle w:val="Listenabsatz"/>
         <w:rPr>
           <w:lang w:val="en-US"/>
         </w:rPr>
@@ -522,15 +558,15 @@
     </w:p>
     <w:p>
       <w:pPr>
-        <w:pStyle w:val="ListParagraph"/>
-        <w:rPr>
-          <w:lang w:val="en-US"/>
-        </w:rPr>
-      </w:pPr>
-    </w:p>
-    <w:p>
-      <w:pPr>
-        <w:pStyle w:val="ListParagraph"/>
+        <w:pStyle w:val="Listenabsatz"/>
+        <w:rPr>
+          <w:lang w:val="en-US"/>
+        </w:rPr>
+      </w:pPr>
+    </w:p>
+    <w:p>
+      <w:pPr>
+        <w:pStyle w:val="Listenabsatz"/>
         <w:rPr>
           <w:lang w:val="en-US"/>
         </w:rPr>
@@ -568,7 +604,7 @@
     </w:p>
     <w:p>
       <w:pPr>
-        <w:pStyle w:val="ListParagraph"/>
+        <w:pStyle w:val="Listenabsatz"/>
         <w:rPr>
           <w:lang w:val="en-US"/>
         </w:rPr>
@@ -588,15 +624,15 @@
     </w:p>
     <w:p>
       <w:pPr>
-        <w:pStyle w:val="ListParagraph"/>
-        <w:rPr>
-          <w:lang w:val="en-US"/>
-        </w:rPr>
-      </w:pPr>
-    </w:p>
-    <w:p>
-      <w:pPr>
-        <w:pStyle w:val="ListParagraph"/>
+        <w:pStyle w:val="Listenabsatz"/>
+        <w:rPr>
+          <w:lang w:val="en-US"/>
+        </w:rPr>
+      </w:pPr>
+    </w:p>
+    <w:p>
+      <w:pPr>
+        <w:pStyle w:val="Listenabsatz"/>
         <w:rPr>
           <w:lang w:val="en-US"/>
         </w:rPr>
@@ -610,7 +646,7 @@
     </w:p>
     <w:p>
       <w:pPr>
-        <w:pStyle w:val="ListParagraph"/>
+        <w:pStyle w:val="Listenabsatz"/>
         <w:rPr>
           <w:lang w:val="en-US"/>
         </w:rPr>
@@ -625,15 +661,15 @@
     </w:p>
     <w:p>
       <w:pPr>
-        <w:pStyle w:val="ListParagraph"/>
-        <w:rPr>
-          <w:lang w:val="en-US"/>
-        </w:rPr>
-      </w:pPr>
-    </w:p>
-    <w:p>
-      <w:pPr>
-        <w:pStyle w:val="ListParagraph"/>
+        <w:pStyle w:val="Listenabsatz"/>
+        <w:rPr>
+          <w:lang w:val="en-US"/>
+        </w:rPr>
+      </w:pPr>
+    </w:p>
+    <w:p>
+      <w:pPr>
+        <w:pStyle w:val="Listenabsatz"/>
         <w:rPr>
           <w:u w:val="single"/>
           <w:lang w:val="en-US"/>
@@ -649,7 +685,7 @@
     </w:p>
     <w:p>
       <w:pPr>
-        <w:pStyle w:val="ListParagraph"/>
+        <w:pStyle w:val="Listenabsatz"/>
         <w:rPr>
           <w:lang w:val="en-US"/>
         </w:rPr>
@@ -663,7 +699,7 @@
     </w:p>
     <w:p>
       <w:pPr>
-        <w:pStyle w:val="ListParagraph"/>
+        <w:pStyle w:val="Listenabsatz"/>
         <w:rPr>
           <w:lang w:val="en-US"/>
         </w:rPr>
@@ -677,21 +713,35 @@
     </w:p>
     <w:p>
       <w:pPr>
-        <w:pStyle w:val="ListParagraph"/>
-        <w:rPr>
-          <w:lang w:val="en-US"/>
-        </w:rPr>
-      </w:pPr>
-      <w:r>
-        <w:rPr>
-          <w:lang w:val="en-US"/>
-        </w:rPr>
-        <w:t>Look at other filters (and components) in FEC Commissioning Doc and see if you need to incorporate them too (e.g. harmonic filter, IF complex filter etc)</w:t>
-      </w:r>
-    </w:p>
-    <w:p>
-      <w:pPr>
-        <w:pStyle w:val="ListParagraph"/>
+        <w:pStyle w:val="Listenabsatz"/>
+        <w:rPr>
+          <w:lang w:val="en-US"/>
+        </w:rPr>
+      </w:pPr>
+      <w:r>
+        <w:rPr>
+          <w:lang w:val="en-US"/>
+        </w:rPr>
+        <w:t xml:space="preserve">Look at other filters (and components) in FEC Commissioning Doc and see if you need to incorporate them too (e.g. harmonic filter, IF complex filter </w:t>
+      </w:r>
+      <w:proofErr w:type="spellStart"/>
+      <w:r>
+        <w:rPr>
+          <w:lang w:val="en-US"/>
+        </w:rPr>
+        <w:t>etc</w:t>
+      </w:r>
+      <w:proofErr w:type="spellEnd"/>
+      <w:r>
+        <w:rPr>
+          <w:lang w:val="en-US"/>
+        </w:rPr>
+        <w:t>)</w:t>
+      </w:r>
+    </w:p>
+    <w:p>
+      <w:pPr>
+        <w:pStyle w:val="Listenabsatz"/>
         <w:rPr>
           <w:lang w:val="en-US"/>
         </w:rPr>
@@ -721,7 +771,7 @@
     </w:p>
     <w:p>
       <w:pPr>
-        <w:pStyle w:val="ListParagraph"/>
+        <w:pStyle w:val="Listenabsatz"/>
         <w:numPr>
           <w:ilvl w:val="0"/>
           <w:numId w:val="4"/>
@@ -734,12 +784,26 @@
         <w:rPr>
           <w:lang w:val="en-US"/>
         </w:rPr>
-        <w:t>Create full Tx/Rx chain for your understanding (also change up/downconversion functions to use time vector. Downmixing result should not be different for different sampling frequencies. You just have more frequency bins in between)</w:t>
-      </w:r>
-    </w:p>
-    <w:p>
-      <w:pPr>
-        <w:pStyle w:val="ListParagraph"/>
+        <w:t>Create full Tx/Rx chain for your understanding (also change up/</w:t>
+      </w:r>
+      <w:proofErr w:type="spellStart"/>
+      <w:r>
+        <w:rPr>
+          <w:lang w:val="en-US"/>
+        </w:rPr>
+        <w:t>downconversion</w:t>
+      </w:r>
+      <w:proofErr w:type="spellEnd"/>
+      <w:r>
+        <w:rPr>
+          <w:lang w:val="en-US"/>
+        </w:rPr>
+        <w:t xml:space="preserve"> functions to use time vector. Downmixing result should not be different for different sampling frequencies. You just have more frequency bins in between)</w:t>
+      </w:r>
+    </w:p>
+    <w:p>
+      <w:pPr>
+        <w:pStyle w:val="Listenabsatz"/>
         <w:numPr>
           <w:ilvl w:val="0"/>
           <w:numId w:val="4"/>
@@ -752,48 +816,26 @@
         <w:rPr>
           <w:lang w:val="en-US"/>
         </w:rPr>
-        <w:t xml:space="preserve">Create signal superclass (fs, samples) with functions get_time_samples() -&gt; (t, samples) and </w:t>
-      </w:r>
-      <w:r>
-        <w:rPr>
-          <w:lang w:val="en-US"/>
-        </w:rPr>
-        <w:t>get_</w:t>
-      </w:r>
-      <w:r>
-        <w:rPr>
-          <w:lang w:val="en-US"/>
-        </w:rPr>
-        <w:t>freq</w:t>
-      </w:r>
-      <w:r>
-        <w:rPr>
-          <w:lang w:val="en-US"/>
-        </w:rPr>
-        <w:t>_samples() -&gt; (</w:t>
-      </w:r>
-      <w:r>
-        <w:rPr>
-          <w:lang w:val="en-US"/>
-        </w:rPr>
-        <w:t>f</w:t>
-      </w:r>
-      <w:r>
-        <w:rPr>
-          <w:lang w:val="en-US"/>
-        </w:rPr>
-        <w:t>, samples)</w:t>
-      </w:r>
-      <w:r>
-        <w:rPr>
-          <w:lang w:val="en-US"/>
-        </w:rPr>
-        <w:t>, with pulse subclass (init_pulse(bandwidth, kaiser_beta etc))</w:t>
-      </w:r>
-    </w:p>
-    <w:p>
-      <w:pPr>
-        <w:pStyle w:val="ListParagraph"/>
+        <w:t xml:space="preserve">May need to sample convert to a higher sample rate when going from digital to analogue (10x the bandwidth or whatever Claude said) -  because </w:t>
+      </w:r>
+      <w:proofErr w:type="spellStart"/>
+      <w:r>
+        <w:rPr>
+          <w:lang w:val="en-US"/>
+        </w:rPr>
+        <w:t>non linear</w:t>
+      </w:r>
+      <w:proofErr w:type="spellEnd"/>
+      <w:r>
+        <w:rPr>
+          <w:lang w:val="en-US"/>
+        </w:rPr>
+        <w:t xml:space="preserve"> components may introduce big changes in between samples, that are not captured by a lower sample rate</w:t>
+      </w:r>
+    </w:p>
+    <w:p>
+      <w:pPr>
+        <w:pStyle w:val="Listenabsatz"/>
         <w:numPr>
           <w:ilvl w:val="0"/>
           <w:numId w:val="4"/>
@@ -806,12 +848,18 @@
         <w:rPr>
           <w:lang w:val="en-US"/>
         </w:rPr>
-        <w:t>May need to sample convert to a higher sample rate when going from digital to analogue (10x the bandwidth or whatever Claude said) -  because non linear components may introduce big changes in between samples, that are not captured by a lower sample rate</w:t>
-      </w:r>
-    </w:p>
-    <w:p>
-      <w:pPr>
-        <w:pStyle w:val="ListParagraph"/>
+        <w:t>Label pulse compression axis</w:t>
+      </w:r>
+      <w:r>
+        <w:rPr>
+          <w:lang w:val="en-US"/>
+        </w:rPr>
+        <w:t xml:space="preserve"> </w:t>
+      </w:r>
+    </w:p>
+    <w:p>
+      <w:pPr>
+        <w:pStyle w:val="Listenabsatz"/>
         <w:numPr>
           <w:ilvl w:val="0"/>
           <w:numId w:val="4"/>
@@ -824,12 +872,25 @@
         <w:rPr>
           <w:lang w:val="en-US"/>
         </w:rPr>
-        <w:t>Pulse compression is not necessarily MF but google it</w:t>
-      </w:r>
-    </w:p>
-    <w:p>
-      <w:pPr>
-        <w:pStyle w:val="ListParagraph"/>
+        <w:t>Implement filter (Rx IF FEC 10</w:t>
+      </w:r>
+      <w:r>
+        <w:rPr>
+          <w:vertAlign w:val="superscript"/>
+          <w:lang w:val="en-US"/>
+        </w:rPr>
+        <w:t>th</w:t>
+      </w:r>
+      <w:r>
+        <w:rPr>
+          <w:lang w:val="en-US"/>
+        </w:rPr>
+        <w:t xml:space="preserve"> order) – should remove the mirror frequency. Aleksei sent the simulation results.</w:t>
+      </w:r>
+    </w:p>
+    <w:p>
+      <w:pPr>
+        <w:pStyle w:val="Listenabsatz"/>
         <w:numPr>
           <w:ilvl w:val="0"/>
           <w:numId w:val="4"/>
@@ -842,61 +903,6 @@
         <w:rPr>
           <w:lang w:val="en-US"/>
         </w:rPr>
-        <w:t xml:space="preserve">Label pulse compression axis, also time should be (s) not [s] </w:t>
-      </w:r>
-      <w:r>
-        <w:rPr>
-          <w:lang w:val="en-US"/>
-        </w:rPr>
-        <w:t xml:space="preserve"> </w:t>
-      </w:r>
-    </w:p>
-    <w:p>
-      <w:pPr>
-        <w:pStyle w:val="ListParagraph"/>
-        <w:numPr>
-          <w:ilvl w:val="0"/>
-          <w:numId w:val="4"/>
-        </w:numPr>
-        <w:rPr>
-          <w:lang w:val="en-US"/>
-        </w:rPr>
-      </w:pPr>
-      <w:r>
-        <w:rPr>
-          <w:lang w:val="en-US"/>
-        </w:rPr>
-        <w:t>Implement filter (Rx IF FEC 10</w:t>
-      </w:r>
-      <w:r>
-        <w:rPr>
-          <w:vertAlign w:val="superscript"/>
-          <w:lang w:val="en-US"/>
-        </w:rPr>
-        <w:t>th</w:t>
-      </w:r>
-      <w:r>
-        <w:rPr>
-          <w:lang w:val="en-US"/>
-        </w:rPr>
-        <w:t xml:space="preserve"> order) – should remove the mirror frequency. Aleksei sent the simulation results.</w:t>
-      </w:r>
-    </w:p>
-    <w:p>
-      <w:pPr>
-        <w:pStyle w:val="ListParagraph"/>
-        <w:numPr>
-          <w:ilvl w:val="0"/>
-          <w:numId w:val="4"/>
-        </w:numPr>
-        <w:rPr>
-          <w:lang w:val="en-US"/>
-        </w:rPr>
-      </w:pPr>
-      <w:r>
-        <w:rPr>
-          <w:lang w:val="en-US"/>
-        </w:rPr>
         <w:t xml:space="preserve">Check literature to see what the waves should look like (side lobe height factors expected </w:t>
       </w:r>
       <w:r>
@@ -905,40 +911,48 @@
         </w:rPr>
         <w:t xml:space="preserve">e.g. 15dB </w:t>
       </w:r>
-      <w:r>
-        <w:rPr>
-          <w:lang w:val="en-US"/>
-        </w:rPr>
-        <w:t>etc)</w:t>
-      </w:r>
-    </w:p>
-    <w:p>
-      <w:pPr>
-        <w:pStyle w:val="ListParagraph"/>
-        <w:rPr>
-          <w:lang w:val="en-US"/>
-        </w:rPr>
-      </w:pPr>
-    </w:p>
-    <w:p>
-      <w:pPr>
-        <w:pStyle w:val="ListParagraph"/>
-        <w:rPr>
-          <w:lang w:val="en-US"/>
-        </w:rPr>
-      </w:pPr>
-    </w:p>
-    <w:p>
-      <w:pPr>
-        <w:pStyle w:val="ListParagraph"/>
-        <w:rPr>
-          <w:lang w:val="en-US"/>
-        </w:rPr>
-      </w:pPr>
-    </w:p>
-    <w:p>
-      <w:pPr>
-        <w:pStyle w:val="ListParagraph"/>
+      <w:proofErr w:type="spellStart"/>
+      <w:r>
+        <w:rPr>
+          <w:lang w:val="en-US"/>
+        </w:rPr>
+        <w:t>etc</w:t>
+      </w:r>
+      <w:proofErr w:type="spellEnd"/>
+      <w:r>
+        <w:rPr>
+          <w:lang w:val="en-US"/>
+        </w:rPr>
+        <w:t>)</w:t>
+      </w:r>
+    </w:p>
+    <w:p>
+      <w:pPr>
+        <w:pStyle w:val="Listenabsatz"/>
+        <w:rPr>
+          <w:lang w:val="en-US"/>
+        </w:rPr>
+      </w:pPr>
+    </w:p>
+    <w:p>
+      <w:pPr>
+        <w:pStyle w:val="Listenabsatz"/>
+        <w:rPr>
+          <w:lang w:val="en-US"/>
+        </w:rPr>
+      </w:pPr>
+    </w:p>
+    <w:p>
+      <w:pPr>
+        <w:pStyle w:val="Listenabsatz"/>
+        <w:rPr>
+          <w:lang w:val="en-US"/>
+        </w:rPr>
+      </w:pPr>
+    </w:p>
+    <w:p>
+      <w:pPr>
+        <w:pStyle w:val="Listenabsatz"/>
         <w:rPr>
           <w:lang w:val="en-US"/>
         </w:rPr>
@@ -1546,7 +1560,7 @@
         <w:kern w:val="2"/>
         <w:sz w:val="24"/>
         <w:szCs w:val="24"/>
-        <w:lang w:val="en-DE" w:eastAsia="en-US" w:bidi="ar-SA"/>
+        <w:lang w:eastAsia="en-US" w:bidi="ar-SA"/>
         <w14:ligatures w14:val="standardContextual"/>
       </w:rPr>
     </w:rPrDefault>
@@ -1934,15 +1948,15 @@
     <w:lsdException w:name="Unresolved Mention" w:semiHidden="1" w:unhideWhenUsed="1"/>
     <w:lsdException w:name="Smart Link" w:semiHidden="1" w:unhideWhenUsed="1"/>
   </w:latentStyles>
-  <w:style w:type="paragraph" w:default="1" w:styleId="Normal">
+  <w:style w:type="paragraph" w:default="1" w:styleId="Standard">
     <w:name w:val="Normal"/>
     <w:qFormat/>
   </w:style>
-  <w:style w:type="paragraph" w:styleId="Heading1">
+  <w:style w:type="paragraph" w:styleId="berschrift1">
     <w:name w:val="heading 1"/>
-    <w:basedOn w:val="Normal"/>
-    <w:next w:val="Normal"/>
-    <w:link w:val="Heading1Char"/>
+    <w:basedOn w:val="Standard"/>
+    <w:next w:val="Standard"/>
+    <w:link w:val="berschrift1Zchn"/>
     <w:uiPriority w:val="9"/>
     <w:qFormat/>
     <w:rsid w:val="00080235"/>
@@ -1959,11 +1973,11 @@
       <w:szCs w:val="40"/>
     </w:rPr>
   </w:style>
-  <w:style w:type="paragraph" w:styleId="Heading2">
+  <w:style w:type="paragraph" w:styleId="berschrift2">
     <w:name w:val="heading 2"/>
-    <w:basedOn w:val="Normal"/>
-    <w:next w:val="Normal"/>
-    <w:link w:val="Heading2Char"/>
+    <w:basedOn w:val="Standard"/>
+    <w:next w:val="Standard"/>
+    <w:link w:val="berschrift2Zchn"/>
     <w:uiPriority w:val="9"/>
     <w:semiHidden/>
     <w:unhideWhenUsed/>
@@ -1982,11 +1996,11 @@
       <w:szCs w:val="32"/>
     </w:rPr>
   </w:style>
-  <w:style w:type="paragraph" w:styleId="Heading3">
+  <w:style w:type="paragraph" w:styleId="berschrift3">
     <w:name w:val="heading 3"/>
-    <w:basedOn w:val="Normal"/>
-    <w:next w:val="Normal"/>
-    <w:link w:val="Heading3Char"/>
+    <w:basedOn w:val="Standard"/>
+    <w:next w:val="Standard"/>
+    <w:link w:val="berschrift3Zchn"/>
     <w:uiPriority w:val="9"/>
     <w:semiHidden/>
     <w:unhideWhenUsed/>
@@ -2005,11 +2019,11 @@
       <w:szCs w:val="28"/>
     </w:rPr>
   </w:style>
-  <w:style w:type="paragraph" w:styleId="Heading4">
+  <w:style w:type="paragraph" w:styleId="berschrift4">
     <w:name w:val="heading 4"/>
-    <w:basedOn w:val="Normal"/>
-    <w:next w:val="Normal"/>
-    <w:link w:val="Heading4Char"/>
+    <w:basedOn w:val="Standard"/>
+    <w:next w:val="Standard"/>
+    <w:link w:val="berschrift4Zchn"/>
     <w:uiPriority w:val="9"/>
     <w:semiHidden/>
     <w:unhideWhenUsed/>
@@ -2028,11 +2042,11 @@
       <w:color w:val="0F4761" w:themeColor="accent1" w:themeShade="BF"/>
     </w:rPr>
   </w:style>
-  <w:style w:type="paragraph" w:styleId="Heading5">
+  <w:style w:type="paragraph" w:styleId="berschrift5">
     <w:name w:val="heading 5"/>
-    <w:basedOn w:val="Normal"/>
-    <w:next w:val="Normal"/>
-    <w:link w:val="Heading5Char"/>
+    <w:basedOn w:val="Standard"/>
+    <w:next w:val="Standard"/>
+    <w:link w:val="berschrift5Zchn"/>
     <w:uiPriority w:val="9"/>
     <w:semiHidden/>
     <w:unhideWhenUsed/>
@@ -2049,11 +2063,11 @@
       <w:color w:val="0F4761" w:themeColor="accent1" w:themeShade="BF"/>
     </w:rPr>
   </w:style>
-  <w:style w:type="paragraph" w:styleId="Heading6">
+  <w:style w:type="paragraph" w:styleId="berschrift6">
     <w:name w:val="heading 6"/>
-    <w:basedOn w:val="Normal"/>
-    <w:next w:val="Normal"/>
-    <w:link w:val="Heading6Char"/>
+    <w:basedOn w:val="Standard"/>
+    <w:next w:val="Standard"/>
+    <w:link w:val="berschrift6Zchn"/>
     <w:uiPriority w:val="9"/>
     <w:semiHidden/>
     <w:unhideWhenUsed/>
@@ -2072,11 +2086,11 @@
       <w:color w:val="595959" w:themeColor="text1" w:themeTint="A6"/>
     </w:rPr>
   </w:style>
-  <w:style w:type="paragraph" w:styleId="Heading7">
+  <w:style w:type="paragraph" w:styleId="berschrift7">
     <w:name w:val="heading 7"/>
-    <w:basedOn w:val="Normal"/>
-    <w:next w:val="Normal"/>
-    <w:link w:val="Heading7Char"/>
+    <w:basedOn w:val="Standard"/>
+    <w:next w:val="Standard"/>
+    <w:link w:val="berschrift7Zchn"/>
     <w:uiPriority w:val="9"/>
     <w:semiHidden/>
     <w:unhideWhenUsed/>
@@ -2093,11 +2107,11 @@
       <w:color w:val="595959" w:themeColor="text1" w:themeTint="A6"/>
     </w:rPr>
   </w:style>
-  <w:style w:type="paragraph" w:styleId="Heading8">
+  <w:style w:type="paragraph" w:styleId="berschrift8">
     <w:name w:val="heading 8"/>
-    <w:basedOn w:val="Normal"/>
-    <w:next w:val="Normal"/>
-    <w:link w:val="Heading8Char"/>
+    <w:basedOn w:val="Standard"/>
+    <w:next w:val="Standard"/>
+    <w:link w:val="berschrift8Zchn"/>
     <w:uiPriority w:val="9"/>
     <w:semiHidden/>
     <w:unhideWhenUsed/>
@@ -2116,11 +2130,11 @@
       <w:color w:val="272727" w:themeColor="text1" w:themeTint="D8"/>
     </w:rPr>
   </w:style>
-  <w:style w:type="paragraph" w:styleId="Heading9">
+  <w:style w:type="paragraph" w:styleId="berschrift9">
     <w:name w:val="heading 9"/>
-    <w:basedOn w:val="Normal"/>
-    <w:next w:val="Normal"/>
-    <w:link w:val="Heading9Char"/>
+    <w:basedOn w:val="Standard"/>
+    <w:next w:val="Standard"/>
+    <w:link w:val="berschrift9Zchn"/>
     <w:uiPriority w:val="9"/>
     <w:semiHidden/>
     <w:unhideWhenUsed/>
@@ -2137,13 +2151,13 @@
       <w:color w:val="272727" w:themeColor="text1" w:themeTint="D8"/>
     </w:rPr>
   </w:style>
-  <w:style w:type="character" w:default="1" w:styleId="DefaultParagraphFont">
+  <w:style w:type="character" w:default="1" w:styleId="Absatz-Standardschriftart">
     <w:name w:val="Default Paragraph Font"/>
     <w:uiPriority w:val="1"/>
     <w:semiHidden/>
     <w:unhideWhenUsed/>
   </w:style>
-  <w:style w:type="table" w:default="1" w:styleId="TableNormal">
+  <w:style w:type="table" w:default="1" w:styleId="NormaleTabelle">
     <w:name w:val="Normal Table"/>
     <w:uiPriority w:val="99"/>
     <w:semiHidden/>
@@ -2158,16 +2172,16 @@
       </w:tblCellMar>
     </w:tblPr>
   </w:style>
-  <w:style w:type="numbering" w:default="1" w:styleId="NoList">
+  <w:style w:type="numbering" w:default="1" w:styleId="KeineListe">
     <w:name w:val="No List"/>
     <w:uiPriority w:val="99"/>
     <w:semiHidden/>
     <w:unhideWhenUsed/>
   </w:style>
-  <w:style w:type="character" w:customStyle="1" w:styleId="Heading1Char">
-    <w:name w:val="Heading 1 Char"/>
-    <w:basedOn w:val="DefaultParagraphFont"/>
-    <w:link w:val="Heading1"/>
+  <w:style w:type="character" w:customStyle="1" w:styleId="berschrift1Zchn">
+    <w:name w:val="Überschrift 1 Zchn"/>
+    <w:basedOn w:val="Absatz-Standardschriftart"/>
+    <w:link w:val="berschrift1"/>
     <w:uiPriority w:val="9"/>
     <w:rsid w:val="00080235"/>
     <w:rPr>
@@ -2177,10 +2191,10 @@
       <w:szCs w:val="40"/>
     </w:rPr>
   </w:style>
-  <w:style w:type="character" w:customStyle="1" w:styleId="Heading2Char">
-    <w:name w:val="Heading 2 Char"/>
-    <w:basedOn w:val="DefaultParagraphFont"/>
-    <w:link w:val="Heading2"/>
+  <w:style w:type="character" w:customStyle="1" w:styleId="berschrift2Zchn">
+    <w:name w:val="Überschrift 2 Zchn"/>
+    <w:basedOn w:val="Absatz-Standardschriftart"/>
+    <w:link w:val="berschrift2"/>
     <w:uiPriority w:val="9"/>
     <w:semiHidden/>
     <w:rsid w:val="00080235"/>
@@ -2191,10 +2205,10 @@
       <w:szCs w:val="32"/>
     </w:rPr>
   </w:style>
-  <w:style w:type="character" w:customStyle="1" w:styleId="Heading3Char">
-    <w:name w:val="Heading 3 Char"/>
-    <w:basedOn w:val="DefaultParagraphFont"/>
-    <w:link w:val="Heading3"/>
+  <w:style w:type="character" w:customStyle="1" w:styleId="berschrift3Zchn">
+    <w:name w:val="Überschrift 3 Zchn"/>
+    <w:basedOn w:val="Absatz-Standardschriftart"/>
+    <w:link w:val="berschrift3"/>
     <w:uiPriority w:val="9"/>
     <w:semiHidden/>
     <w:rsid w:val="00080235"/>
@@ -2205,10 +2219,10 @@
       <w:szCs w:val="28"/>
     </w:rPr>
   </w:style>
-  <w:style w:type="character" w:customStyle="1" w:styleId="Heading4Char">
-    <w:name w:val="Heading 4 Char"/>
-    <w:basedOn w:val="DefaultParagraphFont"/>
-    <w:link w:val="Heading4"/>
+  <w:style w:type="character" w:customStyle="1" w:styleId="berschrift4Zchn">
+    <w:name w:val="Überschrift 4 Zchn"/>
+    <w:basedOn w:val="Absatz-Standardschriftart"/>
+    <w:link w:val="berschrift4"/>
     <w:uiPriority w:val="9"/>
     <w:semiHidden/>
     <w:rsid w:val="00080235"/>
@@ -2219,10 +2233,10 @@
       <w:color w:val="0F4761" w:themeColor="accent1" w:themeShade="BF"/>
     </w:rPr>
   </w:style>
-  <w:style w:type="character" w:customStyle="1" w:styleId="Heading5Char">
-    <w:name w:val="Heading 5 Char"/>
-    <w:basedOn w:val="DefaultParagraphFont"/>
-    <w:link w:val="Heading5"/>
+  <w:style w:type="character" w:customStyle="1" w:styleId="berschrift5Zchn">
+    <w:name w:val="Überschrift 5 Zchn"/>
+    <w:basedOn w:val="Absatz-Standardschriftart"/>
+    <w:link w:val="berschrift5"/>
     <w:uiPriority w:val="9"/>
     <w:semiHidden/>
     <w:rsid w:val="00080235"/>
@@ -2231,10 +2245,10 @@
       <w:color w:val="0F4761" w:themeColor="accent1" w:themeShade="BF"/>
     </w:rPr>
   </w:style>
-  <w:style w:type="character" w:customStyle="1" w:styleId="Heading6Char">
-    <w:name w:val="Heading 6 Char"/>
-    <w:basedOn w:val="DefaultParagraphFont"/>
-    <w:link w:val="Heading6"/>
+  <w:style w:type="character" w:customStyle="1" w:styleId="berschrift6Zchn">
+    <w:name w:val="Überschrift 6 Zchn"/>
+    <w:basedOn w:val="Absatz-Standardschriftart"/>
+    <w:link w:val="berschrift6"/>
     <w:uiPriority w:val="9"/>
     <w:semiHidden/>
     <w:rsid w:val="00080235"/>
@@ -2245,10 +2259,10 @@
       <w:color w:val="595959" w:themeColor="text1" w:themeTint="A6"/>
     </w:rPr>
   </w:style>
-  <w:style w:type="character" w:customStyle="1" w:styleId="Heading7Char">
-    <w:name w:val="Heading 7 Char"/>
-    <w:basedOn w:val="DefaultParagraphFont"/>
-    <w:link w:val="Heading7"/>
+  <w:style w:type="character" w:customStyle="1" w:styleId="berschrift7Zchn">
+    <w:name w:val="Überschrift 7 Zchn"/>
+    <w:basedOn w:val="Absatz-Standardschriftart"/>
+    <w:link w:val="berschrift7"/>
     <w:uiPriority w:val="9"/>
     <w:semiHidden/>
     <w:rsid w:val="00080235"/>
@@ -2257,10 +2271,10 @@
       <w:color w:val="595959" w:themeColor="text1" w:themeTint="A6"/>
     </w:rPr>
   </w:style>
-  <w:style w:type="character" w:customStyle="1" w:styleId="Heading8Char">
-    <w:name w:val="Heading 8 Char"/>
-    <w:basedOn w:val="DefaultParagraphFont"/>
-    <w:link w:val="Heading8"/>
+  <w:style w:type="character" w:customStyle="1" w:styleId="berschrift8Zchn">
+    <w:name w:val="Überschrift 8 Zchn"/>
+    <w:basedOn w:val="Absatz-Standardschriftart"/>
+    <w:link w:val="berschrift8"/>
     <w:uiPriority w:val="9"/>
     <w:semiHidden/>
     <w:rsid w:val="00080235"/>
@@ -2271,10 +2285,10 @@
       <w:color w:val="272727" w:themeColor="text1" w:themeTint="D8"/>
     </w:rPr>
   </w:style>
-  <w:style w:type="character" w:customStyle="1" w:styleId="Heading9Char">
-    <w:name w:val="Heading 9 Char"/>
-    <w:basedOn w:val="DefaultParagraphFont"/>
-    <w:link w:val="Heading9"/>
+  <w:style w:type="character" w:customStyle="1" w:styleId="berschrift9Zchn">
+    <w:name w:val="Überschrift 9 Zchn"/>
+    <w:basedOn w:val="Absatz-Standardschriftart"/>
+    <w:link w:val="berschrift9"/>
     <w:uiPriority w:val="9"/>
     <w:semiHidden/>
     <w:rsid w:val="00080235"/>
@@ -2283,11 +2297,11 @@
       <w:color w:val="272727" w:themeColor="text1" w:themeTint="D8"/>
     </w:rPr>
   </w:style>
-  <w:style w:type="paragraph" w:styleId="Title">
+  <w:style w:type="paragraph" w:styleId="Titel">
     <w:name w:val="Title"/>
-    <w:basedOn w:val="Normal"/>
-    <w:next w:val="Normal"/>
-    <w:link w:val="TitleChar"/>
+    <w:basedOn w:val="Standard"/>
+    <w:next w:val="Standard"/>
+    <w:link w:val="TitelZchn"/>
     <w:uiPriority w:val="10"/>
     <w:qFormat/>
     <w:rsid w:val="00080235"/>
@@ -2303,10 +2317,10 @@
       <w:szCs w:val="56"/>
     </w:rPr>
   </w:style>
-  <w:style w:type="character" w:customStyle="1" w:styleId="TitleChar">
-    <w:name w:val="Title Char"/>
-    <w:basedOn w:val="DefaultParagraphFont"/>
-    <w:link w:val="Title"/>
+  <w:style w:type="character" w:customStyle="1" w:styleId="TitelZchn">
+    <w:name w:val="Titel Zchn"/>
+    <w:basedOn w:val="Absatz-Standardschriftart"/>
+    <w:link w:val="Titel"/>
     <w:uiPriority w:val="10"/>
     <w:rsid w:val="00080235"/>
     <w:rPr>
@@ -2317,11 +2331,11 @@
       <w:szCs w:val="56"/>
     </w:rPr>
   </w:style>
-  <w:style w:type="paragraph" w:styleId="Subtitle">
+  <w:style w:type="paragraph" w:styleId="Untertitel">
     <w:name w:val="Subtitle"/>
-    <w:basedOn w:val="Normal"/>
-    <w:next w:val="Normal"/>
-    <w:link w:val="SubtitleChar"/>
+    <w:basedOn w:val="Standard"/>
+    <w:next w:val="Standard"/>
+    <w:link w:val="UntertitelZchn"/>
     <w:uiPriority w:val="11"/>
     <w:qFormat/>
     <w:rsid w:val="00080235"/>
@@ -2338,10 +2352,10 @@
       <w:szCs w:val="28"/>
     </w:rPr>
   </w:style>
-  <w:style w:type="character" w:customStyle="1" w:styleId="SubtitleChar">
-    <w:name w:val="Subtitle Char"/>
-    <w:basedOn w:val="DefaultParagraphFont"/>
-    <w:link w:val="Subtitle"/>
+  <w:style w:type="character" w:customStyle="1" w:styleId="UntertitelZchn">
+    <w:name w:val="Untertitel Zchn"/>
+    <w:basedOn w:val="Absatz-Standardschriftart"/>
+    <w:link w:val="Untertitel"/>
     <w:uiPriority w:val="11"/>
     <w:rsid w:val="00080235"/>
     <w:rPr>
@@ -2352,11 +2366,11 @@
       <w:szCs w:val="28"/>
     </w:rPr>
   </w:style>
-  <w:style w:type="paragraph" w:styleId="Quote">
+  <w:style w:type="paragraph" w:styleId="Zitat">
     <w:name w:val="Quote"/>
-    <w:basedOn w:val="Normal"/>
-    <w:next w:val="Normal"/>
-    <w:link w:val="QuoteChar"/>
+    <w:basedOn w:val="Standard"/>
+    <w:next w:val="Standard"/>
+    <w:link w:val="ZitatZchn"/>
     <w:uiPriority w:val="29"/>
     <w:qFormat/>
     <w:rsid w:val="00080235"/>
@@ -2370,10 +2384,10 @@
       <w:color w:val="404040" w:themeColor="text1" w:themeTint="BF"/>
     </w:rPr>
   </w:style>
-  <w:style w:type="character" w:customStyle="1" w:styleId="QuoteChar">
-    <w:name w:val="Quote Char"/>
-    <w:basedOn w:val="DefaultParagraphFont"/>
-    <w:link w:val="Quote"/>
+  <w:style w:type="character" w:customStyle="1" w:styleId="ZitatZchn">
+    <w:name w:val="Zitat Zchn"/>
+    <w:basedOn w:val="Absatz-Standardschriftart"/>
+    <w:link w:val="Zitat"/>
     <w:uiPriority w:val="29"/>
     <w:rsid w:val="00080235"/>
     <w:rPr>
@@ -2382,9 +2396,9 @@
       <w:color w:val="404040" w:themeColor="text1" w:themeTint="BF"/>
     </w:rPr>
   </w:style>
-  <w:style w:type="paragraph" w:styleId="ListParagraph">
+  <w:style w:type="paragraph" w:styleId="Listenabsatz">
     <w:name w:val="List Paragraph"/>
-    <w:basedOn w:val="Normal"/>
+    <w:basedOn w:val="Standard"/>
     <w:uiPriority w:val="34"/>
     <w:qFormat/>
     <w:rsid w:val="00080235"/>
@@ -2393,9 +2407,9 @@
       <w:contextualSpacing/>
     </w:pPr>
   </w:style>
-  <w:style w:type="character" w:styleId="IntenseEmphasis">
+  <w:style w:type="character" w:styleId="IntensiveHervorhebung">
     <w:name w:val="Intense Emphasis"/>
-    <w:basedOn w:val="DefaultParagraphFont"/>
+    <w:basedOn w:val="Absatz-Standardschriftart"/>
     <w:uiPriority w:val="21"/>
     <w:qFormat/>
     <w:rsid w:val="00080235"/>
@@ -2405,11 +2419,11 @@
       <w:color w:val="0F4761" w:themeColor="accent1" w:themeShade="BF"/>
     </w:rPr>
   </w:style>
-  <w:style w:type="paragraph" w:styleId="IntenseQuote">
+  <w:style w:type="paragraph" w:styleId="IntensivesZitat">
     <w:name w:val="Intense Quote"/>
-    <w:basedOn w:val="Normal"/>
-    <w:next w:val="Normal"/>
-    <w:link w:val="IntenseQuoteChar"/>
+    <w:basedOn w:val="Standard"/>
+    <w:next w:val="Standard"/>
+    <w:link w:val="IntensivesZitatZchn"/>
     <w:uiPriority w:val="30"/>
     <w:qFormat/>
     <w:rsid w:val="00080235"/>
@@ -2428,10 +2442,10 @@
       <w:color w:val="0F4761" w:themeColor="accent1" w:themeShade="BF"/>
     </w:rPr>
   </w:style>
-  <w:style w:type="character" w:customStyle="1" w:styleId="IntenseQuoteChar">
-    <w:name w:val="Intense Quote Char"/>
-    <w:basedOn w:val="DefaultParagraphFont"/>
-    <w:link w:val="IntenseQuote"/>
+  <w:style w:type="character" w:customStyle="1" w:styleId="IntensivesZitatZchn">
+    <w:name w:val="Intensives Zitat Zchn"/>
+    <w:basedOn w:val="Absatz-Standardschriftart"/>
+    <w:link w:val="IntensivesZitat"/>
     <w:uiPriority w:val="30"/>
     <w:rsid w:val="00080235"/>
     <w:rPr>
@@ -2440,9 +2454,9 @@
       <w:color w:val="0F4761" w:themeColor="accent1" w:themeShade="BF"/>
     </w:rPr>
   </w:style>
-  <w:style w:type="character" w:styleId="IntenseReference">
+  <w:style w:type="character" w:styleId="IntensiverVerweis">
     <w:name w:val="Intense Reference"/>
-    <w:basedOn w:val="DefaultParagraphFont"/>
+    <w:basedOn w:val="Absatz-Standardschriftart"/>
     <w:uiPriority w:val="32"/>
     <w:qFormat/>
     <w:rsid w:val="00080235"/>

</xml_diff>

<commit_message>
Completed base simulation without non lineraities nor filter
</commit_message>
<xml_diff>
--- a/Thesis Overview.docx
+++ b/Thesis Overview.docx
@@ -525,7 +525,21 @@
         <w:rPr>
           <w:lang w:val="en-US"/>
         </w:rPr>
-        <w:t>Available models for predistortion. Simple ones first – AM,AM conversion</w:t>
+        <w:t xml:space="preserve">Available models for predistortion. Simple ones first – </w:t>
+      </w:r>
+      <w:proofErr w:type="gramStart"/>
+      <w:r>
+        <w:rPr>
+          <w:lang w:val="en-US"/>
+        </w:rPr>
+        <w:t>AM,AM</w:t>
+      </w:r>
+      <w:proofErr w:type="gramEnd"/>
+      <w:r>
+        <w:rPr>
+          <w:lang w:val="en-US"/>
+        </w:rPr>
+        <w:t xml:space="preserve"> conversion</w:t>
       </w:r>
     </w:p>
     <w:p>
@@ -798,7 +812,21 @@
         <w:rPr>
           <w:lang w:val="en-US"/>
         </w:rPr>
-        <w:t xml:space="preserve"> functions to use time vector. Downmixing result should not be different for different sampling frequencies. You just have more frequency bins in between)</w:t>
+        <w:t xml:space="preserve"> functions to use time vector. Downmixing </w:t>
+      </w:r>
+      <w:proofErr w:type="gramStart"/>
+      <w:r>
+        <w:rPr>
+          <w:lang w:val="en-US"/>
+        </w:rPr>
+        <w:t>result</w:t>
+      </w:r>
+      <w:proofErr w:type="gramEnd"/>
+      <w:r>
+        <w:rPr>
+          <w:lang w:val="en-US"/>
+        </w:rPr>
+        <w:t xml:space="preserve"> should not be different for different sampling frequencies. You just have more frequency bins in between)</w:t>
       </w:r>
     </w:p>
     <w:p>
@@ -816,9 +844,24 @@
         <w:rPr>
           <w:lang w:val="en-US"/>
         </w:rPr>
-        <w:t xml:space="preserve">May need to sample convert to a higher sample rate when going from digital to analogue (10x the bandwidth or whatever Claude said) -  because </w:t>
+        <w:t xml:space="preserve">May need to sample convert to a higher sample rate when going from digital to analogue (10x the bandwidth or whatever Claude said) </w:t>
+      </w:r>
+      <w:proofErr w:type="gramStart"/>
+      <w:r>
+        <w:rPr>
+          <w:lang w:val="en-US"/>
+        </w:rPr>
+        <w:t>-  because</w:t>
+      </w:r>
+      <w:proofErr w:type="gramEnd"/>
+      <w:r>
+        <w:rPr>
+          <w:lang w:val="en-US"/>
+        </w:rPr>
+        <w:t xml:space="preserve"> </w:t>
       </w:r>
       <w:proofErr w:type="spellStart"/>
+      <w:proofErr w:type="gramStart"/>
       <w:r>
         <w:rPr>
           <w:lang w:val="en-US"/>
@@ -826,35 +869,26 @@
         <w:t>non linear</w:t>
       </w:r>
       <w:proofErr w:type="spellEnd"/>
-      <w:r>
-        <w:rPr>
-          <w:lang w:val="en-US"/>
-        </w:rPr>
-        <w:t xml:space="preserve"> components may introduce big changes in between samples, that are not captured by a lower sample rate</w:t>
-      </w:r>
-    </w:p>
-    <w:p>
-      <w:pPr>
-        <w:pStyle w:val="Listenabsatz"/>
-        <w:numPr>
-          <w:ilvl w:val="0"/>
-          <w:numId w:val="4"/>
-        </w:numPr>
-        <w:rPr>
-          <w:lang w:val="en-US"/>
-        </w:rPr>
-      </w:pPr>
-      <w:r>
-        <w:rPr>
-          <w:lang w:val="en-US"/>
-        </w:rPr>
-        <w:t>Label pulse compression axis</w:t>
-      </w:r>
-      <w:r>
-        <w:rPr>
-          <w:lang w:val="en-US"/>
-        </w:rPr>
-        <w:t xml:space="preserve"> </w:t>
+      <w:proofErr w:type="gramEnd"/>
+      <w:r>
+        <w:rPr>
+          <w:lang w:val="en-US"/>
+        </w:rPr>
+        <w:t xml:space="preserve"> components may introduce big </w:t>
+      </w:r>
+      <w:proofErr w:type="gramStart"/>
+      <w:r>
+        <w:rPr>
+          <w:lang w:val="en-US"/>
+        </w:rPr>
+        <w:t>changes in</w:t>
+      </w:r>
+      <w:proofErr w:type="gramEnd"/>
+      <w:r>
+        <w:rPr>
+          <w:lang w:val="en-US"/>
+        </w:rPr>
+        <w:t xml:space="preserve"> between samples, that are not captured by a lower sample rate</w:t>
       </w:r>
     </w:p>
     <w:p>
@@ -1560,7 +1594,7 @@
         <w:kern w:val="2"/>
         <w:sz w:val="24"/>
         <w:szCs w:val="24"/>
-        <w:lang w:eastAsia="en-US" w:bidi="ar-SA"/>
+        <w:lang w:val="de-DE" w:eastAsia="en-US" w:bidi="ar-SA"/>
         <w14:ligatures w14:val="standardContextual"/>
       </w:rPr>
     </w:rPrDefault>

</xml_diff>

<commit_message>
Begin implementing Saleh model and updated thesis overview
</commit_message>
<xml_diff>
--- a/Thesis Overview.docx
+++ b/Thesis Overview.docx
@@ -4,7 +4,7 @@
   <w:body>
     <w:p>
       <w:pPr>
-        <w:pStyle w:val="Listenabsatz"/>
+        <w:pStyle w:val="ListParagraph"/>
         <w:numPr>
           <w:ilvl w:val="0"/>
           <w:numId w:val="2"/>
@@ -22,7 +22,7 @@
     </w:p>
     <w:p>
       <w:pPr>
-        <w:pStyle w:val="Listenabsatz"/>
+        <w:pStyle w:val="ListParagraph"/>
         <w:rPr>
           <w:lang w:val="en-US"/>
         </w:rPr>
@@ -36,15 +36,15 @@
     </w:p>
     <w:p>
       <w:pPr>
-        <w:pStyle w:val="Listenabsatz"/>
-        <w:rPr>
-          <w:lang w:val="en-US"/>
-        </w:rPr>
-      </w:pPr>
-    </w:p>
-    <w:p>
-      <w:pPr>
-        <w:pStyle w:val="Listenabsatz"/>
+        <w:pStyle w:val="ListParagraph"/>
+        <w:rPr>
+          <w:lang w:val="en-US"/>
+        </w:rPr>
+      </w:pPr>
+    </w:p>
+    <w:p>
+      <w:pPr>
+        <w:pStyle w:val="ListParagraph"/>
         <w:rPr>
           <w:lang w:val="en-US"/>
         </w:rPr>
@@ -89,21 +89,7 @@
         <w:rPr>
           <w:lang w:val="en-US"/>
         </w:rPr>
-        <w:t xml:space="preserve"> at o/p (side lobes in </w:t>
-      </w:r>
-      <w:proofErr w:type="spellStart"/>
-      <w:r>
-        <w:rPr>
-          <w:lang w:val="en-US"/>
-        </w:rPr>
-        <w:t>freq</w:t>
-      </w:r>
-      <w:proofErr w:type="spellEnd"/>
-      <w:r>
-        <w:rPr>
-          <w:lang w:val="en-US"/>
-        </w:rPr>
-        <w:t xml:space="preserve">), back into Rx, </w:t>
+        <w:t xml:space="preserve"> at o/p (side lobes in freq), back into Rx, </w:t>
       </w:r>
       <w:r>
         <w:rPr>
@@ -120,7 +106,7 @@
     </w:p>
     <w:p>
       <w:pPr>
-        <w:pStyle w:val="Listenabsatz"/>
+        <w:pStyle w:val="ListParagraph"/>
         <w:rPr>
           <w:lang w:val="en-US"/>
         </w:rPr>
@@ -134,15 +120,15 @@
     </w:p>
     <w:p>
       <w:pPr>
-        <w:pStyle w:val="Listenabsatz"/>
-        <w:rPr>
-          <w:lang w:val="en-US"/>
-        </w:rPr>
-      </w:pPr>
-    </w:p>
-    <w:p>
-      <w:pPr>
-        <w:pStyle w:val="Listenabsatz"/>
+        <w:pStyle w:val="ListParagraph"/>
+        <w:rPr>
+          <w:lang w:val="en-US"/>
+        </w:rPr>
+      </w:pPr>
+    </w:p>
+    <w:p>
+      <w:pPr>
+        <w:pStyle w:val="ListParagraph"/>
         <w:rPr>
           <w:lang w:val="en-US"/>
         </w:rPr>
@@ -168,7 +154,7 @@
     </w:p>
     <w:p>
       <w:pPr>
-        <w:pStyle w:val="Listenabsatz"/>
+        <w:pStyle w:val="ListParagraph"/>
         <w:rPr>
           <w:lang w:val="en-US"/>
         </w:rPr>
@@ -201,15 +187,15 @@
     </w:p>
     <w:p>
       <w:pPr>
-        <w:pStyle w:val="Listenabsatz"/>
-        <w:rPr>
-          <w:lang w:val="en-US"/>
-        </w:rPr>
-      </w:pPr>
-    </w:p>
-    <w:p>
-      <w:pPr>
-        <w:pStyle w:val="Listenabsatz"/>
+        <w:pStyle w:val="ListParagraph"/>
+        <w:rPr>
+          <w:lang w:val="en-US"/>
+        </w:rPr>
+      </w:pPr>
+    </w:p>
+    <w:p>
+      <w:pPr>
+        <w:pStyle w:val="ListParagraph"/>
         <w:numPr>
           <w:ilvl w:val="0"/>
           <w:numId w:val="2"/>
@@ -227,7 +213,7 @@
     </w:p>
     <w:p>
       <w:pPr>
-        <w:pStyle w:val="Listenabsatz"/>
+        <w:pStyle w:val="ListParagraph"/>
         <w:rPr>
           <w:lang w:val="en-US"/>
         </w:rPr>
@@ -248,7 +234,7 @@
     </w:p>
     <w:p>
       <w:pPr>
-        <w:pStyle w:val="Listenabsatz"/>
+        <w:pStyle w:val="ListParagraph"/>
         <w:numPr>
           <w:ilvl w:val="0"/>
           <w:numId w:val="2"/>
@@ -266,7 +252,7 @@
     </w:p>
     <w:p>
       <w:pPr>
-        <w:pStyle w:val="Listenabsatz"/>
+        <w:pStyle w:val="ListParagraph"/>
         <w:rPr>
           <w:lang w:val="en-US"/>
         </w:rPr>
@@ -292,7 +278,7 @@
     </w:p>
     <w:p>
       <w:pPr>
-        <w:pStyle w:val="Listenabsatz"/>
+        <w:pStyle w:val="ListParagraph"/>
         <w:rPr>
           <w:lang w:val="en-US"/>
         </w:rPr>
@@ -306,7 +292,7 @@
     </w:p>
     <w:p>
       <w:pPr>
-        <w:pStyle w:val="Listenabsatz"/>
+        <w:pStyle w:val="ListParagraph"/>
         <w:rPr>
           <w:lang w:val="en-US"/>
         </w:rPr>
@@ -320,15 +306,15 @@
     </w:p>
     <w:p>
       <w:pPr>
-        <w:pStyle w:val="Listenabsatz"/>
-        <w:rPr>
-          <w:lang w:val="en-US"/>
-        </w:rPr>
-      </w:pPr>
-    </w:p>
-    <w:p>
-      <w:pPr>
-        <w:pStyle w:val="Listenabsatz"/>
+        <w:pStyle w:val="ListParagraph"/>
+        <w:rPr>
+          <w:lang w:val="en-US"/>
+        </w:rPr>
+      </w:pPr>
+    </w:p>
+    <w:p>
+      <w:pPr>
+        <w:pStyle w:val="ListParagraph"/>
         <w:numPr>
           <w:ilvl w:val="0"/>
           <w:numId w:val="2"/>
@@ -346,7 +332,7 @@
     </w:p>
     <w:p>
       <w:pPr>
-        <w:pStyle w:val="Listenabsatz"/>
+        <w:pStyle w:val="ListParagraph"/>
         <w:rPr>
           <w:lang w:val="en-US"/>
         </w:rPr>
@@ -360,35 +346,21 @@
     </w:p>
     <w:p>
       <w:pPr>
-        <w:pStyle w:val="Listenabsatz"/>
-        <w:rPr>
-          <w:lang w:val="en-US"/>
-        </w:rPr>
-      </w:pPr>
-      <w:r>
-        <w:rPr>
-          <w:lang w:val="en-US"/>
-        </w:rPr>
-        <w:t xml:space="preserve">Open loop – </w:t>
-      </w:r>
-      <w:proofErr w:type="spellStart"/>
-      <w:r>
-        <w:rPr>
-          <w:lang w:val="en-US"/>
-        </w:rPr>
-        <w:t>i</w:t>
-      </w:r>
-      <w:proofErr w:type="spellEnd"/>
-      <w:r>
-        <w:rPr>
-          <w:lang w:val="en-US"/>
-        </w:rPr>
-        <w:t>/p changes depending on what we measure at o/p</w:t>
-      </w:r>
-    </w:p>
-    <w:p>
-      <w:pPr>
-        <w:pStyle w:val="Listenabsatz"/>
+        <w:pStyle w:val="ListParagraph"/>
+        <w:rPr>
+          <w:lang w:val="en-US"/>
+        </w:rPr>
+      </w:pPr>
+      <w:r>
+        <w:rPr>
+          <w:lang w:val="en-US"/>
+        </w:rPr>
+        <w:t>Open loop – i/p changes depending on what we measure at o/p</w:t>
+      </w:r>
+    </w:p>
+    <w:p>
+      <w:pPr>
+        <w:pStyle w:val="ListParagraph"/>
         <w:rPr>
           <w:lang w:val="en-US"/>
         </w:rPr>
@@ -402,7 +374,7 @@
     </w:p>
     <w:p>
       <w:pPr>
-        <w:pStyle w:val="Listenabsatz"/>
+        <w:pStyle w:val="ListParagraph"/>
         <w:rPr>
           <w:lang w:val="en-US"/>
         </w:rPr>
@@ -416,7 +388,7 @@
     </w:p>
     <w:p>
       <w:pPr>
-        <w:pStyle w:val="Listenabsatz"/>
+        <w:pStyle w:val="ListParagraph"/>
         <w:rPr>
           <w:lang w:val="en-US"/>
         </w:rPr>
@@ -430,15 +402,15 @@
     </w:p>
     <w:p>
       <w:pPr>
-        <w:pStyle w:val="Listenabsatz"/>
-        <w:rPr>
-          <w:lang w:val="en-US"/>
-        </w:rPr>
-      </w:pPr>
-    </w:p>
-    <w:p>
-      <w:pPr>
-        <w:pStyle w:val="Listenabsatz"/>
+        <w:pStyle w:val="ListParagraph"/>
+        <w:rPr>
+          <w:lang w:val="en-US"/>
+        </w:rPr>
+      </w:pPr>
+    </w:p>
+    <w:p>
+      <w:pPr>
+        <w:pStyle w:val="ListParagraph"/>
         <w:rPr>
           <w:lang w:val="en-US"/>
         </w:rPr>
@@ -452,7 +424,7 @@
     </w:p>
     <w:p>
       <w:pPr>
-        <w:pStyle w:val="Listenabsatz"/>
+        <w:pStyle w:val="ListParagraph"/>
         <w:rPr>
           <w:lang w:val="en-US"/>
         </w:rPr>
@@ -466,7 +438,7 @@
     </w:p>
     <w:p>
       <w:pPr>
-        <w:pStyle w:val="Listenabsatz"/>
+        <w:pStyle w:val="ListParagraph"/>
         <w:rPr>
           <w:lang w:val="en-US"/>
         </w:rPr>
@@ -480,25 +452,17 @@
     </w:p>
     <w:p>
       <w:pPr>
-        <w:pStyle w:val="Listenabsatz"/>
-        <w:rPr>
-          <w:lang w:val="en-US"/>
-        </w:rPr>
-      </w:pPr>
-      <w:r>
-        <w:rPr>
-          <w:lang w:val="en-US"/>
-        </w:rPr>
-        <w:t xml:space="preserve">Settings.xml </w:t>
-      </w:r>
-      <w:proofErr w:type="spellStart"/>
-      <w:r>
-        <w:rPr>
-          <w:lang w:val="en-US"/>
-        </w:rPr>
-        <w:t>parametres</w:t>
-      </w:r>
-      <w:proofErr w:type="spellEnd"/>
+        <w:pStyle w:val="ListParagraph"/>
+        <w:rPr>
+          <w:lang w:val="en-US"/>
+        </w:rPr>
+      </w:pPr>
+      <w:r>
+        <w:rPr>
+          <w:lang w:val="en-US"/>
+        </w:rPr>
+        <w:t>Settings.xml parametres</w:t>
+      </w:r>
       <w:r>
         <w:rPr>
           <w:lang w:val="en-US"/>
@@ -508,43 +472,29 @@
     </w:p>
     <w:p>
       <w:pPr>
-        <w:pStyle w:val="Listenabsatz"/>
-        <w:rPr>
-          <w:lang w:val="en-US"/>
-        </w:rPr>
-      </w:pPr>
-    </w:p>
-    <w:p>
-      <w:pPr>
-        <w:pStyle w:val="Listenabsatz"/>
-        <w:rPr>
-          <w:lang w:val="en-US"/>
-        </w:rPr>
-      </w:pPr>
-      <w:r>
-        <w:rPr>
-          <w:lang w:val="en-US"/>
-        </w:rPr>
-        <w:t xml:space="preserve">Available models for predistortion. Simple ones first – </w:t>
-      </w:r>
-      <w:proofErr w:type="gramStart"/>
-      <w:r>
-        <w:rPr>
-          <w:lang w:val="en-US"/>
-        </w:rPr>
-        <w:t>AM,AM</w:t>
-      </w:r>
-      <w:proofErr w:type="gramEnd"/>
-      <w:r>
-        <w:rPr>
-          <w:lang w:val="en-US"/>
-        </w:rPr>
-        <w:t xml:space="preserve"> conversion</w:t>
-      </w:r>
-    </w:p>
-    <w:p>
-      <w:pPr>
-        <w:pStyle w:val="Listenabsatz"/>
+        <w:pStyle w:val="ListParagraph"/>
+        <w:rPr>
+          <w:lang w:val="en-US"/>
+        </w:rPr>
+      </w:pPr>
+    </w:p>
+    <w:p>
+      <w:pPr>
+        <w:pStyle w:val="ListParagraph"/>
+        <w:rPr>
+          <w:lang w:val="en-US"/>
+        </w:rPr>
+      </w:pPr>
+      <w:r>
+        <w:rPr>
+          <w:lang w:val="en-US"/>
+        </w:rPr>
+        <w:t>Available models for predistortion. Simple ones first – AM,AM conversion</w:t>
+      </w:r>
+    </w:p>
+    <w:p>
+      <w:pPr>
+        <w:pStyle w:val="ListParagraph"/>
         <w:rPr>
           <w:lang w:val="en-US"/>
         </w:rPr>
@@ -558,7 +508,7 @@
     </w:p>
     <w:p>
       <w:pPr>
-        <w:pStyle w:val="Listenabsatz"/>
+        <w:pStyle w:val="ListParagraph"/>
         <w:rPr>
           <w:lang w:val="en-US"/>
         </w:rPr>
@@ -572,15 +522,15 @@
     </w:p>
     <w:p>
       <w:pPr>
-        <w:pStyle w:val="Listenabsatz"/>
-        <w:rPr>
-          <w:lang w:val="en-US"/>
-        </w:rPr>
-      </w:pPr>
-    </w:p>
-    <w:p>
-      <w:pPr>
-        <w:pStyle w:val="Listenabsatz"/>
+        <w:pStyle w:val="ListParagraph"/>
+        <w:rPr>
+          <w:lang w:val="en-US"/>
+        </w:rPr>
+      </w:pPr>
+    </w:p>
+    <w:p>
+      <w:pPr>
+        <w:pStyle w:val="ListParagraph"/>
         <w:rPr>
           <w:lang w:val="en-US"/>
         </w:rPr>
@@ -618,7 +568,7 @@
     </w:p>
     <w:p>
       <w:pPr>
-        <w:pStyle w:val="Listenabsatz"/>
+        <w:pStyle w:val="ListParagraph"/>
         <w:rPr>
           <w:lang w:val="en-US"/>
         </w:rPr>
@@ -638,15 +588,15 @@
     </w:p>
     <w:p>
       <w:pPr>
-        <w:pStyle w:val="Listenabsatz"/>
-        <w:rPr>
-          <w:lang w:val="en-US"/>
-        </w:rPr>
-      </w:pPr>
-    </w:p>
-    <w:p>
-      <w:pPr>
-        <w:pStyle w:val="Listenabsatz"/>
+        <w:pStyle w:val="ListParagraph"/>
+        <w:rPr>
+          <w:lang w:val="en-US"/>
+        </w:rPr>
+      </w:pPr>
+    </w:p>
+    <w:p>
+      <w:pPr>
+        <w:pStyle w:val="ListParagraph"/>
         <w:rPr>
           <w:lang w:val="en-US"/>
         </w:rPr>
@@ -660,7 +610,7 @@
     </w:p>
     <w:p>
       <w:pPr>
-        <w:pStyle w:val="Listenabsatz"/>
+        <w:pStyle w:val="ListParagraph"/>
         <w:rPr>
           <w:lang w:val="en-US"/>
         </w:rPr>
@@ -675,15 +625,15 @@
     </w:p>
     <w:p>
       <w:pPr>
-        <w:pStyle w:val="Listenabsatz"/>
-        <w:rPr>
-          <w:lang w:val="en-US"/>
-        </w:rPr>
-      </w:pPr>
-    </w:p>
-    <w:p>
-      <w:pPr>
-        <w:pStyle w:val="Listenabsatz"/>
+        <w:pStyle w:val="ListParagraph"/>
+        <w:rPr>
+          <w:lang w:val="en-US"/>
+        </w:rPr>
+      </w:pPr>
+    </w:p>
+    <w:p>
+      <w:pPr>
+        <w:pStyle w:val="ListParagraph"/>
         <w:rPr>
           <w:u w:val="single"/>
           <w:lang w:val="en-US"/>
@@ -699,7 +649,7 @@
     </w:p>
     <w:p>
       <w:pPr>
-        <w:pStyle w:val="Listenabsatz"/>
+        <w:pStyle w:val="ListParagraph"/>
         <w:rPr>
           <w:lang w:val="en-US"/>
         </w:rPr>
@@ -713,7 +663,7 @@
     </w:p>
     <w:p>
       <w:pPr>
-        <w:pStyle w:val="Listenabsatz"/>
+        <w:pStyle w:val="ListParagraph"/>
         <w:rPr>
           <w:lang w:val="en-US"/>
         </w:rPr>
@@ -727,35 +677,21 @@
     </w:p>
     <w:p>
       <w:pPr>
-        <w:pStyle w:val="Listenabsatz"/>
-        <w:rPr>
-          <w:lang w:val="en-US"/>
-        </w:rPr>
-      </w:pPr>
-      <w:r>
-        <w:rPr>
-          <w:lang w:val="en-US"/>
-        </w:rPr>
-        <w:t xml:space="preserve">Look at other filters (and components) in FEC Commissioning Doc and see if you need to incorporate them too (e.g. harmonic filter, IF complex filter </w:t>
-      </w:r>
-      <w:proofErr w:type="spellStart"/>
-      <w:r>
-        <w:rPr>
-          <w:lang w:val="en-US"/>
-        </w:rPr>
-        <w:t>etc</w:t>
-      </w:r>
-      <w:proofErr w:type="spellEnd"/>
-      <w:r>
-        <w:rPr>
-          <w:lang w:val="en-US"/>
-        </w:rPr>
-        <w:t>)</w:t>
-      </w:r>
-    </w:p>
-    <w:p>
-      <w:pPr>
-        <w:pStyle w:val="Listenabsatz"/>
+        <w:pStyle w:val="ListParagraph"/>
+        <w:rPr>
+          <w:lang w:val="en-US"/>
+        </w:rPr>
+      </w:pPr>
+      <w:r>
+        <w:rPr>
+          <w:lang w:val="en-US"/>
+        </w:rPr>
+        <w:t>Look at other filters (and components) in FEC Commissioning Doc and see if you need to incorporate them too (e.g. harmonic filter, IF complex filter etc)</w:t>
+      </w:r>
+    </w:p>
+    <w:p>
+      <w:pPr>
+        <w:pStyle w:val="ListParagraph"/>
         <w:rPr>
           <w:lang w:val="en-US"/>
         </w:rPr>
@@ -785,7 +721,7 @@
     </w:p>
     <w:p>
       <w:pPr>
-        <w:pStyle w:val="Listenabsatz"/>
+        <w:pStyle w:val="ListParagraph"/>
         <w:numPr>
           <w:ilvl w:val="0"/>
           <w:numId w:val="4"/>
@@ -798,40 +734,12 @@
         <w:rPr>
           <w:lang w:val="en-US"/>
         </w:rPr>
-        <w:t>Create full Tx/Rx chain for your understanding (also change up/</w:t>
-      </w:r>
-      <w:proofErr w:type="spellStart"/>
-      <w:r>
-        <w:rPr>
-          <w:lang w:val="en-US"/>
-        </w:rPr>
-        <w:t>downconversion</w:t>
-      </w:r>
-      <w:proofErr w:type="spellEnd"/>
-      <w:r>
-        <w:rPr>
-          <w:lang w:val="en-US"/>
-        </w:rPr>
-        <w:t xml:space="preserve"> functions to use time vector. Downmixing </w:t>
-      </w:r>
-      <w:proofErr w:type="gramStart"/>
-      <w:r>
-        <w:rPr>
-          <w:lang w:val="en-US"/>
-        </w:rPr>
-        <w:t>result</w:t>
-      </w:r>
-      <w:proofErr w:type="gramEnd"/>
-      <w:r>
-        <w:rPr>
-          <w:lang w:val="en-US"/>
-        </w:rPr>
-        <w:t xml:space="preserve"> should not be different for different sampling frequencies. You just have more frequency bins in between)</w:t>
-      </w:r>
-    </w:p>
-    <w:p>
-      <w:pPr>
-        <w:pStyle w:val="Listenabsatz"/>
+        <w:t>Create full Tx/Rx chain for your understanding (also change up/downconversion functions to use time vector. Downmixing result should not be different for different sampling frequencies. You just have more frequency bins in between)</w:t>
+      </w:r>
+    </w:p>
+    <w:p>
+      <w:pPr>
+        <w:pStyle w:val="ListParagraph"/>
         <w:numPr>
           <w:ilvl w:val="0"/>
           <w:numId w:val="4"/>
@@ -844,56 +752,12 @@
         <w:rPr>
           <w:lang w:val="en-US"/>
         </w:rPr>
-        <w:t xml:space="preserve">May need to sample convert to a higher sample rate when going from digital to analogue (10x the bandwidth or whatever Claude said) </w:t>
-      </w:r>
-      <w:proofErr w:type="gramStart"/>
-      <w:r>
-        <w:rPr>
-          <w:lang w:val="en-US"/>
-        </w:rPr>
-        <w:t>-  because</w:t>
-      </w:r>
-      <w:proofErr w:type="gramEnd"/>
-      <w:r>
-        <w:rPr>
-          <w:lang w:val="en-US"/>
-        </w:rPr>
-        <w:t xml:space="preserve"> </w:t>
-      </w:r>
-      <w:proofErr w:type="spellStart"/>
-      <w:proofErr w:type="gramStart"/>
-      <w:r>
-        <w:rPr>
-          <w:lang w:val="en-US"/>
-        </w:rPr>
-        <w:t>non linear</w:t>
-      </w:r>
-      <w:proofErr w:type="spellEnd"/>
-      <w:proofErr w:type="gramEnd"/>
-      <w:r>
-        <w:rPr>
-          <w:lang w:val="en-US"/>
-        </w:rPr>
-        <w:t xml:space="preserve"> components may introduce big </w:t>
-      </w:r>
-      <w:proofErr w:type="gramStart"/>
-      <w:r>
-        <w:rPr>
-          <w:lang w:val="en-US"/>
-        </w:rPr>
-        <w:t>changes in</w:t>
-      </w:r>
-      <w:proofErr w:type="gramEnd"/>
-      <w:r>
-        <w:rPr>
-          <w:lang w:val="en-US"/>
-        </w:rPr>
-        <w:t xml:space="preserve"> between samples, that are not captured by a lower sample rate</w:t>
-      </w:r>
-    </w:p>
-    <w:p>
-      <w:pPr>
-        <w:pStyle w:val="Listenabsatz"/>
+        <w:t>May need to sample convert to a higher sample rate when going from digital to analogue (10x the bandwidth or whatever Claude said) -  because non linear components may introduce big changes in between samples, that are not captured by a lower sample rate</w:t>
+      </w:r>
+    </w:p>
+    <w:p>
+      <w:pPr>
+        <w:pStyle w:val="ListParagraph"/>
         <w:numPr>
           <w:ilvl w:val="0"/>
           <w:numId w:val="4"/>
@@ -914,48 +778,142 @@
         </w:rPr>
         <w:t xml:space="preserve">e.g. 15dB </w:t>
       </w:r>
-      <w:proofErr w:type="spellStart"/>
-      <w:r>
-        <w:rPr>
-          <w:lang w:val="en-US"/>
-        </w:rPr>
-        <w:t>etc</w:t>
-      </w:r>
-      <w:proofErr w:type="spellEnd"/>
-      <w:r>
-        <w:rPr>
-          <w:lang w:val="en-US"/>
-        </w:rPr>
-        <w:t>)</w:t>
-      </w:r>
-    </w:p>
-    <w:p>
-      <w:pPr>
-        <w:pStyle w:val="Listenabsatz"/>
-        <w:rPr>
-          <w:lang w:val="en-US"/>
-        </w:rPr>
-      </w:pPr>
-    </w:p>
-    <w:p>
-      <w:pPr>
-        <w:pStyle w:val="Listenabsatz"/>
-        <w:rPr>
-          <w:lang w:val="en-US"/>
-        </w:rPr>
-      </w:pPr>
-    </w:p>
-    <w:p>
-      <w:pPr>
-        <w:pStyle w:val="Listenabsatz"/>
-        <w:rPr>
-          <w:lang w:val="en-US"/>
-        </w:rPr>
-      </w:pPr>
-    </w:p>
-    <w:p>
-      <w:pPr>
-        <w:pStyle w:val="Listenabsatz"/>
+      <w:r>
+        <w:rPr>
+          <w:lang w:val="en-US"/>
+        </w:rPr>
+        <w:t>etc)</w:t>
+      </w:r>
+      <w:r>
+        <w:rPr>
+          <w:lang w:val="en-US"/>
+        </w:rPr>
+        <w:t xml:space="preserve"> – understand the signal processing in general</w:t>
+      </w:r>
+    </w:p>
+    <w:p>
+      <w:pPr>
+        <w:pStyle w:val="ListParagraph"/>
+        <w:numPr>
+          <w:ilvl w:val="0"/>
+          <w:numId w:val="4"/>
+        </w:numPr>
+        <w:rPr>
+          <w:lang w:val="en-US"/>
+        </w:rPr>
+      </w:pPr>
+      <w:r>
+        <w:rPr>
+          <w:lang w:val="en-US"/>
+        </w:rPr>
+        <w:t>Correct dB plots – wave amplitude to dBm</w:t>
+      </w:r>
+    </w:p>
+    <w:p>
+      <w:pPr>
+        <w:pStyle w:val="ListParagraph"/>
+        <w:numPr>
+          <w:ilvl w:val="0"/>
+          <w:numId w:val="4"/>
+        </w:numPr>
+        <w:rPr>
+          <w:lang w:val="en-US"/>
+        </w:rPr>
+      </w:pPr>
+      <w:r>
+        <w:rPr>
+          <w:lang w:val="en-US"/>
+        </w:rPr>
+        <w:t>Modelling non-linearities</w:t>
+      </w:r>
+      <w:r>
+        <w:rPr>
+          <w:lang w:val="en-US"/>
+        </w:rPr>
+        <w:t xml:space="preserve"> – why no sidebands after PA, harmonics have influence on spectrum?</w:t>
+      </w:r>
+    </w:p>
+    <w:p>
+      <w:pPr>
+        <w:pStyle w:val="ListParagraph"/>
+        <w:numPr>
+          <w:ilvl w:val="0"/>
+          <w:numId w:val="4"/>
+        </w:numPr>
+        <w:rPr>
+          <w:lang w:val="en-US"/>
+        </w:rPr>
+      </w:pPr>
+      <w:r>
+        <w:rPr>
+          <w:lang w:val="en-US"/>
+        </w:rPr>
+        <w:t>Model predistortion</w:t>
+      </w:r>
+    </w:p>
+    <w:p>
+      <w:pPr>
+        <w:pStyle w:val="ListParagraph"/>
+        <w:numPr>
+          <w:ilvl w:val="0"/>
+          <w:numId w:val="6"/>
+        </w:numPr>
+        <w:rPr>
+          <w:lang w:val="en-US"/>
+        </w:rPr>
+      </w:pPr>
+      <w:r>
+        <w:rPr>
+          <w:lang w:val="en-US"/>
+        </w:rPr>
+        <w:t>Can we improve the side lobe suppression?</w:t>
+      </w:r>
+    </w:p>
+    <w:p>
+      <w:pPr>
+        <w:pStyle w:val="ListParagraph"/>
+        <w:numPr>
+          <w:ilvl w:val="0"/>
+          <w:numId w:val="6"/>
+        </w:numPr>
+        <w:rPr>
+          <w:lang w:val="en-US"/>
+        </w:rPr>
+      </w:pPr>
+      <w:r>
+        <w:rPr>
+          <w:lang w:val="en-US"/>
+        </w:rPr>
+        <w:t>Can we improve the pulse compression magnitude?</w:t>
+      </w:r>
+    </w:p>
+    <w:p>
+      <w:pPr>
+        <w:pStyle w:val="ListParagraph"/>
+        <w:rPr>
+          <w:lang w:val="en-US"/>
+        </w:rPr>
+      </w:pPr>
+    </w:p>
+    <w:p>
+      <w:pPr>
+        <w:pStyle w:val="ListParagraph"/>
+        <w:rPr>
+          <w:lang w:val="en-US"/>
+        </w:rPr>
+      </w:pPr>
+    </w:p>
+    <w:p>
+      <w:pPr>
+        <w:pStyle w:val="ListParagraph"/>
+        <w:rPr>
+          <w:lang w:val="en-US"/>
+        </w:rPr>
+      </w:pPr>
+    </w:p>
+    <w:p>
+      <w:pPr>
+        <w:pStyle w:val="ListParagraph"/>
         <w:rPr>
           <w:lang w:val="en-US"/>
         </w:rPr>
@@ -1312,6 +1270,118 @@
     </w:lvl>
   </w:abstractNum>
   <w:abstractNum w:abstractNumId="3" w15:restartNumberingAfterBreak="0">
+    <w:nsid w:val="71D97003"/>
+    <w:multiLevelType w:val="hybridMultilevel"/>
+    <w:tmpl w:val="9DF0A6F4"/>
+    <w:lvl w:ilvl="0" w:tplc="04C42068">
+      <w:numFmt w:val="bullet"/>
+      <w:lvlText w:val="-"/>
+      <w:lvlJc w:val="left"/>
+      <w:pPr>
+        <w:ind w:left="1080" w:hanging="360"/>
+      </w:pPr>
+      <w:rPr>
+        <w:rFonts w:ascii="Aptos" w:eastAsiaTheme="minorHAnsi" w:hAnsi="Aptos" w:cstheme="minorBidi" w:hint="default"/>
+      </w:rPr>
+    </w:lvl>
+    <w:lvl w:ilvl="1" w:tplc="20000003" w:tentative="1">
+      <w:start w:val="1"/>
+      <w:numFmt w:val="bullet"/>
+      <w:lvlText w:val="o"/>
+      <w:lvlJc w:val="left"/>
+      <w:pPr>
+        <w:ind w:left="1800" w:hanging="360"/>
+      </w:pPr>
+      <w:rPr>
+        <w:rFonts w:ascii="Courier New" w:hAnsi="Courier New" w:cs="Courier New" w:hint="default"/>
+      </w:rPr>
+    </w:lvl>
+    <w:lvl w:ilvl="2" w:tplc="20000005" w:tentative="1">
+      <w:start w:val="1"/>
+      <w:numFmt w:val="bullet"/>
+      <w:lvlText w:val=""/>
+      <w:lvlJc w:val="left"/>
+      <w:pPr>
+        <w:ind w:left="2520" w:hanging="360"/>
+      </w:pPr>
+      <w:rPr>
+        <w:rFonts w:ascii="Wingdings" w:hAnsi="Wingdings" w:hint="default"/>
+      </w:rPr>
+    </w:lvl>
+    <w:lvl w:ilvl="3" w:tplc="20000001" w:tentative="1">
+      <w:start w:val="1"/>
+      <w:numFmt w:val="bullet"/>
+      <w:lvlText w:val=""/>
+      <w:lvlJc w:val="left"/>
+      <w:pPr>
+        <w:ind w:left="3240" w:hanging="360"/>
+      </w:pPr>
+      <w:rPr>
+        <w:rFonts w:ascii="Symbol" w:hAnsi="Symbol" w:hint="default"/>
+      </w:rPr>
+    </w:lvl>
+    <w:lvl w:ilvl="4" w:tplc="20000003" w:tentative="1">
+      <w:start w:val="1"/>
+      <w:numFmt w:val="bullet"/>
+      <w:lvlText w:val="o"/>
+      <w:lvlJc w:val="left"/>
+      <w:pPr>
+        <w:ind w:left="3960" w:hanging="360"/>
+      </w:pPr>
+      <w:rPr>
+        <w:rFonts w:ascii="Courier New" w:hAnsi="Courier New" w:cs="Courier New" w:hint="default"/>
+      </w:rPr>
+    </w:lvl>
+    <w:lvl w:ilvl="5" w:tplc="20000005" w:tentative="1">
+      <w:start w:val="1"/>
+      <w:numFmt w:val="bullet"/>
+      <w:lvlText w:val=""/>
+      <w:lvlJc w:val="left"/>
+      <w:pPr>
+        <w:ind w:left="4680" w:hanging="360"/>
+      </w:pPr>
+      <w:rPr>
+        <w:rFonts w:ascii="Wingdings" w:hAnsi="Wingdings" w:hint="default"/>
+      </w:rPr>
+    </w:lvl>
+    <w:lvl w:ilvl="6" w:tplc="20000001" w:tentative="1">
+      <w:start w:val="1"/>
+      <w:numFmt w:val="bullet"/>
+      <w:lvlText w:val=""/>
+      <w:lvlJc w:val="left"/>
+      <w:pPr>
+        <w:ind w:left="5400" w:hanging="360"/>
+      </w:pPr>
+      <w:rPr>
+        <w:rFonts w:ascii="Symbol" w:hAnsi="Symbol" w:hint="default"/>
+      </w:rPr>
+    </w:lvl>
+    <w:lvl w:ilvl="7" w:tplc="20000003" w:tentative="1">
+      <w:start w:val="1"/>
+      <w:numFmt w:val="bullet"/>
+      <w:lvlText w:val="o"/>
+      <w:lvlJc w:val="left"/>
+      <w:pPr>
+        <w:ind w:left="6120" w:hanging="360"/>
+      </w:pPr>
+      <w:rPr>
+        <w:rFonts w:ascii="Courier New" w:hAnsi="Courier New" w:cs="Courier New" w:hint="default"/>
+      </w:rPr>
+    </w:lvl>
+    <w:lvl w:ilvl="8" w:tplc="20000005" w:tentative="1">
+      <w:start w:val="1"/>
+      <w:numFmt w:val="bullet"/>
+      <w:lvlText w:val=""/>
+      <w:lvlJc w:val="left"/>
+      <w:pPr>
+        <w:ind w:left="6840" w:hanging="360"/>
+      </w:pPr>
+      <w:rPr>
+        <w:rFonts w:ascii="Wingdings" w:hAnsi="Wingdings" w:hint="default"/>
+      </w:rPr>
+    </w:lvl>
+  </w:abstractNum>
+  <w:abstractNum w:abstractNumId="4" w15:restartNumberingAfterBreak="0">
     <w:nsid w:val="752C582A"/>
     <w:multiLevelType w:val="hybridMultilevel"/>
     <w:tmpl w:val="3FECD4DC"/>
@@ -1424,7 +1494,7 @@
       </w:rPr>
     </w:lvl>
   </w:abstractNum>
-  <w:abstractNum w:abstractNumId="4" w15:restartNumberingAfterBreak="0">
+  <w:abstractNum w:abstractNumId="5" w15:restartNumberingAfterBreak="0">
     <w:nsid w:val="7F4845B1"/>
     <w:multiLevelType w:val="hybridMultilevel"/>
     <w:tmpl w:val="E034EFD4"/>
@@ -1540,7 +1610,7 @@
     <w:abstractNumId w:val="0"/>
   </w:num>
   <w:num w:numId="2" w16cid:durableId="1061831373">
-    <w:abstractNumId w:val="3"/>
+    <w:abstractNumId w:val="4"/>
   </w:num>
   <w:num w:numId="3" w16cid:durableId="44256664">
     <w:abstractNumId w:val="1"/>
@@ -1549,7 +1619,10 @@
     <w:abstractNumId w:val="2"/>
   </w:num>
   <w:num w:numId="5" w16cid:durableId="1402942277">
-    <w:abstractNumId w:val="4"/>
+    <w:abstractNumId w:val="5"/>
+  </w:num>
+  <w:num w:numId="6" w16cid:durableId="445345325">
+    <w:abstractNumId w:val="3"/>
   </w:num>
 </w:numbering>
 </file>
@@ -1951,15 +2024,15 @@
     <w:lsdException w:name="Unresolved Mention" w:semiHidden="1" w:unhideWhenUsed="1"/>
     <w:lsdException w:name="Smart Link" w:semiHidden="1" w:unhideWhenUsed="1"/>
   </w:latentStyles>
-  <w:style w:type="paragraph" w:default="1" w:styleId="Standard">
+  <w:style w:type="paragraph" w:default="1" w:styleId="Normal">
     <w:name w:val="Normal"/>
     <w:qFormat/>
   </w:style>
-  <w:style w:type="paragraph" w:styleId="berschrift1">
+  <w:style w:type="paragraph" w:styleId="Heading1">
     <w:name w:val="heading 1"/>
-    <w:basedOn w:val="Standard"/>
-    <w:next w:val="Standard"/>
-    <w:link w:val="berschrift1Zchn"/>
+    <w:basedOn w:val="Normal"/>
+    <w:next w:val="Normal"/>
+    <w:link w:val="Heading1Char"/>
     <w:uiPriority w:val="9"/>
     <w:qFormat/>
     <w:rsid w:val="00080235"/>
@@ -1976,11 +2049,11 @@
       <w:szCs w:val="40"/>
     </w:rPr>
   </w:style>
-  <w:style w:type="paragraph" w:styleId="berschrift2">
+  <w:style w:type="paragraph" w:styleId="Heading2">
     <w:name w:val="heading 2"/>
-    <w:basedOn w:val="Standard"/>
-    <w:next w:val="Standard"/>
-    <w:link w:val="berschrift2Zchn"/>
+    <w:basedOn w:val="Normal"/>
+    <w:next w:val="Normal"/>
+    <w:link w:val="Heading2Char"/>
     <w:uiPriority w:val="9"/>
     <w:semiHidden/>
     <w:unhideWhenUsed/>
@@ -1999,11 +2072,11 @@
       <w:szCs w:val="32"/>
     </w:rPr>
   </w:style>
-  <w:style w:type="paragraph" w:styleId="berschrift3">
+  <w:style w:type="paragraph" w:styleId="Heading3">
     <w:name w:val="heading 3"/>
-    <w:basedOn w:val="Standard"/>
-    <w:next w:val="Standard"/>
-    <w:link w:val="berschrift3Zchn"/>
+    <w:basedOn w:val="Normal"/>
+    <w:next w:val="Normal"/>
+    <w:link w:val="Heading3Char"/>
     <w:uiPriority w:val="9"/>
     <w:semiHidden/>
     <w:unhideWhenUsed/>
@@ -2022,11 +2095,11 @@
       <w:szCs w:val="28"/>
     </w:rPr>
   </w:style>
-  <w:style w:type="paragraph" w:styleId="berschrift4">
+  <w:style w:type="paragraph" w:styleId="Heading4">
     <w:name w:val="heading 4"/>
-    <w:basedOn w:val="Standard"/>
-    <w:next w:val="Standard"/>
-    <w:link w:val="berschrift4Zchn"/>
+    <w:basedOn w:val="Normal"/>
+    <w:next w:val="Normal"/>
+    <w:link w:val="Heading4Char"/>
     <w:uiPriority w:val="9"/>
     <w:semiHidden/>
     <w:unhideWhenUsed/>
@@ -2045,11 +2118,11 @@
       <w:color w:val="0F4761" w:themeColor="accent1" w:themeShade="BF"/>
     </w:rPr>
   </w:style>
-  <w:style w:type="paragraph" w:styleId="berschrift5">
+  <w:style w:type="paragraph" w:styleId="Heading5">
     <w:name w:val="heading 5"/>
-    <w:basedOn w:val="Standard"/>
-    <w:next w:val="Standard"/>
-    <w:link w:val="berschrift5Zchn"/>
+    <w:basedOn w:val="Normal"/>
+    <w:next w:val="Normal"/>
+    <w:link w:val="Heading5Char"/>
     <w:uiPriority w:val="9"/>
     <w:semiHidden/>
     <w:unhideWhenUsed/>
@@ -2066,11 +2139,11 @@
       <w:color w:val="0F4761" w:themeColor="accent1" w:themeShade="BF"/>
     </w:rPr>
   </w:style>
-  <w:style w:type="paragraph" w:styleId="berschrift6">
+  <w:style w:type="paragraph" w:styleId="Heading6">
     <w:name w:val="heading 6"/>
-    <w:basedOn w:val="Standard"/>
-    <w:next w:val="Standard"/>
-    <w:link w:val="berschrift6Zchn"/>
+    <w:basedOn w:val="Normal"/>
+    <w:next w:val="Normal"/>
+    <w:link w:val="Heading6Char"/>
     <w:uiPriority w:val="9"/>
     <w:semiHidden/>
     <w:unhideWhenUsed/>
@@ -2089,11 +2162,11 @@
       <w:color w:val="595959" w:themeColor="text1" w:themeTint="A6"/>
     </w:rPr>
   </w:style>
-  <w:style w:type="paragraph" w:styleId="berschrift7">
+  <w:style w:type="paragraph" w:styleId="Heading7">
     <w:name w:val="heading 7"/>
-    <w:basedOn w:val="Standard"/>
-    <w:next w:val="Standard"/>
-    <w:link w:val="berschrift7Zchn"/>
+    <w:basedOn w:val="Normal"/>
+    <w:next w:val="Normal"/>
+    <w:link w:val="Heading7Char"/>
     <w:uiPriority w:val="9"/>
     <w:semiHidden/>
     <w:unhideWhenUsed/>
@@ -2110,11 +2183,11 @@
       <w:color w:val="595959" w:themeColor="text1" w:themeTint="A6"/>
     </w:rPr>
   </w:style>
-  <w:style w:type="paragraph" w:styleId="berschrift8">
+  <w:style w:type="paragraph" w:styleId="Heading8">
     <w:name w:val="heading 8"/>
-    <w:basedOn w:val="Standard"/>
-    <w:next w:val="Standard"/>
-    <w:link w:val="berschrift8Zchn"/>
+    <w:basedOn w:val="Normal"/>
+    <w:next w:val="Normal"/>
+    <w:link w:val="Heading8Char"/>
     <w:uiPriority w:val="9"/>
     <w:semiHidden/>
     <w:unhideWhenUsed/>
@@ -2133,11 +2206,11 @@
       <w:color w:val="272727" w:themeColor="text1" w:themeTint="D8"/>
     </w:rPr>
   </w:style>
-  <w:style w:type="paragraph" w:styleId="berschrift9">
+  <w:style w:type="paragraph" w:styleId="Heading9">
     <w:name w:val="heading 9"/>
-    <w:basedOn w:val="Standard"/>
-    <w:next w:val="Standard"/>
-    <w:link w:val="berschrift9Zchn"/>
+    <w:basedOn w:val="Normal"/>
+    <w:next w:val="Normal"/>
+    <w:link w:val="Heading9Char"/>
     <w:uiPriority w:val="9"/>
     <w:semiHidden/>
     <w:unhideWhenUsed/>
@@ -2154,13 +2227,13 @@
       <w:color w:val="272727" w:themeColor="text1" w:themeTint="D8"/>
     </w:rPr>
   </w:style>
-  <w:style w:type="character" w:default="1" w:styleId="Absatz-Standardschriftart">
+  <w:style w:type="character" w:default="1" w:styleId="DefaultParagraphFont">
     <w:name w:val="Default Paragraph Font"/>
     <w:uiPriority w:val="1"/>
     <w:semiHidden/>
     <w:unhideWhenUsed/>
   </w:style>
-  <w:style w:type="table" w:default="1" w:styleId="NormaleTabelle">
+  <w:style w:type="table" w:default="1" w:styleId="TableNormal">
     <w:name w:val="Normal Table"/>
     <w:uiPriority w:val="99"/>
     <w:semiHidden/>
@@ -2175,16 +2248,16 @@
       </w:tblCellMar>
     </w:tblPr>
   </w:style>
-  <w:style w:type="numbering" w:default="1" w:styleId="KeineListe">
+  <w:style w:type="numbering" w:default="1" w:styleId="NoList">
     <w:name w:val="No List"/>
     <w:uiPriority w:val="99"/>
     <w:semiHidden/>
     <w:unhideWhenUsed/>
   </w:style>
-  <w:style w:type="character" w:customStyle="1" w:styleId="berschrift1Zchn">
-    <w:name w:val="Überschrift 1 Zchn"/>
-    <w:basedOn w:val="Absatz-Standardschriftart"/>
-    <w:link w:val="berschrift1"/>
+  <w:style w:type="character" w:customStyle="1" w:styleId="Heading1Char">
+    <w:name w:val="Heading 1 Char"/>
+    <w:basedOn w:val="DefaultParagraphFont"/>
+    <w:link w:val="Heading1"/>
     <w:uiPriority w:val="9"/>
     <w:rsid w:val="00080235"/>
     <w:rPr>
@@ -2194,10 +2267,10 @@
       <w:szCs w:val="40"/>
     </w:rPr>
   </w:style>
-  <w:style w:type="character" w:customStyle="1" w:styleId="berschrift2Zchn">
-    <w:name w:val="Überschrift 2 Zchn"/>
-    <w:basedOn w:val="Absatz-Standardschriftart"/>
-    <w:link w:val="berschrift2"/>
+  <w:style w:type="character" w:customStyle="1" w:styleId="Heading2Char">
+    <w:name w:val="Heading 2 Char"/>
+    <w:basedOn w:val="DefaultParagraphFont"/>
+    <w:link w:val="Heading2"/>
     <w:uiPriority w:val="9"/>
     <w:semiHidden/>
     <w:rsid w:val="00080235"/>
@@ -2208,10 +2281,10 @@
       <w:szCs w:val="32"/>
     </w:rPr>
   </w:style>
-  <w:style w:type="character" w:customStyle="1" w:styleId="berschrift3Zchn">
-    <w:name w:val="Überschrift 3 Zchn"/>
-    <w:basedOn w:val="Absatz-Standardschriftart"/>
-    <w:link w:val="berschrift3"/>
+  <w:style w:type="character" w:customStyle="1" w:styleId="Heading3Char">
+    <w:name w:val="Heading 3 Char"/>
+    <w:basedOn w:val="DefaultParagraphFont"/>
+    <w:link w:val="Heading3"/>
     <w:uiPriority w:val="9"/>
     <w:semiHidden/>
     <w:rsid w:val="00080235"/>
@@ -2222,10 +2295,10 @@
       <w:szCs w:val="28"/>
     </w:rPr>
   </w:style>
-  <w:style w:type="character" w:customStyle="1" w:styleId="berschrift4Zchn">
-    <w:name w:val="Überschrift 4 Zchn"/>
-    <w:basedOn w:val="Absatz-Standardschriftart"/>
-    <w:link w:val="berschrift4"/>
+  <w:style w:type="character" w:customStyle="1" w:styleId="Heading4Char">
+    <w:name w:val="Heading 4 Char"/>
+    <w:basedOn w:val="DefaultParagraphFont"/>
+    <w:link w:val="Heading4"/>
     <w:uiPriority w:val="9"/>
     <w:semiHidden/>
     <w:rsid w:val="00080235"/>
@@ -2236,10 +2309,10 @@
       <w:color w:val="0F4761" w:themeColor="accent1" w:themeShade="BF"/>
     </w:rPr>
   </w:style>
-  <w:style w:type="character" w:customStyle="1" w:styleId="berschrift5Zchn">
-    <w:name w:val="Überschrift 5 Zchn"/>
-    <w:basedOn w:val="Absatz-Standardschriftart"/>
-    <w:link w:val="berschrift5"/>
+  <w:style w:type="character" w:customStyle="1" w:styleId="Heading5Char">
+    <w:name w:val="Heading 5 Char"/>
+    <w:basedOn w:val="DefaultParagraphFont"/>
+    <w:link w:val="Heading5"/>
     <w:uiPriority w:val="9"/>
     <w:semiHidden/>
     <w:rsid w:val="00080235"/>
@@ -2248,10 +2321,10 @@
       <w:color w:val="0F4761" w:themeColor="accent1" w:themeShade="BF"/>
     </w:rPr>
   </w:style>
-  <w:style w:type="character" w:customStyle="1" w:styleId="berschrift6Zchn">
-    <w:name w:val="Überschrift 6 Zchn"/>
-    <w:basedOn w:val="Absatz-Standardschriftart"/>
-    <w:link w:val="berschrift6"/>
+  <w:style w:type="character" w:customStyle="1" w:styleId="Heading6Char">
+    <w:name w:val="Heading 6 Char"/>
+    <w:basedOn w:val="DefaultParagraphFont"/>
+    <w:link w:val="Heading6"/>
     <w:uiPriority w:val="9"/>
     <w:semiHidden/>
     <w:rsid w:val="00080235"/>
@@ -2262,10 +2335,10 @@
       <w:color w:val="595959" w:themeColor="text1" w:themeTint="A6"/>
     </w:rPr>
   </w:style>
-  <w:style w:type="character" w:customStyle="1" w:styleId="berschrift7Zchn">
-    <w:name w:val="Überschrift 7 Zchn"/>
-    <w:basedOn w:val="Absatz-Standardschriftart"/>
-    <w:link w:val="berschrift7"/>
+  <w:style w:type="character" w:customStyle="1" w:styleId="Heading7Char">
+    <w:name w:val="Heading 7 Char"/>
+    <w:basedOn w:val="DefaultParagraphFont"/>
+    <w:link w:val="Heading7"/>
     <w:uiPriority w:val="9"/>
     <w:semiHidden/>
     <w:rsid w:val="00080235"/>
@@ -2274,10 +2347,10 @@
       <w:color w:val="595959" w:themeColor="text1" w:themeTint="A6"/>
     </w:rPr>
   </w:style>
-  <w:style w:type="character" w:customStyle="1" w:styleId="berschrift8Zchn">
-    <w:name w:val="Überschrift 8 Zchn"/>
-    <w:basedOn w:val="Absatz-Standardschriftart"/>
-    <w:link w:val="berschrift8"/>
+  <w:style w:type="character" w:customStyle="1" w:styleId="Heading8Char">
+    <w:name w:val="Heading 8 Char"/>
+    <w:basedOn w:val="DefaultParagraphFont"/>
+    <w:link w:val="Heading8"/>
     <w:uiPriority w:val="9"/>
     <w:semiHidden/>
     <w:rsid w:val="00080235"/>
@@ -2288,10 +2361,10 @@
       <w:color w:val="272727" w:themeColor="text1" w:themeTint="D8"/>
     </w:rPr>
   </w:style>
-  <w:style w:type="character" w:customStyle="1" w:styleId="berschrift9Zchn">
-    <w:name w:val="Überschrift 9 Zchn"/>
-    <w:basedOn w:val="Absatz-Standardschriftart"/>
-    <w:link w:val="berschrift9"/>
+  <w:style w:type="character" w:customStyle="1" w:styleId="Heading9Char">
+    <w:name w:val="Heading 9 Char"/>
+    <w:basedOn w:val="DefaultParagraphFont"/>
+    <w:link w:val="Heading9"/>
     <w:uiPriority w:val="9"/>
     <w:semiHidden/>
     <w:rsid w:val="00080235"/>
@@ -2300,11 +2373,11 @@
       <w:color w:val="272727" w:themeColor="text1" w:themeTint="D8"/>
     </w:rPr>
   </w:style>
-  <w:style w:type="paragraph" w:styleId="Titel">
+  <w:style w:type="paragraph" w:styleId="Title">
     <w:name w:val="Title"/>
-    <w:basedOn w:val="Standard"/>
-    <w:next w:val="Standard"/>
-    <w:link w:val="TitelZchn"/>
+    <w:basedOn w:val="Normal"/>
+    <w:next w:val="Normal"/>
+    <w:link w:val="TitleChar"/>
     <w:uiPriority w:val="10"/>
     <w:qFormat/>
     <w:rsid w:val="00080235"/>
@@ -2320,10 +2393,10 @@
       <w:szCs w:val="56"/>
     </w:rPr>
   </w:style>
-  <w:style w:type="character" w:customStyle="1" w:styleId="TitelZchn">
-    <w:name w:val="Titel Zchn"/>
-    <w:basedOn w:val="Absatz-Standardschriftart"/>
-    <w:link w:val="Titel"/>
+  <w:style w:type="character" w:customStyle="1" w:styleId="TitleChar">
+    <w:name w:val="Title Char"/>
+    <w:basedOn w:val="DefaultParagraphFont"/>
+    <w:link w:val="Title"/>
     <w:uiPriority w:val="10"/>
     <w:rsid w:val="00080235"/>
     <w:rPr>
@@ -2334,11 +2407,11 @@
       <w:szCs w:val="56"/>
     </w:rPr>
   </w:style>
-  <w:style w:type="paragraph" w:styleId="Untertitel">
+  <w:style w:type="paragraph" w:styleId="Subtitle">
     <w:name w:val="Subtitle"/>
-    <w:basedOn w:val="Standard"/>
-    <w:next w:val="Standard"/>
-    <w:link w:val="UntertitelZchn"/>
+    <w:basedOn w:val="Normal"/>
+    <w:next w:val="Normal"/>
+    <w:link w:val="SubtitleChar"/>
     <w:uiPriority w:val="11"/>
     <w:qFormat/>
     <w:rsid w:val="00080235"/>
@@ -2355,10 +2428,10 @@
       <w:szCs w:val="28"/>
     </w:rPr>
   </w:style>
-  <w:style w:type="character" w:customStyle="1" w:styleId="UntertitelZchn">
-    <w:name w:val="Untertitel Zchn"/>
-    <w:basedOn w:val="Absatz-Standardschriftart"/>
-    <w:link w:val="Untertitel"/>
+  <w:style w:type="character" w:customStyle="1" w:styleId="SubtitleChar">
+    <w:name w:val="Subtitle Char"/>
+    <w:basedOn w:val="DefaultParagraphFont"/>
+    <w:link w:val="Subtitle"/>
     <w:uiPriority w:val="11"/>
     <w:rsid w:val="00080235"/>
     <w:rPr>
@@ -2369,11 +2442,11 @@
       <w:szCs w:val="28"/>
     </w:rPr>
   </w:style>
-  <w:style w:type="paragraph" w:styleId="Zitat">
+  <w:style w:type="paragraph" w:styleId="Quote">
     <w:name w:val="Quote"/>
-    <w:basedOn w:val="Standard"/>
-    <w:next w:val="Standard"/>
-    <w:link w:val="ZitatZchn"/>
+    <w:basedOn w:val="Normal"/>
+    <w:next w:val="Normal"/>
+    <w:link w:val="QuoteChar"/>
     <w:uiPriority w:val="29"/>
     <w:qFormat/>
     <w:rsid w:val="00080235"/>
@@ -2387,10 +2460,10 @@
       <w:color w:val="404040" w:themeColor="text1" w:themeTint="BF"/>
     </w:rPr>
   </w:style>
-  <w:style w:type="character" w:customStyle="1" w:styleId="ZitatZchn">
-    <w:name w:val="Zitat Zchn"/>
-    <w:basedOn w:val="Absatz-Standardschriftart"/>
-    <w:link w:val="Zitat"/>
+  <w:style w:type="character" w:customStyle="1" w:styleId="QuoteChar">
+    <w:name w:val="Quote Char"/>
+    <w:basedOn w:val="DefaultParagraphFont"/>
+    <w:link w:val="Quote"/>
     <w:uiPriority w:val="29"/>
     <w:rsid w:val="00080235"/>
     <w:rPr>
@@ -2399,9 +2472,9 @@
       <w:color w:val="404040" w:themeColor="text1" w:themeTint="BF"/>
     </w:rPr>
   </w:style>
-  <w:style w:type="paragraph" w:styleId="Listenabsatz">
+  <w:style w:type="paragraph" w:styleId="ListParagraph">
     <w:name w:val="List Paragraph"/>
-    <w:basedOn w:val="Standard"/>
+    <w:basedOn w:val="Normal"/>
     <w:uiPriority w:val="34"/>
     <w:qFormat/>
     <w:rsid w:val="00080235"/>
@@ -2410,9 +2483,9 @@
       <w:contextualSpacing/>
     </w:pPr>
   </w:style>
-  <w:style w:type="character" w:styleId="IntensiveHervorhebung">
+  <w:style w:type="character" w:styleId="IntenseEmphasis">
     <w:name w:val="Intense Emphasis"/>
-    <w:basedOn w:val="Absatz-Standardschriftart"/>
+    <w:basedOn w:val="DefaultParagraphFont"/>
     <w:uiPriority w:val="21"/>
     <w:qFormat/>
     <w:rsid w:val="00080235"/>
@@ -2422,11 +2495,11 @@
       <w:color w:val="0F4761" w:themeColor="accent1" w:themeShade="BF"/>
     </w:rPr>
   </w:style>
-  <w:style w:type="paragraph" w:styleId="IntensivesZitat">
+  <w:style w:type="paragraph" w:styleId="IntenseQuote">
     <w:name w:val="Intense Quote"/>
-    <w:basedOn w:val="Standard"/>
-    <w:next w:val="Standard"/>
-    <w:link w:val="IntensivesZitatZchn"/>
+    <w:basedOn w:val="Normal"/>
+    <w:next w:val="Normal"/>
+    <w:link w:val="IntenseQuoteChar"/>
     <w:uiPriority w:val="30"/>
     <w:qFormat/>
     <w:rsid w:val="00080235"/>
@@ -2445,10 +2518,10 @@
       <w:color w:val="0F4761" w:themeColor="accent1" w:themeShade="BF"/>
     </w:rPr>
   </w:style>
-  <w:style w:type="character" w:customStyle="1" w:styleId="IntensivesZitatZchn">
-    <w:name w:val="Intensives Zitat Zchn"/>
-    <w:basedOn w:val="Absatz-Standardschriftart"/>
-    <w:link w:val="IntensivesZitat"/>
+  <w:style w:type="character" w:customStyle="1" w:styleId="IntenseQuoteChar">
+    <w:name w:val="Intense Quote Char"/>
+    <w:basedOn w:val="DefaultParagraphFont"/>
+    <w:link w:val="IntenseQuote"/>
     <w:uiPriority w:val="30"/>
     <w:rsid w:val="00080235"/>
     <w:rPr>
@@ -2457,9 +2530,9 @@
       <w:color w:val="0F4761" w:themeColor="accent1" w:themeShade="BF"/>
     </w:rPr>
   </w:style>
-  <w:style w:type="character" w:styleId="IntensiverVerweis">
+  <w:style w:type="character" w:styleId="IntenseReference">
     <w:name w:val="Intense Reference"/>
-    <w:basedOn w:val="Absatz-Standardschriftart"/>
+    <w:basedOn w:val="DefaultParagraphFont"/>
     <w:uiPriority w:val="32"/>
     <w:qFormat/>
     <w:rsid w:val="00080235"/>

</xml_diff>

<commit_message>
Fix plotting of spectrum and added dBm plot to pulse compression
</commit_message>
<xml_diff>
--- a/Thesis Overview.docx
+++ b/Thesis Overview.docx
@@ -4,7 +4,7 @@
   <w:body>
     <w:p>
       <w:pPr>
-        <w:pStyle w:val="ListParagraph"/>
+        <w:pStyle w:val="Listenabsatz"/>
         <w:numPr>
           <w:ilvl w:val="0"/>
           <w:numId w:val="2"/>
@@ -22,7 +22,7 @@
     </w:p>
     <w:p>
       <w:pPr>
-        <w:pStyle w:val="ListParagraph"/>
+        <w:pStyle w:val="Listenabsatz"/>
         <w:rPr>
           <w:lang w:val="en-US"/>
         </w:rPr>
@@ -36,15 +36,15 @@
     </w:p>
     <w:p>
       <w:pPr>
-        <w:pStyle w:val="ListParagraph"/>
-        <w:rPr>
-          <w:lang w:val="en-US"/>
-        </w:rPr>
-      </w:pPr>
-    </w:p>
-    <w:p>
-      <w:pPr>
-        <w:pStyle w:val="ListParagraph"/>
+        <w:pStyle w:val="Listenabsatz"/>
+        <w:rPr>
+          <w:lang w:val="en-US"/>
+        </w:rPr>
+      </w:pPr>
+    </w:p>
+    <w:p>
+      <w:pPr>
+        <w:pStyle w:val="Listenabsatz"/>
         <w:rPr>
           <w:lang w:val="en-US"/>
         </w:rPr>
@@ -89,7 +89,21 @@
         <w:rPr>
           <w:lang w:val="en-US"/>
         </w:rPr>
-        <w:t xml:space="preserve"> at o/p (side lobes in freq), back into Rx, </w:t>
+        <w:t xml:space="preserve"> at o/p (side lobes in </w:t>
+      </w:r>
+      <w:proofErr w:type="spellStart"/>
+      <w:r>
+        <w:rPr>
+          <w:lang w:val="en-US"/>
+        </w:rPr>
+        <w:t>freq</w:t>
+      </w:r>
+      <w:proofErr w:type="spellEnd"/>
+      <w:r>
+        <w:rPr>
+          <w:lang w:val="en-US"/>
+        </w:rPr>
+        <w:t xml:space="preserve">), back into Rx, </w:t>
       </w:r>
       <w:r>
         <w:rPr>
@@ -106,7 +120,7 @@
     </w:p>
     <w:p>
       <w:pPr>
-        <w:pStyle w:val="ListParagraph"/>
+        <w:pStyle w:val="Listenabsatz"/>
         <w:rPr>
           <w:lang w:val="en-US"/>
         </w:rPr>
@@ -120,15 +134,15 @@
     </w:p>
     <w:p>
       <w:pPr>
-        <w:pStyle w:val="ListParagraph"/>
-        <w:rPr>
-          <w:lang w:val="en-US"/>
-        </w:rPr>
-      </w:pPr>
-    </w:p>
-    <w:p>
-      <w:pPr>
-        <w:pStyle w:val="ListParagraph"/>
+        <w:pStyle w:val="Listenabsatz"/>
+        <w:rPr>
+          <w:lang w:val="en-US"/>
+        </w:rPr>
+      </w:pPr>
+    </w:p>
+    <w:p>
+      <w:pPr>
+        <w:pStyle w:val="Listenabsatz"/>
         <w:rPr>
           <w:lang w:val="en-US"/>
         </w:rPr>
@@ -154,7 +168,7 @@
     </w:p>
     <w:p>
       <w:pPr>
-        <w:pStyle w:val="ListParagraph"/>
+        <w:pStyle w:val="Listenabsatz"/>
         <w:rPr>
           <w:lang w:val="en-US"/>
         </w:rPr>
@@ -187,15 +201,15 @@
     </w:p>
     <w:p>
       <w:pPr>
-        <w:pStyle w:val="ListParagraph"/>
-        <w:rPr>
-          <w:lang w:val="en-US"/>
-        </w:rPr>
-      </w:pPr>
-    </w:p>
-    <w:p>
-      <w:pPr>
-        <w:pStyle w:val="ListParagraph"/>
+        <w:pStyle w:val="Listenabsatz"/>
+        <w:rPr>
+          <w:lang w:val="en-US"/>
+        </w:rPr>
+      </w:pPr>
+    </w:p>
+    <w:p>
+      <w:pPr>
+        <w:pStyle w:val="Listenabsatz"/>
         <w:numPr>
           <w:ilvl w:val="0"/>
           <w:numId w:val="2"/>
@@ -213,7 +227,7 @@
     </w:p>
     <w:p>
       <w:pPr>
-        <w:pStyle w:val="ListParagraph"/>
+        <w:pStyle w:val="Listenabsatz"/>
         <w:rPr>
           <w:lang w:val="en-US"/>
         </w:rPr>
@@ -234,7 +248,7 @@
     </w:p>
     <w:p>
       <w:pPr>
-        <w:pStyle w:val="ListParagraph"/>
+        <w:pStyle w:val="Listenabsatz"/>
         <w:numPr>
           <w:ilvl w:val="0"/>
           <w:numId w:val="2"/>
@@ -252,7 +266,7 @@
     </w:p>
     <w:p>
       <w:pPr>
-        <w:pStyle w:val="ListParagraph"/>
+        <w:pStyle w:val="Listenabsatz"/>
         <w:rPr>
           <w:lang w:val="en-US"/>
         </w:rPr>
@@ -278,7 +292,7 @@
     </w:p>
     <w:p>
       <w:pPr>
-        <w:pStyle w:val="ListParagraph"/>
+        <w:pStyle w:val="Listenabsatz"/>
         <w:rPr>
           <w:lang w:val="en-US"/>
         </w:rPr>
@@ -292,7 +306,7 @@
     </w:p>
     <w:p>
       <w:pPr>
-        <w:pStyle w:val="ListParagraph"/>
+        <w:pStyle w:val="Listenabsatz"/>
         <w:rPr>
           <w:lang w:val="en-US"/>
         </w:rPr>
@@ -306,15 +320,15 @@
     </w:p>
     <w:p>
       <w:pPr>
-        <w:pStyle w:val="ListParagraph"/>
-        <w:rPr>
-          <w:lang w:val="en-US"/>
-        </w:rPr>
-      </w:pPr>
-    </w:p>
-    <w:p>
-      <w:pPr>
-        <w:pStyle w:val="ListParagraph"/>
+        <w:pStyle w:val="Listenabsatz"/>
+        <w:rPr>
+          <w:lang w:val="en-US"/>
+        </w:rPr>
+      </w:pPr>
+    </w:p>
+    <w:p>
+      <w:pPr>
+        <w:pStyle w:val="Listenabsatz"/>
         <w:numPr>
           <w:ilvl w:val="0"/>
           <w:numId w:val="2"/>
@@ -332,7 +346,7 @@
     </w:p>
     <w:p>
       <w:pPr>
-        <w:pStyle w:val="ListParagraph"/>
+        <w:pStyle w:val="Listenabsatz"/>
         <w:rPr>
           <w:lang w:val="en-US"/>
         </w:rPr>
@@ -346,21 +360,35 @@
     </w:p>
     <w:p>
       <w:pPr>
-        <w:pStyle w:val="ListParagraph"/>
-        <w:rPr>
-          <w:lang w:val="en-US"/>
-        </w:rPr>
-      </w:pPr>
-      <w:r>
-        <w:rPr>
-          <w:lang w:val="en-US"/>
-        </w:rPr>
-        <w:t>Open loop – i/p changes depending on what we measure at o/p</w:t>
-      </w:r>
-    </w:p>
-    <w:p>
-      <w:pPr>
-        <w:pStyle w:val="ListParagraph"/>
+        <w:pStyle w:val="Listenabsatz"/>
+        <w:rPr>
+          <w:lang w:val="en-US"/>
+        </w:rPr>
+      </w:pPr>
+      <w:r>
+        <w:rPr>
+          <w:lang w:val="en-US"/>
+        </w:rPr>
+        <w:t xml:space="preserve">Open loop – </w:t>
+      </w:r>
+      <w:proofErr w:type="spellStart"/>
+      <w:r>
+        <w:rPr>
+          <w:lang w:val="en-US"/>
+        </w:rPr>
+        <w:t>i</w:t>
+      </w:r>
+      <w:proofErr w:type="spellEnd"/>
+      <w:r>
+        <w:rPr>
+          <w:lang w:val="en-US"/>
+        </w:rPr>
+        <w:t>/p changes depending on what we measure at o/p</w:t>
+      </w:r>
+    </w:p>
+    <w:p>
+      <w:pPr>
+        <w:pStyle w:val="Listenabsatz"/>
         <w:rPr>
           <w:lang w:val="en-US"/>
         </w:rPr>
@@ -374,7 +402,7 @@
     </w:p>
     <w:p>
       <w:pPr>
-        <w:pStyle w:val="ListParagraph"/>
+        <w:pStyle w:val="Listenabsatz"/>
         <w:rPr>
           <w:lang w:val="en-US"/>
         </w:rPr>
@@ -388,7 +416,7 @@
     </w:p>
     <w:p>
       <w:pPr>
-        <w:pStyle w:val="ListParagraph"/>
+        <w:pStyle w:val="Listenabsatz"/>
         <w:rPr>
           <w:lang w:val="en-US"/>
         </w:rPr>
@@ -402,15 +430,15 @@
     </w:p>
     <w:p>
       <w:pPr>
-        <w:pStyle w:val="ListParagraph"/>
-        <w:rPr>
-          <w:lang w:val="en-US"/>
-        </w:rPr>
-      </w:pPr>
-    </w:p>
-    <w:p>
-      <w:pPr>
-        <w:pStyle w:val="ListParagraph"/>
+        <w:pStyle w:val="Listenabsatz"/>
+        <w:rPr>
+          <w:lang w:val="en-US"/>
+        </w:rPr>
+      </w:pPr>
+    </w:p>
+    <w:p>
+      <w:pPr>
+        <w:pStyle w:val="Listenabsatz"/>
         <w:rPr>
           <w:lang w:val="en-US"/>
         </w:rPr>
@@ -424,7 +452,7 @@
     </w:p>
     <w:p>
       <w:pPr>
-        <w:pStyle w:val="ListParagraph"/>
+        <w:pStyle w:val="Listenabsatz"/>
         <w:rPr>
           <w:lang w:val="en-US"/>
         </w:rPr>
@@ -438,7 +466,7 @@
     </w:p>
     <w:p>
       <w:pPr>
-        <w:pStyle w:val="ListParagraph"/>
+        <w:pStyle w:val="Listenabsatz"/>
         <w:rPr>
           <w:lang w:val="en-US"/>
         </w:rPr>
@@ -452,17 +480,25 @@
     </w:p>
     <w:p>
       <w:pPr>
-        <w:pStyle w:val="ListParagraph"/>
-        <w:rPr>
-          <w:lang w:val="en-US"/>
-        </w:rPr>
-      </w:pPr>
-      <w:r>
-        <w:rPr>
-          <w:lang w:val="en-US"/>
-        </w:rPr>
-        <w:t>Settings.xml parametres</w:t>
-      </w:r>
+        <w:pStyle w:val="Listenabsatz"/>
+        <w:rPr>
+          <w:lang w:val="en-US"/>
+        </w:rPr>
+      </w:pPr>
+      <w:r>
+        <w:rPr>
+          <w:lang w:val="en-US"/>
+        </w:rPr>
+        <w:t xml:space="preserve">Settings.xml </w:t>
+      </w:r>
+      <w:proofErr w:type="spellStart"/>
+      <w:r>
+        <w:rPr>
+          <w:lang w:val="en-US"/>
+        </w:rPr>
+        <w:t>parametres</w:t>
+      </w:r>
+      <w:proofErr w:type="spellEnd"/>
       <w:r>
         <w:rPr>
           <w:lang w:val="en-US"/>
@@ -472,29 +508,43 @@
     </w:p>
     <w:p>
       <w:pPr>
-        <w:pStyle w:val="ListParagraph"/>
-        <w:rPr>
-          <w:lang w:val="en-US"/>
-        </w:rPr>
-      </w:pPr>
-    </w:p>
-    <w:p>
-      <w:pPr>
-        <w:pStyle w:val="ListParagraph"/>
-        <w:rPr>
-          <w:lang w:val="en-US"/>
-        </w:rPr>
-      </w:pPr>
-      <w:r>
-        <w:rPr>
-          <w:lang w:val="en-US"/>
-        </w:rPr>
-        <w:t>Available models for predistortion. Simple ones first – AM,AM conversion</w:t>
-      </w:r>
-    </w:p>
-    <w:p>
-      <w:pPr>
-        <w:pStyle w:val="ListParagraph"/>
+        <w:pStyle w:val="Listenabsatz"/>
+        <w:rPr>
+          <w:lang w:val="en-US"/>
+        </w:rPr>
+      </w:pPr>
+    </w:p>
+    <w:p>
+      <w:pPr>
+        <w:pStyle w:val="Listenabsatz"/>
+        <w:rPr>
+          <w:lang w:val="en-US"/>
+        </w:rPr>
+      </w:pPr>
+      <w:r>
+        <w:rPr>
+          <w:lang w:val="en-US"/>
+        </w:rPr>
+        <w:t xml:space="preserve">Available models for predistortion. Simple ones first – </w:t>
+      </w:r>
+      <w:proofErr w:type="gramStart"/>
+      <w:r>
+        <w:rPr>
+          <w:lang w:val="en-US"/>
+        </w:rPr>
+        <w:t>AM,AM</w:t>
+      </w:r>
+      <w:proofErr w:type="gramEnd"/>
+      <w:r>
+        <w:rPr>
+          <w:lang w:val="en-US"/>
+        </w:rPr>
+        <w:t xml:space="preserve"> conversion</w:t>
+      </w:r>
+    </w:p>
+    <w:p>
+      <w:pPr>
+        <w:pStyle w:val="Listenabsatz"/>
         <w:rPr>
           <w:lang w:val="en-US"/>
         </w:rPr>
@@ -508,7 +558,7 @@
     </w:p>
     <w:p>
       <w:pPr>
-        <w:pStyle w:val="ListParagraph"/>
+        <w:pStyle w:val="Listenabsatz"/>
         <w:rPr>
           <w:lang w:val="en-US"/>
         </w:rPr>
@@ -522,15 +572,15 @@
     </w:p>
     <w:p>
       <w:pPr>
-        <w:pStyle w:val="ListParagraph"/>
-        <w:rPr>
-          <w:lang w:val="en-US"/>
-        </w:rPr>
-      </w:pPr>
-    </w:p>
-    <w:p>
-      <w:pPr>
-        <w:pStyle w:val="ListParagraph"/>
+        <w:pStyle w:val="Listenabsatz"/>
+        <w:rPr>
+          <w:lang w:val="en-US"/>
+        </w:rPr>
+      </w:pPr>
+    </w:p>
+    <w:p>
+      <w:pPr>
+        <w:pStyle w:val="Listenabsatz"/>
         <w:rPr>
           <w:lang w:val="en-US"/>
         </w:rPr>
@@ -568,7 +618,7 @@
     </w:p>
     <w:p>
       <w:pPr>
-        <w:pStyle w:val="ListParagraph"/>
+        <w:pStyle w:val="Listenabsatz"/>
         <w:rPr>
           <w:lang w:val="en-US"/>
         </w:rPr>
@@ -588,15 +638,15 @@
     </w:p>
     <w:p>
       <w:pPr>
-        <w:pStyle w:val="ListParagraph"/>
-        <w:rPr>
-          <w:lang w:val="en-US"/>
-        </w:rPr>
-      </w:pPr>
-    </w:p>
-    <w:p>
-      <w:pPr>
-        <w:pStyle w:val="ListParagraph"/>
+        <w:pStyle w:val="Listenabsatz"/>
+        <w:rPr>
+          <w:lang w:val="en-US"/>
+        </w:rPr>
+      </w:pPr>
+    </w:p>
+    <w:p>
+      <w:pPr>
+        <w:pStyle w:val="Listenabsatz"/>
         <w:rPr>
           <w:lang w:val="en-US"/>
         </w:rPr>
@@ -610,7 +660,7 @@
     </w:p>
     <w:p>
       <w:pPr>
-        <w:pStyle w:val="ListParagraph"/>
+        <w:pStyle w:val="Listenabsatz"/>
         <w:rPr>
           <w:lang w:val="en-US"/>
         </w:rPr>
@@ -625,15 +675,15 @@
     </w:p>
     <w:p>
       <w:pPr>
-        <w:pStyle w:val="ListParagraph"/>
-        <w:rPr>
-          <w:lang w:val="en-US"/>
-        </w:rPr>
-      </w:pPr>
-    </w:p>
-    <w:p>
-      <w:pPr>
-        <w:pStyle w:val="ListParagraph"/>
+        <w:pStyle w:val="Listenabsatz"/>
+        <w:rPr>
+          <w:lang w:val="en-US"/>
+        </w:rPr>
+      </w:pPr>
+    </w:p>
+    <w:p>
+      <w:pPr>
+        <w:pStyle w:val="Listenabsatz"/>
         <w:rPr>
           <w:u w:val="single"/>
           <w:lang w:val="en-US"/>
@@ -649,7 +699,7 @@
     </w:p>
     <w:p>
       <w:pPr>
-        <w:pStyle w:val="ListParagraph"/>
+        <w:pStyle w:val="Listenabsatz"/>
         <w:rPr>
           <w:lang w:val="en-US"/>
         </w:rPr>
@@ -663,7 +713,7 @@
     </w:p>
     <w:p>
       <w:pPr>
-        <w:pStyle w:val="ListParagraph"/>
+        <w:pStyle w:val="Listenabsatz"/>
         <w:rPr>
           <w:lang w:val="en-US"/>
         </w:rPr>
@@ -677,21 +727,35 @@
     </w:p>
     <w:p>
       <w:pPr>
-        <w:pStyle w:val="ListParagraph"/>
-        <w:rPr>
-          <w:lang w:val="en-US"/>
-        </w:rPr>
-      </w:pPr>
-      <w:r>
-        <w:rPr>
-          <w:lang w:val="en-US"/>
-        </w:rPr>
-        <w:t>Look at other filters (and components) in FEC Commissioning Doc and see if you need to incorporate them too (e.g. harmonic filter, IF complex filter etc)</w:t>
-      </w:r>
-    </w:p>
-    <w:p>
-      <w:pPr>
-        <w:pStyle w:val="ListParagraph"/>
+        <w:pStyle w:val="Listenabsatz"/>
+        <w:rPr>
+          <w:lang w:val="en-US"/>
+        </w:rPr>
+      </w:pPr>
+      <w:r>
+        <w:rPr>
+          <w:lang w:val="en-US"/>
+        </w:rPr>
+        <w:t xml:space="preserve">Look at other filters (and components) in FEC Commissioning Doc and see if you need to incorporate them too (e.g. harmonic filter, IF complex filter </w:t>
+      </w:r>
+      <w:proofErr w:type="spellStart"/>
+      <w:r>
+        <w:rPr>
+          <w:lang w:val="en-US"/>
+        </w:rPr>
+        <w:t>etc</w:t>
+      </w:r>
+      <w:proofErr w:type="spellEnd"/>
+      <w:r>
+        <w:rPr>
+          <w:lang w:val="en-US"/>
+        </w:rPr>
+        <w:t>)</w:t>
+      </w:r>
+    </w:p>
+    <w:p>
+      <w:pPr>
+        <w:pStyle w:val="Listenabsatz"/>
         <w:rPr>
           <w:lang w:val="en-US"/>
         </w:rPr>
@@ -721,7 +785,7 @@
     </w:p>
     <w:p>
       <w:pPr>
-        <w:pStyle w:val="ListParagraph"/>
+        <w:pStyle w:val="Listenabsatz"/>
         <w:numPr>
           <w:ilvl w:val="0"/>
           <w:numId w:val="4"/>
@@ -734,12 +798,40 @@
         <w:rPr>
           <w:lang w:val="en-US"/>
         </w:rPr>
-        <w:t>Create full Tx/Rx chain for your understanding (also change up/downconversion functions to use time vector. Downmixing result should not be different for different sampling frequencies. You just have more frequency bins in between)</w:t>
-      </w:r>
-    </w:p>
-    <w:p>
-      <w:pPr>
-        <w:pStyle w:val="ListParagraph"/>
+        <w:t>Create full Tx/Rx chain for your understanding (also change up/</w:t>
+      </w:r>
+      <w:proofErr w:type="spellStart"/>
+      <w:r>
+        <w:rPr>
+          <w:lang w:val="en-US"/>
+        </w:rPr>
+        <w:t>downconversion</w:t>
+      </w:r>
+      <w:proofErr w:type="spellEnd"/>
+      <w:r>
+        <w:rPr>
+          <w:lang w:val="en-US"/>
+        </w:rPr>
+        <w:t xml:space="preserve"> functions to use time vector. Downmixing </w:t>
+      </w:r>
+      <w:proofErr w:type="gramStart"/>
+      <w:r>
+        <w:rPr>
+          <w:lang w:val="en-US"/>
+        </w:rPr>
+        <w:t>result</w:t>
+      </w:r>
+      <w:proofErr w:type="gramEnd"/>
+      <w:r>
+        <w:rPr>
+          <w:lang w:val="en-US"/>
+        </w:rPr>
+        <w:t xml:space="preserve"> should not be different for different sampling frequencies. You just have more frequency bins in between)</w:t>
+      </w:r>
+    </w:p>
+    <w:p>
+      <w:pPr>
+        <w:pStyle w:val="Listenabsatz"/>
         <w:numPr>
           <w:ilvl w:val="0"/>
           <w:numId w:val="4"/>
@@ -752,12 +844,52 @@
         <w:rPr>
           <w:lang w:val="en-US"/>
         </w:rPr>
-        <w:t>May need to sample convert to a higher sample rate when going from digital to analogue (10x the bandwidth or whatever Claude said) -  because non linear components may introduce big changes in between samples, that are not captured by a lower sample rate</w:t>
-      </w:r>
-    </w:p>
-    <w:p>
-      <w:pPr>
-        <w:pStyle w:val="ListParagraph"/>
+        <w:t xml:space="preserve">May need to </w:t>
+      </w:r>
+      <w:proofErr w:type="spellStart"/>
+      <w:r>
+        <w:rPr>
+          <w:lang w:val="en-US"/>
+        </w:rPr>
+        <w:t>upsample</w:t>
+      </w:r>
+      <w:proofErr w:type="spellEnd"/>
+      <w:r>
+        <w:rPr>
+          <w:lang w:val="en-US"/>
+        </w:rPr>
+        <w:t xml:space="preserve"> for PA non linearities (To </w:t>
+      </w:r>
+      <w:proofErr w:type="gramStart"/>
+      <w:r>
+        <w:rPr>
+          <w:lang w:val="en-US"/>
+        </w:rPr>
+        <w:t>check:</w:t>
+      </w:r>
+      <w:proofErr w:type="gramEnd"/>
+      <w:r>
+        <w:rPr>
+          <w:lang w:val="en-US"/>
+        </w:rPr>
+        <w:t xml:space="preserve"> </w:t>
+      </w:r>
+      <w:r>
+        <w:rPr>
+          <w:lang w:val="en-NZ"/>
+        </w:rPr>
+        <w:t>after applying the PA, plot the output spectrum and see whether the regrowth skirts have decayed into the noise floor before they reach ±fs/2</w:t>
+      </w:r>
+      <w:r>
+        <w:rPr>
+          <w:lang w:val="en-NZ"/>
+        </w:rPr>
+        <w:t>)</w:t>
+      </w:r>
+    </w:p>
+    <w:p>
+      <w:pPr>
+        <w:pStyle w:val="Listenabsatz"/>
         <w:numPr>
           <w:ilvl w:val="0"/>
           <w:numId w:val="4"/>
@@ -778,11 +910,19 @@
         </w:rPr>
         <w:t xml:space="preserve">e.g. 15dB </w:t>
       </w:r>
-      <w:r>
-        <w:rPr>
-          <w:lang w:val="en-US"/>
-        </w:rPr>
-        <w:t>etc)</w:t>
+      <w:proofErr w:type="spellStart"/>
+      <w:r>
+        <w:rPr>
+          <w:lang w:val="en-US"/>
+        </w:rPr>
+        <w:t>etc</w:t>
+      </w:r>
+      <w:proofErr w:type="spellEnd"/>
+      <w:r>
+        <w:rPr>
+          <w:lang w:val="en-US"/>
+        </w:rPr>
+        <w:t>)</w:t>
       </w:r>
       <w:r>
         <w:rPr>
@@ -793,7 +933,7 @@
     </w:p>
     <w:p>
       <w:pPr>
-        <w:pStyle w:val="ListParagraph"/>
+        <w:pStyle w:val="Listenabsatz"/>
         <w:numPr>
           <w:ilvl w:val="0"/>
           <w:numId w:val="4"/>
@@ -806,12 +946,18 @@
         <w:rPr>
           <w:lang w:val="en-US"/>
         </w:rPr>
-        <w:t>Correct dB plots – wave amplitude to dBm</w:t>
-      </w:r>
-    </w:p>
-    <w:p>
-      <w:pPr>
-        <w:pStyle w:val="ListParagraph"/>
+        <w:t>Modelling non-linearities</w:t>
+      </w:r>
+      <w:r>
+        <w:rPr>
+          <w:lang w:val="en-US"/>
+        </w:rPr>
+        <w:t xml:space="preserve"> – why no sidebands after PA, harmonics have influence on spectrum?</w:t>
+      </w:r>
+    </w:p>
+    <w:p>
+      <w:pPr>
+        <w:pStyle w:val="Listenabsatz"/>
         <w:numPr>
           <w:ilvl w:val="0"/>
           <w:numId w:val="4"/>
@@ -824,36 +970,12 @@
         <w:rPr>
           <w:lang w:val="en-US"/>
         </w:rPr>
-        <w:t>Modelling non-linearities</w:t>
-      </w:r>
-      <w:r>
-        <w:rPr>
-          <w:lang w:val="en-US"/>
-        </w:rPr>
-        <w:t xml:space="preserve"> – why no sidebands after PA, harmonics have influence on spectrum?</w:t>
-      </w:r>
-    </w:p>
-    <w:p>
-      <w:pPr>
-        <w:pStyle w:val="ListParagraph"/>
-        <w:numPr>
-          <w:ilvl w:val="0"/>
-          <w:numId w:val="4"/>
-        </w:numPr>
-        <w:rPr>
-          <w:lang w:val="en-US"/>
-        </w:rPr>
-      </w:pPr>
-      <w:r>
-        <w:rPr>
-          <w:lang w:val="en-US"/>
-        </w:rPr>
         <w:t>Model predistortion</w:t>
       </w:r>
     </w:p>
     <w:p>
       <w:pPr>
-        <w:pStyle w:val="ListParagraph"/>
+        <w:pStyle w:val="Listenabsatz"/>
         <w:numPr>
           <w:ilvl w:val="0"/>
           <w:numId w:val="6"/>
@@ -871,7 +993,7 @@
     </w:p>
     <w:p>
       <w:pPr>
-        <w:pStyle w:val="ListParagraph"/>
+        <w:pStyle w:val="Listenabsatz"/>
         <w:numPr>
           <w:ilvl w:val="0"/>
           <w:numId w:val="6"/>
@@ -889,31 +1011,31 @@
     </w:p>
     <w:p>
       <w:pPr>
-        <w:pStyle w:val="ListParagraph"/>
-        <w:rPr>
-          <w:lang w:val="en-US"/>
-        </w:rPr>
-      </w:pPr>
-    </w:p>
-    <w:p>
-      <w:pPr>
-        <w:pStyle w:val="ListParagraph"/>
-        <w:rPr>
-          <w:lang w:val="en-US"/>
-        </w:rPr>
-      </w:pPr>
-    </w:p>
-    <w:p>
-      <w:pPr>
-        <w:pStyle w:val="ListParagraph"/>
-        <w:rPr>
-          <w:lang w:val="en-US"/>
-        </w:rPr>
-      </w:pPr>
-    </w:p>
-    <w:p>
-      <w:pPr>
-        <w:pStyle w:val="ListParagraph"/>
+        <w:pStyle w:val="Listenabsatz"/>
+        <w:rPr>
+          <w:lang w:val="en-US"/>
+        </w:rPr>
+      </w:pPr>
+    </w:p>
+    <w:p>
+      <w:pPr>
+        <w:pStyle w:val="Listenabsatz"/>
+        <w:rPr>
+          <w:lang w:val="en-US"/>
+        </w:rPr>
+      </w:pPr>
+    </w:p>
+    <w:p>
+      <w:pPr>
+        <w:pStyle w:val="Listenabsatz"/>
+        <w:rPr>
+          <w:lang w:val="en-US"/>
+        </w:rPr>
+      </w:pPr>
+    </w:p>
+    <w:p>
+      <w:pPr>
+        <w:pStyle w:val="Listenabsatz"/>
         <w:rPr>
           <w:lang w:val="en-US"/>
         </w:rPr>
@@ -2024,15 +2146,15 @@
     <w:lsdException w:name="Unresolved Mention" w:semiHidden="1" w:unhideWhenUsed="1"/>
     <w:lsdException w:name="Smart Link" w:semiHidden="1" w:unhideWhenUsed="1"/>
   </w:latentStyles>
-  <w:style w:type="paragraph" w:default="1" w:styleId="Normal">
+  <w:style w:type="paragraph" w:default="1" w:styleId="Standard">
     <w:name w:val="Normal"/>
     <w:qFormat/>
   </w:style>
-  <w:style w:type="paragraph" w:styleId="Heading1">
+  <w:style w:type="paragraph" w:styleId="berschrift1">
     <w:name w:val="heading 1"/>
-    <w:basedOn w:val="Normal"/>
-    <w:next w:val="Normal"/>
-    <w:link w:val="Heading1Char"/>
+    <w:basedOn w:val="Standard"/>
+    <w:next w:val="Standard"/>
+    <w:link w:val="berschrift1Zchn"/>
     <w:uiPriority w:val="9"/>
     <w:qFormat/>
     <w:rsid w:val="00080235"/>
@@ -2049,11 +2171,11 @@
       <w:szCs w:val="40"/>
     </w:rPr>
   </w:style>
-  <w:style w:type="paragraph" w:styleId="Heading2">
+  <w:style w:type="paragraph" w:styleId="berschrift2">
     <w:name w:val="heading 2"/>
-    <w:basedOn w:val="Normal"/>
-    <w:next w:val="Normal"/>
-    <w:link w:val="Heading2Char"/>
+    <w:basedOn w:val="Standard"/>
+    <w:next w:val="Standard"/>
+    <w:link w:val="berschrift2Zchn"/>
     <w:uiPriority w:val="9"/>
     <w:semiHidden/>
     <w:unhideWhenUsed/>
@@ -2072,11 +2194,11 @@
       <w:szCs w:val="32"/>
     </w:rPr>
   </w:style>
-  <w:style w:type="paragraph" w:styleId="Heading3">
+  <w:style w:type="paragraph" w:styleId="berschrift3">
     <w:name w:val="heading 3"/>
-    <w:basedOn w:val="Normal"/>
-    <w:next w:val="Normal"/>
-    <w:link w:val="Heading3Char"/>
+    <w:basedOn w:val="Standard"/>
+    <w:next w:val="Standard"/>
+    <w:link w:val="berschrift3Zchn"/>
     <w:uiPriority w:val="9"/>
     <w:semiHidden/>
     <w:unhideWhenUsed/>
@@ -2095,11 +2217,11 @@
       <w:szCs w:val="28"/>
     </w:rPr>
   </w:style>
-  <w:style w:type="paragraph" w:styleId="Heading4">
+  <w:style w:type="paragraph" w:styleId="berschrift4">
     <w:name w:val="heading 4"/>
-    <w:basedOn w:val="Normal"/>
-    <w:next w:val="Normal"/>
-    <w:link w:val="Heading4Char"/>
+    <w:basedOn w:val="Standard"/>
+    <w:next w:val="Standard"/>
+    <w:link w:val="berschrift4Zchn"/>
     <w:uiPriority w:val="9"/>
     <w:semiHidden/>
     <w:unhideWhenUsed/>
@@ -2118,11 +2240,11 @@
       <w:color w:val="0F4761" w:themeColor="accent1" w:themeShade="BF"/>
     </w:rPr>
   </w:style>
-  <w:style w:type="paragraph" w:styleId="Heading5">
+  <w:style w:type="paragraph" w:styleId="berschrift5">
     <w:name w:val="heading 5"/>
-    <w:basedOn w:val="Normal"/>
-    <w:next w:val="Normal"/>
-    <w:link w:val="Heading5Char"/>
+    <w:basedOn w:val="Standard"/>
+    <w:next w:val="Standard"/>
+    <w:link w:val="berschrift5Zchn"/>
     <w:uiPriority w:val="9"/>
     <w:semiHidden/>
     <w:unhideWhenUsed/>
@@ -2139,11 +2261,11 @@
       <w:color w:val="0F4761" w:themeColor="accent1" w:themeShade="BF"/>
     </w:rPr>
   </w:style>
-  <w:style w:type="paragraph" w:styleId="Heading6">
+  <w:style w:type="paragraph" w:styleId="berschrift6">
     <w:name w:val="heading 6"/>
-    <w:basedOn w:val="Normal"/>
-    <w:next w:val="Normal"/>
-    <w:link w:val="Heading6Char"/>
+    <w:basedOn w:val="Standard"/>
+    <w:next w:val="Standard"/>
+    <w:link w:val="berschrift6Zchn"/>
     <w:uiPriority w:val="9"/>
     <w:semiHidden/>
     <w:unhideWhenUsed/>
@@ -2162,11 +2284,11 @@
       <w:color w:val="595959" w:themeColor="text1" w:themeTint="A6"/>
     </w:rPr>
   </w:style>
-  <w:style w:type="paragraph" w:styleId="Heading7">
+  <w:style w:type="paragraph" w:styleId="berschrift7">
     <w:name w:val="heading 7"/>
-    <w:basedOn w:val="Normal"/>
-    <w:next w:val="Normal"/>
-    <w:link w:val="Heading7Char"/>
+    <w:basedOn w:val="Standard"/>
+    <w:next w:val="Standard"/>
+    <w:link w:val="berschrift7Zchn"/>
     <w:uiPriority w:val="9"/>
     <w:semiHidden/>
     <w:unhideWhenUsed/>
@@ -2183,11 +2305,11 @@
       <w:color w:val="595959" w:themeColor="text1" w:themeTint="A6"/>
     </w:rPr>
   </w:style>
-  <w:style w:type="paragraph" w:styleId="Heading8">
+  <w:style w:type="paragraph" w:styleId="berschrift8">
     <w:name w:val="heading 8"/>
-    <w:basedOn w:val="Normal"/>
-    <w:next w:val="Normal"/>
-    <w:link w:val="Heading8Char"/>
+    <w:basedOn w:val="Standard"/>
+    <w:next w:val="Standard"/>
+    <w:link w:val="berschrift8Zchn"/>
     <w:uiPriority w:val="9"/>
     <w:semiHidden/>
     <w:unhideWhenUsed/>
@@ -2206,11 +2328,11 @@
       <w:color w:val="272727" w:themeColor="text1" w:themeTint="D8"/>
     </w:rPr>
   </w:style>
-  <w:style w:type="paragraph" w:styleId="Heading9">
+  <w:style w:type="paragraph" w:styleId="berschrift9">
     <w:name w:val="heading 9"/>
-    <w:basedOn w:val="Normal"/>
-    <w:next w:val="Normal"/>
-    <w:link w:val="Heading9Char"/>
+    <w:basedOn w:val="Standard"/>
+    <w:next w:val="Standard"/>
+    <w:link w:val="berschrift9Zchn"/>
     <w:uiPriority w:val="9"/>
     <w:semiHidden/>
     <w:unhideWhenUsed/>
@@ -2227,13 +2349,12 @@
       <w:color w:val="272727" w:themeColor="text1" w:themeTint="D8"/>
     </w:rPr>
   </w:style>
-  <w:style w:type="character" w:default="1" w:styleId="DefaultParagraphFont">
+  <w:style w:type="character" w:default="1" w:styleId="Absatz-Standardschriftart">
     <w:name w:val="Default Paragraph Font"/>
     <w:uiPriority w:val="1"/>
-    <w:semiHidden/>
     <w:unhideWhenUsed/>
   </w:style>
-  <w:style w:type="table" w:default="1" w:styleId="TableNormal">
+  <w:style w:type="table" w:default="1" w:styleId="NormaleTabelle">
     <w:name w:val="Normal Table"/>
     <w:uiPriority w:val="99"/>
     <w:semiHidden/>
@@ -2248,16 +2369,16 @@
       </w:tblCellMar>
     </w:tblPr>
   </w:style>
-  <w:style w:type="numbering" w:default="1" w:styleId="NoList">
+  <w:style w:type="numbering" w:default="1" w:styleId="KeineListe">
     <w:name w:val="No List"/>
     <w:uiPriority w:val="99"/>
     <w:semiHidden/>
     <w:unhideWhenUsed/>
   </w:style>
-  <w:style w:type="character" w:customStyle="1" w:styleId="Heading1Char">
-    <w:name w:val="Heading 1 Char"/>
-    <w:basedOn w:val="DefaultParagraphFont"/>
-    <w:link w:val="Heading1"/>
+  <w:style w:type="character" w:customStyle="1" w:styleId="berschrift1Zchn">
+    <w:name w:val="Überschrift 1 Zchn"/>
+    <w:basedOn w:val="Absatz-Standardschriftart"/>
+    <w:link w:val="berschrift1"/>
     <w:uiPriority w:val="9"/>
     <w:rsid w:val="00080235"/>
     <w:rPr>
@@ -2267,10 +2388,10 @@
       <w:szCs w:val="40"/>
     </w:rPr>
   </w:style>
-  <w:style w:type="character" w:customStyle="1" w:styleId="Heading2Char">
-    <w:name w:val="Heading 2 Char"/>
-    <w:basedOn w:val="DefaultParagraphFont"/>
-    <w:link w:val="Heading2"/>
+  <w:style w:type="character" w:customStyle="1" w:styleId="berschrift2Zchn">
+    <w:name w:val="Überschrift 2 Zchn"/>
+    <w:basedOn w:val="Absatz-Standardschriftart"/>
+    <w:link w:val="berschrift2"/>
     <w:uiPriority w:val="9"/>
     <w:semiHidden/>
     <w:rsid w:val="00080235"/>
@@ -2281,10 +2402,10 @@
       <w:szCs w:val="32"/>
     </w:rPr>
   </w:style>
-  <w:style w:type="character" w:customStyle="1" w:styleId="Heading3Char">
-    <w:name w:val="Heading 3 Char"/>
-    <w:basedOn w:val="DefaultParagraphFont"/>
-    <w:link w:val="Heading3"/>
+  <w:style w:type="character" w:customStyle="1" w:styleId="berschrift3Zchn">
+    <w:name w:val="Überschrift 3 Zchn"/>
+    <w:basedOn w:val="Absatz-Standardschriftart"/>
+    <w:link w:val="berschrift3"/>
     <w:uiPriority w:val="9"/>
     <w:semiHidden/>
     <w:rsid w:val="00080235"/>
@@ -2295,10 +2416,10 @@
       <w:szCs w:val="28"/>
     </w:rPr>
   </w:style>
-  <w:style w:type="character" w:customStyle="1" w:styleId="Heading4Char">
-    <w:name w:val="Heading 4 Char"/>
-    <w:basedOn w:val="DefaultParagraphFont"/>
-    <w:link w:val="Heading4"/>
+  <w:style w:type="character" w:customStyle="1" w:styleId="berschrift4Zchn">
+    <w:name w:val="Überschrift 4 Zchn"/>
+    <w:basedOn w:val="Absatz-Standardschriftart"/>
+    <w:link w:val="berschrift4"/>
     <w:uiPriority w:val="9"/>
     <w:semiHidden/>
     <w:rsid w:val="00080235"/>
@@ -2309,10 +2430,10 @@
       <w:color w:val="0F4761" w:themeColor="accent1" w:themeShade="BF"/>
     </w:rPr>
   </w:style>
-  <w:style w:type="character" w:customStyle="1" w:styleId="Heading5Char">
-    <w:name w:val="Heading 5 Char"/>
-    <w:basedOn w:val="DefaultParagraphFont"/>
-    <w:link w:val="Heading5"/>
+  <w:style w:type="character" w:customStyle="1" w:styleId="berschrift5Zchn">
+    <w:name w:val="Überschrift 5 Zchn"/>
+    <w:basedOn w:val="Absatz-Standardschriftart"/>
+    <w:link w:val="berschrift5"/>
     <w:uiPriority w:val="9"/>
     <w:semiHidden/>
     <w:rsid w:val="00080235"/>
@@ -2321,10 +2442,10 @@
       <w:color w:val="0F4761" w:themeColor="accent1" w:themeShade="BF"/>
     </w:rPr>
   </w:style>
-  <w:style w:type="character" w:customStyle="1" w:styleId="Heading6Char">
-    <w:name w:val="Heading 6 Char"/>
-    <w:basedOn w:val="DefaultParagraphFont"/>
-    <w:link w:val="Heading6"/>
+  <w:style w:type="character" w:customStyle="1" w:styleId="berschrift6Zchn">
+    <w:name w:val="Überschrift 6 Zchn"/>
+    <w:basedOn w:val="Absatz-Standardschriftart"/>
+    <w:link w:val="berschrift6"/>
     <w:uiPriority w:val="9"/>
     <w:semiHidden/>
     <w:rsid w:val="00080235"/>
@@ -2335,10 +2456,10 @@
       <w:color w:val="595959" w:themeColor="text1" w:themeTint="A6"/>
     </w:rPr>
   </w:style>
-  <w:style w:type="character" w:customStyle="1" w:styleId="Heading7Char">
-    <w:name w:val="Heading 7 Char"/>
-    <w:basedOn w:val="DefaultParagraphFont"/>
-    <w:link w:val="Heading7"/>
+  <w:style w:type="character" w:customStyle="1" w:styleId="berschrift7Zchn">
+    <w:name w:val="Überschrift 7 Zchn"/>
+    <w:basedOn w:val="Absatz-Standardschriftart"/>
+    <w:link w:val="berschrift7"/>
     <w:uiPriority w:val="9"/>
     <w:semiHidden/>
     <w:rsid w:val="00080235"/>
@@ -2347,10 +2468,10 @@
       <w:color w:val="595959" w:themeColor="text1" w:themeTint="A6"/>
     </w:rPr>
   </w:style>
-  <w:style w:type="character" w:customStyle="1" w:styleId="Heading8Char">
-    <w:name w:val="Heading 8 Char"/>
-    <w:basedOn w:val="DefaultParagraphFont"/>
-    <w:link w:val="Heading8"/>
+  <w:style w:type="character" w:customStyle="1" w:styleId="berschrift8Zchn">
+    <w:name w:val="Überschrift 8 Zchn"/>
+    <w:basedOn w:val="Absatz-Standardschriftart"/>
+    <w:link w:val="berschrift8"/>
     <w:uiPriority w:val="9"/>
     <w:semiHidden/>
     <w:rsid w:val="00080235"/>
@@ -2361,10 +2482,10 @@
       <w:color w:val="272727" w:themeColor="text1" w:themeTint="D8"/>
     </w:rPr>
   </w:style>
-  <w:style w:type="character" w:customStyle="1" w:styleId="Heading9Char">
-    <w:name w:val="Heading 9 Char"/>
-    <w:basedOn w:val="DefaultParagraphFont"/>
-    <w:link w:val="Heading9"/>
+  <w:style w:type="character" w:customStyle="1" w:styleId="berschrift9Zchn">
+    <w:name w:val="Überschrift 9 Zchn"/>
+    <w:basedOn w:val="Absatz-Standardschriftart"/>
+    <w:link w:val="berschrift9"/>
     <w:uiPriority w:val="9"/>
     <w:semiHidden/>
     <w:rsid w:val="00080235"/>
@@ -2373,11 +2494,11 @@
       <w:color w:val="272727" w:themeColor="text1" w:themeTint="D8"/>
     </w:rPr>
   </w:style>
-  <w:style w:type="paragraph" w:styleId="Title">
+  <w:style w:type="paragraph" w:styleId="Titel">
     <w:name w:val="Title"/>
-    <w:basedOn w:val="Normal"/>
-    <w:next w:val="Normal"/>
-    <w:link w:val="TitleChar"/>
+    <w:basedOn w:val="Standard"/>
+    <w:next w:val="Standard"/>
+    <w:link w:val="TitelZchn"/>
     <w:uiPriority w:val="10"/>
     <w:qFormat/>
     <w:rsid w:val="00080235"/>
@@ -2393,10 +2514,10 @@
       <w:szCs w:val="56"/>
     </w:rPr>
   </w:style>
-  <w:style w:type="character" w:customStyle="1" w:styleId="TitleChar">
-    <w:name w:val="Title Char"/>
-    <w:basedOn w:val="DefaultParagraphFont"/>
-    <w:link w:val="Title"/>
+  <w:style w:type="character" w:customStyle="1" w:styleId="TitelZchn">
+    <w:name w:val="Titel Zchn"/>
+    <w:basedOn w:val="Absatz-Standardschriftart"/>
+    <w:link w:val="Titel"/>
     <w:uiPriority w:val="10"/>
     <w:rsid w:val="00080235"/>
     <w:rPr>
@@ -2407,11 +2528,11 @@
       <w:szCs w:val="56"/>
     </w:rPr>
   </w:style>
-  <w:style w:type="paragraph" w:styleId="Subtitle">
+  <w:style w:type="paragraph" w:styleId="Untertitel">
     <w:name w:val="Subtitle"/>
-    <w:basedOn w:val="Normal"/>
-    <w:next w:val="Normal"/>
-    <w:link w:val="SubtitleChar"/>
+    <w:basedOn w:val="Standard"/>
+    <w:next w:val="Standard"/>
+    <w:link w:val="UntertitelZchn"/>
     <w:uiPriority w:val="11"/>
     <w:qFormat/>
     <w:rsid w:val="00080235"/>
@@ -2428,10 +2549,10 @@
       <w:szCs w:val="28"/>
     </w:rPr>
   </w:style>
-  <w:style w:type="character" w:customStyle="1" w:styleId="SubtitleChar">
-    <w:name w:val="Subtitle Char"/>
-    <w:basedOn w:val="DefaultParagraphFont"/>
-    <w:link w:val="Subtitle"/>
+  <w:style w:type="character" w:customStyle="1" w:styleId="UntertitelZchn">
+    <w:name w:val="Untertitel Zchn"/>
+    <w:basedOn w:val="Absatz-Standardschriftart"/>
+    <w:link w:val="Untertitel"/>
     <w:uiPriority w:val="11"/>
     <w:rsid w:val="00080235"/>
     <w:rPr>
@@ -2442,11 +2563,11 @@
       <w:szCs w:val="28"/>
     </w:rPr>
   </w:style>
-  <w:style w:type="paragraph" w:styleId="Quote">
+  <w:style w:type="paragraph" w:styleId="Zitat">
     <w:name w:val="Quote"/>
-    <w:basedOn w:val="Normal"/>
-    <w:next w:val="Normal"/>
-    <w:link w:val="QuoteChar"/>
+    <w:basedOn w:val="Standard"/>
+    <w:next w:val="Standard"/>
+    <w:link w:val="ZitatZchn"/>
     <w:uiPriority w:val="29"/>
     <w:qFormat/>
     <w:rsid w:val="00080235"/>
@@ -2460,10 +2581,10 @@
       <w:color w:val="404040" w:themeColor="text1" w:themeTint="BF"/>
     </w:rPr>
   </w:style>
-  <w:style w:type="character" w:customStyle="1" w:styleId="QuoteChar">
-    <w:name w:val="Quote Char"/>
-    <w:basedOn w:val="DefaultParagraphFont"/>
-    <w:link w:val="Quote"/>
+  <w:style w:type="character" w:customStyle="1" w:styleId="ZitatZchn">
+    <w:name w:val="Zitat Zchn"/>
+    <w:basedOn w:val="Absatz-Standardschriftart"/>
+    <w:link w:val="Zitat"/>
     <w:uiPriority w:val="29"/>
     <w:rsid w:val="00080235"/>
     <w:rPr>
@@ -2472,9 +2593,9 @@
       <w:color w:val="404040" w:themeColor="text1" w:themeTint="BF"/>
     </w:rPr>
   </w:style>
-  <w:style w:type="paragraph" w:styleId="ListParagraph">
+  <w:style w:type="paragraph" w:styleId="Listenabsatz">
     <w:name w:val="List Paragraph"/>
-    <w:basedOn w:val="Normal"/>
+    <w:basedOn w:val="Standard"/>
     <w:uiPriority w:val="34"/>
     <w:qFormat/>
     <w:rsid w:val="00080235"/>
@@ -2483,9 +2604,9 @@
       <w:contextualSpacing/>
     </w:pPr>
   </w:style>
-  <w:style w:type="character" w:styleId="IntenseEmphasis">
+  <w:style w:type="character" w:styleId="IntensiveHervorhebung">
     <w:name w:val="Intense Emphasis"/>
-    <w:basedOn w:val="DefaultParagraphFont"/>
+    <w:basedOn w:val="Absatz-Standardschriftart"/>
     <w:uiPriority w:val="21"/>
     <w:qFormat/>
     <w:rsid w:val="00080235"/>
@@ -2495,11 +2616,11 @@
       <w:color w:val="0F4761" w:themeColor="accent1" w:themeShade="BF"/>
     </w:rPr>
   </w:style>
-  <w:style w:type="paragraph" w:styleId="IntenseQuote">
+  <w:style w:type="paragraph" w:styleId="IntensivesZitat">
     <w:name w:val="Intense Quote"/>
-    <w:basedOn w:val="Normal"/>
-    <w:next w:val="Normal"/>
-    <w:link w:val="IntenseQuoteChar"/>
+    <w:basedOn w:val="Standard"/>
+    <w:next w:val="Standard"/>
+    <w:link w:val="IntensivesZitatZchn"/>
     <w:uiPriority w:val="30"/>
     <w:qFormat/>
     <w:rsid w:val="00080235"/>
@@ -2518,10 +2639,10 @@
       <w:color w:val="0F4761" w:themeColor="accent1" w:themeShade="BF"/>
     </w:rPr>
   </w:style>
-  <w:style w:type="character" w:customStyle="1" w:styleId="IntenseQuoteChar">
-    <w:name w:val="Intense Quote Char"/>
-    <w:basedOn w:val="DefaultParagraphFont"/>
-    <w:link w:val="IntenseQuote"/>
+  <w:style w:type="character" w:customStyle="1" w:styleId="IntensivesZitatZchn">
+    <w:name w:val="Intensives Zitat Zchn"/>
+    <w:basedOn w:val="Absatz-Standardschriftart"/>
+    <w:link w:val="IntensivesZitat"/>
     <w:uiPriority w:val="30"/>
     <w:rsid w:val="00080235"/>
     <w:rPr>
@@ -2530,9 +2651,9 @@
       <w:color w:val="0F4761" w:themeColor="accent1" w:themeShade="BF"/>
     </w:rPr>
   </w:style>
-  <w:style w:type="character" w:styleId="IntenseReference">
+  <w:style w:type="character" w:styleId="IntensiverVerweis">
     <w:name w:val="Intense Reference"/>
-    <w:basedOn w:val="DefaultParagraphFont"/>
+    <w:basedOn w:val="Absatz-Standardschriftart"/>
     <w:uiPriority w:val="32"/>
     <w:qFormat/>
     <w:rsid w:val="00080235"/>

</xml_diff>

<commit_message>
Rearrange spectrum plots, corrected fft scaling, fixed am/pm plotting
</commit_message>
<xml_diff>
--- a/Thesis Overview.docx
+++ b/Thesis Overview.docx
@@ -4,7 +4,7 @@
   <w:body>
     <w:p>
       <w:pPr>
-        <w:pStyle w:val="Listenabsatz"/>
+        <w:pStyle w:val="ListParagraph"/>
         <w:numPr>
           <w:ilvl w:val="0"/>
           <w:numId w:val="2"/>
@@ -22,7 +22,7 @@
     </w:p>
     <w:p>
       <w:pPr>
-        <w:pStyle w:val="Listenabsatz"/>
+        <w:pStyle w:val="ListParagraph"/>
         <w:rPr>
           <w:lang w:val="en-US"/>
         </w:rPr>
@@ -36,15 +36,15 @@
     </w:p>
     <w:p>
       <w:pPr>
-        <w:pStyle w:val="Listenabsatz"/>
-        <w:rPr>
-          <w:lang w:val="en-US"/>
-        </w:rPr>
-      </w:pPr>
-    </w:p>
-    <w:p>
-      <w:pPr>
-        <w:pStyle w:val="Listenabsatz"/>
+        <w:pStyle w:val="ListParagraph"/>
+        <w:rPr>
+          <w:lang w:val="en-US"/>
+        </w:rPr>
+      </w:pPr>
+    </w:p>
+    <w:p>
+      <w:pPr>
+        <w:pStyle w:val="ListParagraph"/>
         <w:rPr>
           <w:lang w:val="en-US"/>
         </w:rPr>
@@ -120,7 +120,7 @@
     </w:p>
     <w:p>
       <w:pPr>
-        <w:pStyle w:val="Listenabsatz"/>
+        <w:pStyle w:val="ListParagraph"/>
         <w:rPr>
           <w:lang w:val="en-US"/>
         </w:rPr>
@@ -134,15 +134,15 @@
     </w:p>
     <w:p>
       <w:pPr>
-        <w:pStyle w:val="Listenabsatz"/>
-        <w:rPr>
-          <w:lang w:val="en-US"/>
-        </w:rPr>
-      </w:pPr>
-    </w:p>
-    <w:p>
-      <w:pPr>
-        <w:pStyle w:val="Listenabsatz"/>
+        <w:pStyle w:val="ListParagraph"/>
+        <w:rPr>
+          <w:lang w:val="en-US"/>
+        </w:rPr>
+      </w:pPr>
+    </w:p>
+    <w:p>
+      <w:pPr>
+        <w:pStyle w:val="ListParagraph"/>
         <w:rPr>
           <w:lang w:val="en-US"/>
         </w:rPr>
@@ -168,7 +168,7 @@
     </w:p>
     <w:p>
       <w:pPr>
-        <w:pStyle w:val="Listenabsatz"/>
+        <w:pStyle w:val="ListParagraph"/>
         <w:rPr>
           <w:lang w:val="en-US"/>
         </w:rPr>
@@ -201,15 +201,15 @@
     </w:p>
     <w:p>
       <w:pPr>
-        <w:pStyle w:val="Listenabsatz"/>
-        <w:rPr>
-          <w:lang w:val="en-US"/>
-        </w:rPr>
-      </w:pPr>
-    </w:p>
-    <w:p>
-      <w:pPr>
-        <w:pStyle w:val="Listenabsatz"/>
+        <w:pStyle w:val="ListParagraph"/>
+        <w:rPr>
+          <w:lang w:val="en-US"/>
+        </w:rPr>
+      </w:pPr>
+    </w:p>
+    <w:p>
+      <w:pPr>
+        <w:pStyle w:val="ListParagraph"/>
         <w:numPr>
           <w:ilvl w:val="0"/>
           <w:numId w:val="2"/>
@@ -227,7 +227,7 @@
     </w:p>
     <w:p>
       <w:pPr>
-        <w:pStyle w:val="Listenabsatz"/>
+        <w:pStyle w:val="ListParagraph"/>
         <w:rPr>
           <w:lang w:val="en-US"/>
         </w:rPr>
@@ -248,7 +248,7 @@
     </w:p>
     <w:p>
       <w:pPr>
-        <w:pStyle w:val="Listenabsatz"/>
+        <w:pStyle w:val="ListParagraph"/>
         <w:numPr>
           <w:ilvl w:val="0"/>
           <w:numId w:val="2"/>
@@ -266,7 +266,7 @@
     </w:p>
     <w:p>
       <w:pPr>
-        <w:pStyle w:val="Listenabsatz"/>
+        <w:pStyle w:val="ListParagraph"/>
         <w:rPr>
           <w:lang w:val="en-US"/>
         </w:rPr>
@@ -292,7 +292,7 @@
     </w:p>
     <w:p>
       <w:pPr>
-        <w:pStyle w:val="Listenabsatz"/>
+        <w:pStyle w:val="ListParagraph"/>
         <w:rPr>
           <w:lang w:val="en-US"/>
         </w:rPr>
@@ -306,7 +306,7 @@
     </w:p>
     <w:p>
       <w:pPr>
-        <w:pStyle w:val="Listenabsatz"/>
+        <w:pStyle w:val="ListParagraph"/>
         <w:rPr>
           <w:lang w:val="en-US"/>
         </w:rPr>
@@ -320,15 +320,15 @@
     </w:p>
     <w:p>
       <w:pPr>
-        <w:pStyle w:val="Listenabsatz"/>
-        <w:rPr>
-          <w:lang w:val="en-US"/>
-        </w:rPr>
-      </w:pPr>
-    </w:p>
-    <w:p>
-      <w:pPr>
-        <w:pStyle w:val="Listenabsatz"/>
+        <w:pStyle w:val="ListParagraph"/>
+        <w:rPr>
+          <w:lang w:val="en-US"/>
+        </w:rPr>
+      </w:pPr>
+    </w:p>
+    <w:p>
+      <w:pPr>
+        <w:pStyle w:val="ListParagraph"/>
         <w:numPr>
           <w:ilvl w:val="0"/>
           <w:numId w:val="2"/>
@@ -346,7 +346,7 @@
     </w:p>
     <w:p>
       <w:pPr>
-        <w:pStyle w:val="Listenabsatz"/>
+        <w:pStyle w:val="ListParagraph"/>
         <w:rPr>
           <w:lang w:val="en-US"/>
         </w:rPr>
@@ -360,7 +360,7 @@
     </w:p>
     <w:p>
       <w:pPr>
-        <w:pStyle w:val="Listenabsatz"/>
+        <w:pStyle w:val="ListParagraph"/>
         <w:rPr>
           <w:lang w:val="en-US"/>
         </w:rPr>
@@ -388,7 +388,7 @@
     </w:p>
     <w:p>
       <w:pPr>
-        <w:pStyle w:val="Listenabsatz"/>
+        <w:pStyle w:val="ListParagraph"/>
         <w:rPr>
           <w:lang w:val="en-US"/>
         </w:rPr>
@@ -402,7 +402,7 @@
     </w:p>
     <w:p>
       <w:pPr>
-        <w:pStyle w:val="Listenabsatz"/>
+        <w:pStyle w:val="ListParagraph"/>
         <w:rPr>
           <w:lang w:val="en-US"/>
         </w:rPr>
@@ -416,7 +416,7 @@
     </w:p>
     <w:p>
       <w:pPr>
-        <w:pStyle w:val="Listenabsatz"/>
+        <w:pStyle w:val="ListParagraph"/>
         <w:rPr>
           <w:lang w:val="en-US"/>
         </w:rPr>
@@ -430,15 +430,15 @@
     </w:p>
     <w:p>
       <w:pPr>
-        <w:pStyle w:val="Listenabsatz"/>
-        <w:rPr>
-          <w:lang w:val="en-US"/>
-        </w:rPr>
-      </w:pPr>
-    </w:p>
-    <w:p>
-      <w:pPr>
-        <w:pStyle w:val="Listenabsatz"/>
+        <w:pStyle w:val="ListParagraph"/>
+        <w:rPr>
+          <w:lang w:val="en-US"/>
+        </w:rPr>
+      </w:pPr>
+    </w:p>
+    <w:p>
+      <w:pPr>
+        <w:pStyle w:val="ListParagraph"/>
         <w:rPr>
           <w:lang w:val="en-US"/>
         </w:rPr>
@@ -452,7 +452,7 @@
     </w:p>
     <w:p>
       <w:pPr>
-        <w:pStyle w:val="Listenabsatz"/>
+        <w:pStyle w:val="ListParagraph"/>
         <w:rPr>
           <w:lang w:val="en-US"/>
         </w:rPr>
@@ -466,7 +466,7 @@
     </w:p>
     <w:p>
       <w:pPr>
-        <w:pStyle w:val="Listenabsatz"/>
+        <w:pStyle w:val="ListParagraph"/>
         <w:rPr>
           <w:lang w:val="en-US"/>
         </w:rPr>
@@ -480,7 +480,7 @@
     </w:p>
     <w:p>
       <w:pPr>
-        <w:pStyle w:val="Listenabsatz"/>
+        <w:pStyle w:val="ListParagraph"/>
         <w:rPr>
           <w:lang w:val="en-US"/>
         </w:rPr>
@@ -508,15 +508,15 @@
     </w:p>
     <w:p>
       <w:pPr>
-        <w:pStyle w:val="Listenabsatz"/>
-        <w:rPr>
-          <w:lang w:val="en-US"/>
-        </w:rPr>
-      </w:pPr>
-    </w:p>
-    <w:p>
-      <w:pPr>
-        <w:pStyle w:val="Listenabsatz"/>
+        <w:pStyle w:val="ListParagraph"/>
+        <w:rPr>
+          <w:lang w:val="en-US"/>
+        </w:rPr>
+      </w:pPr>
+    </w:p>
+    <w:p>
+      <w:pPr>
+        <w:pStyle w:val="ListParagraph"/>
         <w:rPr>
           <w:lang w:val="en-US"/>
         </w:rPr>
@@ -544,7 +544,7 @@
     </w:p>
     <w:p>
       <w:pPr>
-        <w:pStyle w:val="Listenabsatz"/>
+        <w:pStyle w:val="ListParagraph"/>
         <w:rPr>
           <w:lang w:val="en-US"/>
         </w:rPr>
@@ -558,7 +558,7 @@
     </w:p>
     <w:p>
       <w:pPr>
-        <w:pStyle w:val="Listenabsatz"/>
+        <w:pStyle w:val="ListParagraph"/>
         <w:rPr>
           <w:lang w:val="en-US"/>
         </w:rPr>
@@ -572,15 +572,15 @@
     </w:p>
     <w:p>
       <w:pPr>
-        <w:pStyle w:val="Listenabsatz"/>
-        <w:rPr>
-          <w:lang w:val="en-US"/>
-        </w:rPr>
-      </w:pPr>
-    </w:p>
-    <w:p>
-      <w:pPr>
-        <w:pStyle w:val="Listenabsatz"/>
+        <w:pStyle w:val="ListParagraph"/>
+        <w:rPr>
+          <w:lang w:val="en-US"/>
+        </w:rPr>
+      </w:pPr>
+    </w:p>
+    <w:p>
+      <w:pPr>
+        <w:pStyle w:val="ListParagraph"/>
         <w:rPr>
           <w:lang w:val="en-US"/>
         </w:rPr>
@@ -618,7 +618,7 @@
     </w:p>
     <w:p>
       <w:pPr>
-        <w:pStyle w:val="Listenabsatz"/>
+        <w:pStyle w:val="ListParagraph"/>
         <w:rPr>
           <w:lang w:val="en-US"/>
         </w:rPr>
@@ -638,15 +638,15 @@
     </w:p>
     <w:p>
       <w:pPr>
-        <w:pStyle w:val="Listenabsatz"/>
-        <w:rPr>
-          <w:lang w:val="en-US"/>
-        </w:rPr>
-      </w:pPr>
-    </w:p>
-    <w:p>
-      <w:pPr>
-        <w:pStyle w:val="Listenabsatz"/>
+        <w:pStyle w:val="ListParagraph"/>
+        <w:rPr>
+          <w:lang w:val="en-US"/>
+        </w:rPr>
+      </w:pPr>
+    </w:p>
+    <w:p>
+      <w:pPr>
+        <w:pStyle w:val="ListParagraph"/>
         <w:rPr>
           <w:lang w:val="en-US"/>
         </w:rPr>
@@ -660,7 +660,7 @@
     </w:p>
     <w:p>
       <w:pPr>
-        <w:pStyle w:val="Listenabsatz"/>
+        <w:pStyle w:val="ListParagraph"/>
         <w:rPr>
           <w:lang w:val="en-US"/>
         </w:rPr>
@@ -675,15 +675,15 @@
     </w:p>
     <w:p>
       <w:pPr>
-        <w:pStyle w:val="Listenabsatz"/>
-        <w:rPr>
-          <w:lang w:val="en-US"/>
-        </w:rPr>
-      </w:pPr>
-    </w:p>
-    <w:p>
-      <w:pPr>
-        <w:pStyle w:val="Listenabsatz"/>
+        <w:pStyle w:val="ListParagraph"/>
+        <w:rPr>
+          <w:lang w:val="en-US"/>
+        </w:rPr>
+      </w:pPr>
+    </w:p>
+    <w:p>
+      <w:pPr>
+        <w:pStyle w:val="ListParagraph"/>
         <w:rPr>
           <w:u w:val="single"/>
           <w:lang w:val="en-US"/>
@@ -699,7 +699,7 @@
     </w:p>
     <w:p>
       <w:pPr>
-        <w:pStyle w:val="Listenabsatz"/>
+        <w:pStyle w:val="ListParagraph"/>
         <w:rPr>
           <w:lang w:val="en-US"/>
         </w:rPr>
@@ -713,7 +713,7 @@
     </w:p>
     <w:p>
       <w:pPr>
-        <w:pStyle w:val="Listenabsatz"/>
+        <w:pStyle w:val="ListParagraph"/>
         <w:rPr>
           <w:lang w:val="en-US"/>
         </w:rPr>
@@ -727,7 +727,7 @@
     </w:p>
     <w:p>
       <w:pPr>
-        <w:pStyle w:val="Listenabsatz"/>
+        <w:pStyle w:val="ListParagraph"/>
         <w:rPr>
           <w:lang w:val="en-US"/>
         </w:rPr>
@@ -755,7 +755,7 @@
     </w:p>
     <w:p>
       <w:pPr>
-        <w:pStyle w:val="Listenabsatz"/>
+        <w:pStyle w:val="ListParagraph"/>
         <w:rPr>
           <w:lang w:val="en-US"/>
         </w:rPr>
@@ -785,7 +785,7 @@
     </w:p>
     <w:p>
       <w:pPr>
-        <w:pStyle w:val="Listenabsatz"/>
+        <w:pStyle w:val="ListParagraph"/>
         <w:numPr>
           <w:ilvl w:val="0"/>
           <w:numId w:val="4"/>
@@ -831,7 +831,7 @@
     </w:p>
     <w:p>
       <w:pPr>
-        <w:pStyle w:val="Listenabsatz"/>
+        <w:pStyle w:val="ListParagraph"/>
         <w:numPr>
           <w:ilvl w:val="0"/>
           <w:numId w:val="4"/>
@@ -889,7 +889,7 @@
     </w:p>
     <w:p>
       <w:pPr>
-        <w:pStyle w:val="Listenabsatz"/>
+        <w:pStyle w:val="ListParagraph"/>
         <w:numPr>
           <w:ilvl w:val="0"/>
           <w:numId w:val="4"/>
@@ -933,7 +933,7 @@
     </w:p>
     <w:p>
       <w:pPr>
-        <w:pStyle w:val="Listenabsatz"/>
+        <w:pStyle w:val="ListParagraph"/>
         <w:numPr>
           <w:ilvl w:val="0"/>
           <w:numId w:val="4"/>
@@ -946,36 +946,12 @@
         <w:rPr>
           <w:lang w:val="en-US"/>
         </w:rPr>
-        <w:t>Modelling non-linearities</w:t>
-      </w:r>
-      <w:r>
-        <w:rPr>
-          <w:lang w:val="en-US"/>
-        </w:rPr>
-        <w:t xml:space="preserve"> – why no sidebands after PA, harmonics have influence on spectrum?</w:t>
-      </w:r>
-    </w:p>
-    <w:p>
-      <w:pPr>
-        <w:pStyle w:val="Listenabsatz"/>
-        <w:numPr>
-          <w:ilvl w:val="0"/>
-          <w:numId w:val="4"/>
-        </w:numPr>
-        <w:rPr>
-          <w:lang w:val="en-US"/>
-        </w:rPr>
-      </w:pPr>
-      <w:r>
-        <w:rPr>
-          <w:lang w:val="en-US"/>
-        </w:rPr>
         <w:t>Model predistortion</w:t>
       </w:r>
     </w:p>
     <w:p>
       <w:pPr>
-        <w:pStyle w:val="Listenabsatz"/>
+        <w:pStyle w:val="ListParagraph"/>
         <w:numPr>
           <w:ilvl w:val="0"/>
           <w:numId w:val="6"/>
@@ -993,7 +969,7 @@
     </w:p>
     <w:p>
       <w:pPr>
-        <w:pStyle w:val="Listenabsatz"/>
+        <w:pStyle w:val="ListParagraph"/>
         <w:numPr>
           <w:ilvl w:val="0"/>
           <w:numId w:val="6"/>
@@ -1011,31 +987,31 @@
     </w:p>
     <w:p>
       <w:pPr>
-        <w:pStyle w:val="Listenabsatz"/>
-        <w:rPr>
-          <w:lang w:val="en-US"/>
-        </w:rPr>
-      </w:pPr>
-    </w:p>
-    <w:p>
-      <w:pPr>
-        <w:pStyle w:val="Listenabsatz"/>
-        <w:rPr>
-          <w:lang w:val="en-US"/>
-        </w:rPr>
-      </w:pPr>
-    </w:p>
-    <w:p>
-      <w:pPr>
-        <w:pStyle w:val="Listenabsatz"/>
-        <w:rPr>
-          <w:lang w:val="en-US"/>
-        </w:rPr>
-      </w:pPr>
-    </w:p>
-    <w:p>
-      <w:pPr>
-        <w:pStyle w:val="Listenabsatz"/>
+        <w:pStyle w:val="ListParagraph"/>
+        <w:rPr>
+          <w:lang w:val="en-US"/>
+        </w:rPr>
+      </w:pPr>
+    </w:p>
+    <w:p>
+      <w:pPr>
+        <w:pStyle w:val="ListParagraph"/>
+        <w:rPr>
+          <w:lang w:val="en-US"/>
+        </w:rPr>
+      </w:pPr>
+    </w:p>
+    <w:p>
+      <w:pPr>
+        <w:pStyle w:val="ListParagraph"/>
+        <w:rPr>
+          <w:lang w:val="en-US"/>
+        </w:rPr>
+      </w:pPr>
+    </w:p>
+    <w:p>
+      <w:pPr>
+        <w:pStyle w:val="ListParagraph"/>
         <w:rPr>
           <w:lang w:val="en-US"/>
         </w:rPr>
@@ -2146,15 +2122,15 @@
     <w:lsdException w:name="Unresolved Mention" w:semiHidden="1" w:unhideWhenUsed="1"/>
     <w:lsdException w:name="Smart Link" w:semiHidden="1" w:unhideWhenUsed="1"/>
   </w:latentStyles>
-  <w:style w:type="paragraph" w:default="1" w:styleId="Standard">
+  <w:style w:type="paragraph" w:default="1" w:styleId="Normal">
     <w:name w:val="Normal"/>
     <w:qFormat/>
   </w:style>
-  <w:style w:type="paragraph" w:styleId="berschrift1">
+  <w:style w:type="paragraph" w:styleId="Heading1">
     <w:name w:val="heading 1"/>
-    <w:basedOn w:val="Standard"/>
-    <w:next w:val="Standard"/>
-    <w:link w:val="berschrift1Zchn"/>
+    <w:basedOn w:val="Normal"/>
+    <w:next w:val="Normal"/>
+    <w:link w:val="Heading1Char"/>
     <w:uiPriority w:val="9"/>
     <w:qFormat/>
     <w:rsid w:val="00080235"/>
@@ -2171,11 +2147,11 @@
       <w:szCs w:val="40"/>
     </w:rPr>
   </w:style>
-  <w:style w:type="paragraph" w:styleId="berschrift2">
+  <w:style w:type="paragraph" w:styleId="Heading2">
     <w:name w:val="heading 2"/>
-    <w:basedOn w:val="Standard"/>
-    <w:next w:val="Standard"/>
-    <w:link w:val="berschrift2Zchn"/>
+    <w:basedOn w:val="Normal"/>
+    <w:next w:val="Normal"/>
+    <w:link w:val="Heading2Char"/>
     <w:uiPriority w:val="9"/>
     <w:semiHidden/>
     <w:unhideWhenUsed/>
@@ -2194,11 +2170,11 @@
       <w:szCs w:val="32"/>
     </w:rPr>
   </w:style>
-  <w:style w:type="paragraph" w:styleId="berschrift3">
+  <w:style w:type="paragraph" w:styleId="Heading3">
     <w:name w:val="heading 3"/>
-    <w:basedOn w:val="Standard"/>
-    <w:next w:val="Standard"/>
-    <w:link w:val="berschrift3Zchn"/>
+    <w:basedOn w:val="Normal"/>
+    <w:next w:val="Normal"/>
+    <w:link w:val="Heading3Char"/>
     <w:uiPriority w:val="9"/>
     <w:semiHidden/>
     <w:unhideWhenUsed/>
@@ -2217,11 +2193,11 @@
       <w:szCs w:val="28"/>
     </w:rPr>
   </w:style>
-  <w:style w:type="paragraph" w:styleId="berschrift4">
+  <w:style w:type="paragraph" w:styleId="Heading4">
     <w:name w:val="heading 4"/>
-    <w:basedOn w:val="Standard"/>
-    <w:next w:val="Standard"/>
-    <w:link w:val="berschrift4Zchn"/>
+    <w:basedOn w:val="Normal"/>
+    <w:next w:val="Normal"/>
+    <w:link w:val="Heading4Char"/>
     <w:uiPriority w:val="9"/>
     <w:semiHidden/>
     <w:unhideWhenUsed/>
@@ -2240,11 +2216,11 @@
       <w:color w:val="0F4761" w:themeColor="accent1" w:themeShade="BF"/>
     </w:rPr>
   </w:style>
-  <w:style w:type="paragraph" w:styleId="berschrift5">
+  <w:style w:type="paragraph" w:styleId="Heading5">
     <w:name w:val="heading 5"/>
-    <w:basedOn w:val="Standard"/>
-    <w:next w:val="Standard"/>
-    <w:link w:val="berschrift5Zchn"/>
+    <w:basedOn w:val="Normal"/>
+    <w:next w:val="Normal"/>
+    <w:link w:val="Heading5Char"/>
     <w:uiPriority w:val="9"/>
     <w:semiHidden/>
     <w:unhideWhenUsed/>
@@ -2261,11 +2237,11 @@
       <w:color w:val="0F4761" w:themeColor="accent1" w:themeShade="BF"/>
     </w:rPr>
   </w:style>
-  <w:style w:type="paragraph" w:styleId="berschrift6">
+  <w:style w:type="paragraph" w:styleId="Heading6">
     <w:name w:val="heading 6"/>
-    <w:basedOn w:val="Standard"/>
-    <w:next w:val="Standard"/>
-    <w:link w:val="berschrift6Zchn"/>
+    <w:basedOn w:val="Normal"/>
+    <w:next w:val="Normal"/>
+    <w:link w:val="Heading6Char"/>
     <w:uiPriority w:val="9"/>
     <w:semiHidden/>
     <w:unhideWhenUsed/>
@@ -2284,11 +2260,11 @@
       <w:color w:val="595959" w:themeColor="text1" w:themeTint="A6"/>
     </w:rPr>
   </w:style>
-  <w:style w:type="paragraph" w:styleId="berschrift7">
+  <w:style w:type="paragraph" w:styleId="Heading7">
     <w:name w:val="heading 7"/>
-    <w:basedOn w:val="Standard"/>
-    <w:next w:val="Standard"/>
-    <w:link w:val="berschrift7Zchn"/>
+    <w:basedOn w:val="Normal"/>
+    <w:next w:val="Normal"/>
+    <w:link w:val="Heading7Char"/>
     <w:uiPriority w:val="9"/>
     <w:semiHidden/>
     <w:unhideWhenUsed/>
@@ -2305,11 +2281,11 @@
       <w:color w:val="595959" w:themeColor="text1" w:themeTint="A6"/>
     </w:rPr>
   </w:style>
-  <w:style w:type="paragraph" w:styleId="berschrift8">
+  <w:style w:type="paragraph" w:styleId="Heading8">
     <w:name w:val="heading 8"/>
-    <w:basedOn w:val="Standard"/>
-    <w:next w:val="Standard"/>
-    <w:link w:val="berschrift8Zchn"/>
+    <w:basedOn w:val="Normal"/>
+    <w:next w:val="Normal"/>
+    <w:link w:val="Heading8Char"/>
     <w:uiPriority w:val="9"/>
     <w:semiHidden/>
     <w:unhideWhenUsed/>
@@ -2328,11 +2304,11 @@
       <w:color w:val="272727" w:themeColor="text1" w:themeTint="D8"/>
     </w:rPr>
   </w:style>
-  <w:style w:type="paragraph" w:styleId="berschrift9">
+  <w:style w:type="paragraph" w:styleId="Heading9">
     <w:name w:val="heading 9"/>
-    <w:basedOn w:val="Standard"/>
-    <w:next w:val="Standard"/>
-    <w:link w:val="berschrift9Zchn"/>
+    <w:basedOn w:val="Normal"/>
+    <w:next w:val="Normal"/>
+    <w:link w:val="Heading9Char"/>
     <w:uiPriority w:val="9"/>
     <w:semiHidden/>
     <w:unhideWhenUsed/>
@@ -2349,12 +2325,13 @@
       <w:color w:val="272727" w:themeColor="text1" w:themeTint="D8"/>
     </w:rPr>
   </w:style>
-  <w:style w:type="character" w:default="1" w:styleId="Absatz-Standardschriftart">
+  <w:style w:type="character" w:default="1" w:styleId="DefaultParagraphFont">
     <w:name w:val="Default Paragraph Font"/>
     <w:uiPriority w:val="1"/>
+    <w:semiHidden/>
     <w:unhideWhenUsed/>
   </w:style>
-  <w:style w:type="table" w:default="1" w:styleId="NormaleTabelle">
+  <w:style w:type="table" w:default="1" w:styleId="TableNormal">
     <w:name w:val="Normal Table"/>
     <w:uiPriority w:val="99"/>
     <w:semiHidden/>
@@ -2369,16 +2346,16 @@
       </w:tblCellMar>
     </w:tblPr>
   </w:style>
-  <w:style w:type="numbering" w:default="1" w:styleId="KeineListe">
+  <w:style w:type="numbering" w:default="1" w:styleId="NoList">
     <w:name w:val="No List"/>
     <w:uiPriority w:val="99"/>
     <w:semiHidden/>
     <w:unhideWhenUsed/>
   </w:style>
-  <w:style w:type="character" w:customStyle="1" w:styleId="berschrift1Zchn">
-    <w:name w:val="Überschrift 1 Zchn"/>
-    <w:basedOn w:val="Absatz-Standardschriftart"/>
-    <w:link w:val="berschrift1"/>
+  <w:style w:type="character" w:customStyle="1" w:styleId="Heading1Char">
+    <w:name w:val="Heading 1 Char"/>
+    <w:basedOn w:val="DefaultParagraphFont"/>
+    <w:link w:val="Heading1"/>
     <w:uiPriority w:val="9"/>
     <w:rsid w:val="00080235"/>
     <w:rPr>
@@ -2388,10 +2365,10 @@
       <w:szCs w:val="40"/>
     </w:rPr>
   </w:style>
-  <w:style w:type="character" w:customStyle="1" w:styleId="berschrift2Zchn">
-    <w:name w:val="Überschrift 2 Zchn"/>
-    <w:basedOn w:val="Absatz-Standardschriftart"/>
-    <w:link w:val="berschrift2"/>
+  <w:style w:type="character" w:customStyle="1" w:styleId="Heading2Char">
+    <w:name w:val="Heading 2 Char"/>
+    <w:basedOn w:val="DefaultParagraphFont"/>
+    <w:link w:val="Heading2"/>
     <w:uiPriority w:val="9"/>
     <w:semiHidden/>
     <w:rsid w:val="00080235"/>
@@ -2402,10 +2379,10 @@
       <w:szCs w:val="32"/>
     </w:rPr>
   </w:style>
-  <w:style w:type="character" w:customStyle="1" w:styleId="berschrift3Zchn">
-    <w:name w:val="Überschrift 3 Zchn"/>
-    <w:basedOn w:val="Absatz-Standardschriftart"/>
-    <w:link w:val="berschrift3"/>
+  <w:style w:type="character" w:customStyle="1" w:styleId="Heading3Char">
+    <w:name w:val="Heading 3 Char"/>
+    <w:basedOn w:val="DefaultParagraphFont"/>
+    <w:link w:val="Heading3"/>
     <w:uiPriority w:val="9"/>
     <w:semiHidden/>
     <w:rsid w:val="00080235"/>
@@ -2416,10 +2393,10 @@
       <w:szCs w:val="28"/>
     </w:rPr>
   </w:style>
-  <w:style w:type="character" w:customStyle="1" w:styleId="berschrift4Zchn">
-    <w:name w:val="Überschrift 4 Zchn"/>
-    <w:basedOn w:val="Absatz-Standardschriftart"/>
-    <w:link w:val="berschrift4"/>
+  <w:style w:type="character" w:customStyle="1" w:styleId="Heading4Char">
+    <w:name w:val="Heading 4 Char"/>
+    <w:basedOn w:val="DefaultParagraphFont"/>
+    <w:link w:val="Heading4"/>
     <w:uiPriority w:val="9"/>
     <w:semiHidden/>
     <w:rsid w:val="00080235"/>
@@ -2430,10 +2407,10 @@
       <w:color w:val="0F4761" w:themeColor="accent1" w:themeShade="BF"/>
     </w:rPr>
   </w:style>
-  <w:style w:type="character" w:customStyle="1" w:styleId="berschrift5Zchn">
-    <w:name w:val="Überschrift 5 Zchn"/>
-    <w:basedOn w:val="Absatz-Standardschriftart"/>
-    <w:link w:val="berschrift5"/>
+  <w:style w:type="character" w:customStyle="1" w:styleId="Heading5Char">
+    <w:name w:val="Heading 5 Char"/>
+    <w:basedOn w:val="DefaultParagraphFont"/>
+    <w:link w:val="Heading5"/>
     <w:uiPriority w:val="9"/>
     <w:semiHidden/>
     <w:rsid w:val="00080235"/>
@@ -2442,10 +2419,10 @@
       <w:color w:val="0F4761" w:themeColor="accent1" w:themeShade="BF"/>
     </w:rPr>
   </w:style>
-  <w:style w:type="character" w:customStyle="1" w:styleId="berschrift6Zchn">
-    <w:name w:val="Überschrift 6 Zchn"/>
-    <w:basedOn w:val="Absatz-Standardschriftart"/>
-    <w:link w:val="berschrift6"/>
+  <w:style w:type="character" w:customStyle="1" w:styleId="Heading6Char">
+    <w:name w:val="Heading 6 Char"/>
+    <w:basedOn w:val="DefaultParagraphFont"/>
+    <w:link w:val="Heading6"/>
     <w:uiPriority w:val="9"/>
     <w:semiHidden/>
     <w:rsid w:val="00080235"/>
@@ -2456,10 +2433,10 @@
       <w:color w:val="595959" w:themeColor="text1" w:themeTint="A6"/>
     </w:rPr>
   </w:style>
-  <w:style w:type="character" w:customStyle="1" w:styleId="berschrift7Zchn">
-    <w:name w:val="Überschrift 7 Zchn"/>
-    <w:basedOn w:val="Absatz-Standardschriftart"/>
-    <w:link w:val="berschrift7"/>
+  <w:style w:type="character" w:customStyle="1" w:styleId="Heading7Char">
+    <w:name w:val="Heading 7 Char"/>
+    <w:basedOn w:val="DefaultParagraphFont"/>
+    <w:link w:val="Heading7"/>
     <w:uiPriority w:val="9"/>
     <w:semiHidden/>
     <w:rsid w:val="00080235"/>
@@ -2468,10 +2445,10 @@
       <w:color w:val="595959" w:themeColor="text1" w:themeTint="A6"/>
     </w:rPr>
   </w:style>
-  <w:style w:type="character" w:customStyle="1" w:styleId="berschrift8Zchn">
-    <w:name w:val="Überschrift 8 Zchn"/>
-    <w:basedOn w:val="Absatz-Standardschriftart"/>
-    <w:link w:val="berschrift8"/>
+  <w:style w:type="character" w:customStyle="1" w:styleId="Heading8Char">
+    <w:name w:val="Heading 8 Char"/>
+    <w:basedOn w:val="DefaultParagraphFont"/>
+    <w:link w:val="Heading8"/>
     <w:uiPriority w:val="9"/>
     <w:semiHidden/>
     <w:rsid w:val="00080235"/>
@@ -2482,10 +2459,10 @@
       <w:color w:val="272727" w:themeColor="text1" w:themeTint="D8"/>
     </w:rPr>
   </w:style>
-  <w:style w:type="character" w:customStyle="1" w:styleId="berschrift9Zchn">
-    <w:name w:val="Überschrift 9 Zchn"/>
-    <w:basedOn w:val="Absatz-Standardschriftart"/>
-    <w:link w:val="berschrift9"/>
+  <w:style w:type="character" w:customStyle="1" w:styleId="Heading9Char">
+    <w:name w:val="Heading 9 Char"/>
+    <w:basedOn w:val="DefaultParagraphFont"/>
+    <w:link w:val="Heading9"/>
     <w:uiPriority w:val="9"/>
     <w:semiHidden/>
     <w:rsid w:val="00080235"/>
@@ -2494,11 +2471,11 @@
       <w:color w:val="272727" w:themeColor="text1" w:themeTint="D8"/>
     </w:rPr>
   </w:style>
-  <w:style w:type="paragraph" w:styleId="Titel">
+  <w:style w:type="paragraph" w:styleId="Title">
     <w:name w:val="Title"/>
-    <w:basedOn w:val="Standard"/>
-    <w:next w:val="Standard"/>
-    <w:link w:val="TitelZchn"/>
+    <w:basedOn w:val="Normal"/>
+    <w:next w:val="Normal"/>
+    <w:link w:val="TitleChar"/>
     <w:uiPriority w:val="10"/>
     <w:qFormat/>
     <w:rsid w:val="00080235"/>
@@ -2514,10 +2491,10 @@
       <w:szCs w:val="56"/>
     </w:rPr>
   </w:style>
-  <w:style w:type="character" w:customStyle="1" w:styleId="TitelZchn">
-    <w:name w:val="Titel Zchn"/>
-    <w:basedOn w:val="Absatz-Standardschriftart"/>
-    <w:link w:val="Titel"/>
+  <w:style w:type="character" w:customStyle="1" w:styleId="TitleChar">
+    <w:name w:val="Title Char"/>
+    <w:basedOn w:val="DefaultParagraphFont"/>
+    <w:link w:val="Title"/>
     <w:uiPriority w:val="10"/>
     <w:rsid w:val="00080235"/>
     <w:rPr>
@@ -2528,11 +2505,11 @@
       <w:szCs w:val="56"/>
     </w:rPr>
   </w:style>
-  <w:style w:type="paragraph" w:styleId="Untertitel">
+  <w:style w:type="paragraph" w:styleId="Subtitle">
     <w:name w:val="Subtitle"/>
-    <w:basedOn w:val="Standard"/>
-    <w:next w:val="Standard"/>
-    <w:link w:val="UntertitelZchn"/>
+    <w:basedOn w:val="Normal"/>
+    <w:next w:val="Normal"/>
+    <w:link w:val="SubtitleChar"/>
     <w:uiPriority w:val="11"/>
     <w:qFormat/>
     <w:rsid w:val="00080235"/>
@@ -2549,10 +2526,10 @@
       <w:szCs w:val="28"/>
     </w:rPr>
   </w:style>
-  <w:style w:type="character" w:customStyle="1" w:styleId="UntertitelZchn">
-    <w:name w:val="Untertitel Zchn"/>
-    <w:basedOn w:val="Absatz-Standardschriftart"/>
-    <w:link w:val="Untertitel"/>
+  <w:style w:type="character" w:customStyle="1" w:styleId="SubtitleChar">
+    <w:name w:val="Subtitle Char"/>
+    <w:basedOn w:val="DefaultParagraphFont"/>
+    <w:link w:val="Subtitle"/>
     <w:uiPriority w:val="11"/>
     <w:rsid w:val="00080235"/>
     <w:rPr>
@@ -2563,11 +2540,11 @@
       <w:szCs w:val="28"/>
     </w:rPr>
   </w:style>
-  <w:style w:type="paragraph" w:styleId="Zitat">
+  <w:style w:type="paragraph" w:styleId="Quote">
     <w:name w:val="Quote"/>
-    <w:basedOn w:val="Standard"/>
-    <w:next w:val="Standard"/>
-    <w:link w:val="ZitatZchn"/>
+    <w:basedOn w:val="Normal"/>
+    <w:next w:val="Normal"/>
+    <w:link w:val="QuoteChar"/>
     <w:uiPriority w:val="29"/>
     <w:qFormat/>
     <w:rsid w:val="00080235"/>
@@ -2581,10 +2558,10 @@
       <w:color w:val="404040" w:themeColor="text1" w:themeTint="BF"/>
     </w:rPr>
   </w:style>
-  <w:style w:type="character" w:customStyle="1" w:styleId="ZitatZchn">
-    <w:name w:val="Zitat Zchn"/>
-    <w:basedOn w:val="Absatz-Standardschriftart"/>
-    <w:link w:val="Zitat"/>
+  <w:style w:type="character" w:customStyle="1" w:styleId="QuoteChar">
+    <w:name w:val="Quote Char"/>
+    <w:basedOn w:val="DefaultParagraphFont"/>
+    <w:link w:val="Quote"/>
     <w:uiPriority w:val="29"/>
     <w:rsid w:val="00080235"/>
     <w:rPr>
@@ -2593,9 +2570,9 @@
       <w:color w:val="404040" w:themeColor="text1" w:themeTint="BF"/>
     </w:rPr>
   </w:style>
-  <w:style w:type="paragraph" w:styleId="Listenabsatz">
+  <w:style w:type="paragraph" w:styleId="ListParagraph">
     <w:name w:val="List Paragraph"/>
-    <w:basedOn w:val="Standard"/>
+    <w:basedOn w:val="Normal"/>
     <w:uiPriority w:val="34"/>
     <w:qFormat/>
     <w:rsid w:val="00080235"/>
@@ -2604,9 +2581,9 @@
       <w:contextualSpacing/>
     </w:pPr>
   </w:style>
-  <w:style w:type="character" w:styleId="IntensiveHervorhebung">
+  <w:style w:type="character" w:styleId="IntenseEmphasis">
     <w:name w:val="Intense Emphasis"/>
-    <w:basedOn w:val="Absatz-Standardschriftart"/>
+    <w:basedOn w:val="DefaultParagraphFont"/>
     <w:uiPriority w:val="21"/>
     <w:qFormat/>
     <w:rsid w:val="00080235"/>
@@ -2616,11 +2593,11 @@
       <w:color w:val="0F4761" w:themeColor="accent1" w:themeShade="BF"/>
     </w:rPr>
   </w:style>
-  <w:style w:type="paragraph" w:styleId="IntensivesZitat">
+  <w:style w:type="paragraph" w:styleId="IntenseQuote">
     <w:name w:val="Intense Quote"/>
-    <w:basedOn w:val="Standard"/>
-    <w:next w:val="Standard"/>
-    <w:link w:val="IntensivesZitatZchn"/>
+    <w:basedOn w:val="Normal"/>
+    <w:next w:val="Normal"/>
+    <w:link w:val="IntenseQuoteChar"/>
     <w:uiPriority w:val="30"/>
     <w:qFormat/>
     <w:rsid w:val="00080235"/>
@@ -2639,10 +2616,10 @@
       <w:color w:val="0F4761" w:themeColor="accent1" w:themeShade="BF"/>
     </w:rPr>
   </w:style>
-  <w:style w:type="character" w:customStyle="1" w:styleId="IntensivesZitatZchn">
-    <w:name w:val="Intensives Zitat Zchn"/>
-    <w:basedOn w:val="Absatz-Standardschriftart"/>
-    <w:link w:val="IntensivesZitat"/>
+  <w:style w:type="character" w:customStyle="1" w:styleId="IntenseQuoteChar">
+    <w:name w:val="Intense Quote Char"/>
+    <w:basedOn w:val="DefaultParagraphFont"/>
+    <w:link w:val="IntenseQuote"/>
     <w:uiPriority w:val="30"/>
     <w:rsid w:val="00080235"/>
     <w:rPr>
@@ -2651,9 +2628,9 @@
       <w:color w:val="0F4761" w:themeColor="accent1" w:themeShade="BF"/>
     </w:rPr>
   </w:style>
-  <w:style w:type="character" w:styleId="IntensiverVerweis">
+  <w:style w:type="character" w:styleId="IntenseReference">
     <w:name w:val="Intense Reference"/>
-    <w:basedOn w:val="Absatz-Standardschriftart"/>
+    <w:basedOn w:val="DefaultParagraphFont"/>
     <w:uiPriority w:val="32"/>
     <w:qFormat/>
     <w:rsid w:val="00080235"/>

</xml_diff>

<commit_message>
Updated word doc plan
</commit_message>
<xml_diff>
--- a/Thesis Overview.docx
+++ b/Thesis Overview.docx
@@ -89,21 +89,7 @@
         <w:rPr>
           <w:lang w:val="en-US"/>
         </w:rPr>
-        <w:t xml:space="preserve"> at o/p (side lobes in </w:t>
-      </w:r>
-      <w:proofErr w:type="spellStart"/>
-      <w:r>
-        <w:rPr>
-          <w:lang w:val="en-US"/>
-        </w:rPr>
-        <w:t>freq</w:t>
-      </w:r>
-      <w:proofErr w:type="spellEnd"/>
-      <w:r>
-        <w:rPr>
-          <w:lang w:val="en-US"/>
-        </w:rPr>
-        <w:t xml:space="preserve">), back into Rx, </w:t>
+        <w:t xml:space="preserve"> at o/p (side lobes in freq), back into Rx, </w:t>
       </w:r>
       <w:r>
         <w:rPr>
@@ -369,21 +355,7 @@
         <w:rPr>
           <w:lang w:val="en-US"/>
         </w:rPr>
-        <w:t xml:space="preserve">Open loop – </w:t>
-      </w:r>
-      <w:proofErr w:type="spellStart"/>
-      <w:r>
-        <w:rPr>
-          <w:lang w:val="en-US"/>
-        </w:rPr>
-        <w:t>i</w:t>
-      </w:r>
-      <w:proofErr w:type="spellEnd"/>
-      <w:r>
-        <w:rPr>
-          <w:lang w:val="en-US"/>
-        </w:rPr>
-        <w:t>/p changes depending on what we measure at o/p</w:t>
+        <w:t>Open loop – i/p changes depending on what we measure at o/p</w:t>
       </w:r>
     </w:p>
     <w:p>
@@ -489,16 +461,8 @@
         <w:rPr>
           <w:lang w:val="en-US"/>
         </w:rPr>
-        <w:t xml:space="preserve">Settings.xml </w:t>
-      </w:r>
-      <w:proofErr w:type="spellStart"/>
-      <w:r>
-        <w:rPr>
-          <w:lang w:val="en-US"/>
-        </w:rPr>
-        <w:t>parametres</w:t>
-      </w:r>
-      <w:proofErr w:type="spellEnd"/>
+        <w:t>Settings.xml parametres</w:t>
+      </w:r>
       <w:r>
         <w:rPr>
           <w:lang w:val="en-US"/>
@@ -525,21 +489,7 @@
         <w:rPr>
           <w:lang w:val="en-US"/>
         </w:rPr>
-        <w:t xml:space="preserve">Available models for predistortion. Simple ones first – </w:t>
-      </w:r>
-      <w:proofErr w:type="gramStart"/>
-      <w:r>
-        <w:rPr>
-          <w:lang w:val="en-US"/>
-        </w:rPr>
-        <w:t>AM,AM</w:t>
-      </w:r>
-      <w:proofErr w:type="gramEnd"/>
-      <w:r>
-        <w:rPr>
-          <w:lang w:val="en-US"/>
-        </w:rPr>
-        <w:t xml:space="preserve"> conversion</w:t>
+        <w:t>Available models for predistortion. Simple ones first – AM,AM conversion</w:t>
       </w:r>
     </w:p>
     <w:p>
@@ -736,21 +686,7 @@
         <w:rPr>
           <w:lang w:val="en-US"/>
         </w:rPr>
-        <w:t xml:space="preserve">Look at other filters (and components) in FEC Commissioning Doc and see if you need to incorporate them too (e.g. harmonic filter, IF complex filter </w:t>
-      </w:r>
-      <w:proofErr w:type="spellStart"/>
-      <w:r>
-        <w:rPr>
-          <w:lang w:val="en-US"/>
-        </w:rPr>
-        <w:t>etc</w:t>
-      </w:r>
-      <w:proofErr w:type="spellEnd"/>
-      <w:r>
-        <w:rPr>
-          <w:lang w:val="en-US"/>
-        </w:rPr>
-        <w:t>)</w:t>
+        <w:t>Look at other filters (and components) in FEC Commissioning Doc and see if you need to incorporate them too (e.g. harmonic filter, IF complex filter etc)</w:t>
       </w:r>
     </w:p>
     <w:p>
@@ -798,35 +734,7 @@
         <w:rPr>
           <w:lang w:val="en-US"/>
         </w:rPr>
-        <w:t>Create full Tx/Rx chain for your understanding (also change up/</w:t>
-      </w:r>
-      <w:proofErr w:type="spellStart"/>
-      <w:r>
-        <w:rPr>
-          <w:lang w:val="en-US"/>
-        </w:rPr>
-        <w:t>downconversion</w:t>
-      </w:r>
-      <w:proofErr w:type="spellEnd"/>
-      <w:r>
-        <w:rPr>
-          <w:lang w:val="en-US"/>
-        </w:rPr>
-        <w:t xml:space="preserve"> functions to use time vector. Downmixing </w:t>
-      </w:r>
-      <w:proofErr w:type="gramStart"/>
-      <w:r>
-        <w:rPr>
-          <w:lang w:val="en-US"/>
-        </w:rPr>
-        <w:t>result</w:t>
-      </w:r>
-      <w:proofErr w:type="gramEnd"/>
-      <w:r>
-        <w:rPr>
-          <w:lang w:val="en-US"/>
-        </w:rPr>
-        <w:t xml:space="preserve"> should not be different for different sampling frequencies. You just have more frequency bins in between)</w:t>
+        <w:t>Create full Tx/Rx chain for your understanding (also change up/downconversion functions to use time vector. Downmixing result should not be different for different sampling frequencies. You just have more frequency bins in between)</w:t>
       </w:r>
     </w:p>
     <w:p>
@@ -844,47 +752,7 @@
         <w:rPr>
           <w:lang w:val="en-US"/>
         </w:rPr>
-        <w:t xml:space="preserve">May need to </w:t>
-      </w:r>
-      <w:proofErr w:type="spellStart"/>
-      <w:r>
-        <w:rPr>
-          <w:lang w:val="en-US"/>
-        </w:rPr>
-        <w:t>upsample</w:t>
-      </w:r>
-      <w:proofErr w:type="spellEnd"/>
-      <w:r>
-        <w:rPr>
-          <w:lang w:val="en-US"/>
-        </w:rPr>
-        <w:t xml:space="preserve"> for PA non linearities (To </w:t>
-      </w:r>
-      <w:proofErr w:type="gramStart"/>
-      <w:r>
-        <w:rPr>
-          <w:lang w:val="en-US"/>
-        </w:rPr>
-        <w:t>check:</w:t>
-      </w:r>
-      <w:proofErr w:type="gramEnd"/>
-      <w:r>
-        <w:rPr>
-          <w:lang w:val="en-US"/>
-        </w:rPr>
-        <w:t xml:space="preserve"> </w:t>
-      </w:r>
-      <w:r>
-        <w:rPr>
-          <w:lang w:val="en-NZ"/>
-        </w:rPr>
-        <w:t>after applying the PA, plot the output spectrum and see whether the regrowth skirts have decayed into the noise floor before they reach ±fs/2</w:t>
-      </w:r>
-      <w:r>
-        <w:rPr>
-          <w:lang w:val="en-NZ"/>
-        </w:rPr>
-        <w:t>)</w:t>
+        <w:t>MUST UNDERSTAND EVERYTHING EXPECTED WAVES; WHERE NOISE FLOOR COMES FROM</w:t>
       </w:r>
     </w:p>
     <w:p>
@@ -902,33 +770,7 @@
         <w:rPr>
           <w:lang w:val="en-US"/>
         </w:rPr>
-        <w:t xml:space="preserve">Check literature to see what the waves should look like (side lobe height factors expected </w:t>
-      </w:r>
-      <w:r>
-        <w:rPr>
-          <w:lang w:val="en-US"/>
-        </w:rPr>
-        <w:t xml:space="preserve">e.g. 15dB </w:t>
-      </w:r>
-      <w:proofErr w:type="spellStart"/>
-      <w:r>
-        <w:rPr>
-          <w:lang w:val="en-US"/>
-        </w:rPr>
-        <w:t>etc</w:t>
-      </w:r>
-      <w:proofErr w:type="spellEnd"/>
-      <w:r>
-        <w:rPr>
-          <w:lang w:val="en-US"/>
-        </w:rPr>
-        <w:t>)</w:t>
-      </w:r>
-      <w:r>
-        <w:rPr>
-          <w:lang w:val="en-US"/>
-        </w:rPr>
-        <w:t xml:space="preserve"> – understand the signal processing in general</w:t>
+        <w:t>Set Saleh Model to match linear part of curve, set alpha to 1 – really understand what model is doing</w:t>
       </w:r>
     </w:p>
     <w:p>
@@ -946,6 +788,96 @@
         <w:rPr>
           <w:lang w:val="en-US"/>
         </w:rPr>
+        <w:t>MODEL Undistorted vs distorted vs predistorted then can set parametres to tune and determine KPIs like side lobe suppression level, SNR, amplitude etc…</w:t>
+      </w:r>
+    </w:p>
+    <w:p>
+      <w:pPr>
+        <w:pStyle w:val="ListParagraph"/>
+        <w:numPr>
+          <w:ilvl w:val="0"/>
+          <w:numId w:val="4"/>
+        </w:numPr>
+        <w:rPr>
+          <w:lang w:val="en-US"/>
+        </w:rPr>
+      </w:pPr>
+      <w:r>
+        <w:rPr>
+          <w:lang w:val="en-US"/>
+        </w:rPr>
+        <w:t xml:space="preserve">May need to </w:t>
+      </w:r>
+      <w:r>
+        <w:rPr>
+          <w:lang w:val="en-US"/>
+        </w:rPr>
+        <w:t xml:space="preserve">upsample for PA non linearities (To check: </w:t>
+      </w:r>
+      <w:r>
+        <w:rPr>
+          <w:lang w:val="en-NZ"/>
+        </w:rPr>
+        <w:t>after applying the PA, plot the output spectrum and see whether the regrowth skirts have decayed into the noise floor before they reach ±fs/2</w:t>
+      </w:r>
+      <w:r>
+        <w:rPr>
+          <w:lang w:val="en-NZ"/>
+        </w:rPr>
+        <w:t>)</w:t>
+      </w:r>
+    </w:p>
+    <w:p>
+      <w:pPr>
+        <w:pStyle w:val="ListParagraph"/>
+        <w:numPr>
+          <w:ilvl w:val="0"/>
+          <w:numId w:val="4"/>
+        </w:numPr>
+        <w:rPr>
+          <w:lang w:val="en-US"/>
+        </w:rPr>
+      </w:pPr>
+      <w:r>
+        <w:rPr>
+          <w:lang w:val="en-US"/>
+        </w:rPr>
+        <w:t xml:space="preserve">Check literature to see what the waves should look like (side lobe height factors expected </w:t>
+      </w:r>
+      <w:r>
+        <w:rPr>
+          <w:lang w:val="en-US"/>
+        </w:rPr>
+        <w:t xml:space="preserve">e.g. 15dB </w:t>
+      </w:r>
+      <w:r>
+        <w:rPr>
+          <w:lang w:val="en-US"/>
+        </w:rPr>
+        <w:t>etc)</w:t>
+      </w:r>
+      <w:r>
+        <w:rPr>
+          <w:lang w:val="en-US"/>
+        </w:rPr>
+        <w:t xml:space="preserve"> – understand the signal processing in general</w:t>
+      </w:r>
+    </w:p>
+    <w:p>
+      <w:pPr>
+        <w:pStyle w:val="ListParagraph"/>
+        <w:numPr>
+          <w:ilvl w:val="0"/>
+          <w:numId w:val="4"/>
+        </w:numPr>
+        <w:rPr>
+          <w:lang w:val="en-US"/>
+        </w:rPr>
+      </w:pPr>
+      <w:r>
+        <w:rPr>
+          <w:lang w:val="en-US"/>
+        </w:rPr>
         <w:t>Model predistortion</w:t>
       </w:r>
     </w:p>
@@ -984,6 +916,13 @@
         </w:rPr>
         <w:t>Can we improve the pulse compression magnitude?</w:t>
       </w:r>
+    </w:p>
+    <w:p>
+      <w:pPr>
+        <w:rPr>
+          <w:lang w:val="en-US"/>
+        </w:rPr>
+      </w:pPr>
     </w:p>
     <w:p>
       <w:pPr>

</xml_diff>